<commit_message>
See ChangeLog.md for changes
</commit_message>
<xml_diff>
--- a/ErrorHandler.docx
+++ b/ErrorHandler.docx
@@ -1,6 +1,6 @@
 
 <file path=word/document.xml><?xml version="1.0" encoding="utf-8"?>
-<w:document xmlns:wpc="http://schemas.microsoft.com/office/word/2010/wordprocessingCanvas" xmlns:cx="http://schemas.microsoft.com/office/drawing/2014/chartex" xmlns:cx1="http://schemas.microsoft.com/office/drawing/2015/9/8/chartex" xmlns:cx2="http://schemas.microsoft.com/office/drawing/2015/10/21/chartex" xmlns:cx3="http://schemas.microsoft.com/office/drawing/2016/5/9/chartex" xmlns:cx4="http://schemas.microsoft.com/office/drawing/2016/5/10/chartex" xmlns:cx5="http://schemas.microsoft.com/office/drawing/2016/5/11/chartex" xmlns:cx6="http://schemas.microsoft.com/office/drawing/2016/5/12/chartex" xmlns:cx7="http://schemas.microsoft.com/office/drawing/2016/5/13/chartex" xmlns:cx8="http://schemas.microsoft.com/office/drawing/2016/5/14/chartex" xmlns:mc="http://schemas.openxmlformats.org/markup-compatibility/2006" xmlns:aink="http://schemas.microsoft.com/office/drawing/2016/ink" xmlns:am3d="http://schemas.microsoft.com/office/drawing/2017/model3d" xmlns:o="urn:schemas-microsoft-com:office:office" xmlns:oel="http://schemas.microsoft.com/office/2019/extlst" xmlns:r="http://schemas.openxmlformats.org/officeDocument/2006/relationships" xmlns:m="http://schemas.openxmlformats.org/officeDocument/2006/math" xmlns:v="urn:schemas-microsoft-com:vml" xmlns:wp14="http://schemas.microsoft.com/office/word/2010/wordprocessingDrawing" xmlns:wp="http://schemas.openxmlformats.org/drawingml/2006/wordprocessingDrawing" xmlns:w10="urn:schemas-microsoft-com:office:word" xmlns:w="http://schemas.openxmlformats.org/wordprocessingml/2006/main" xmlns:w14="http://schemas.microsoft.com/office/word/2010/wordml" xmlns:w15="http://schemas.microsoft.com/office/word/2012/wordml" xmlns:w16cex="http://schemas.microsoft.com/office/word/2018/wordml/cex" xmlns:w16cid="http://schemas.microsoft.com/office/word/2016/wordml/cid" xmlns:w16="http://schemas.microsoft.com/office/word/2018/wordml" xmlns:w16du="http://schemas.microsoft.com/office/word/2023/wordml/word16du" xmlns:w16sdtdh="http://schemas.microsoft.com/office/word/2020/wordml/sdtdatahash" xmlns:w16se="http://schemas.microsoft.com/office/word/2015/wordml/symex" xmlns:wpg="http://schemas.microsoft.com/office/word/2010/wordprocessingGroup" xmlns:wpi="http://schemas.microsoft.com/office/word/2010/wordprocessingInk" xmlns:wne="http://schemas.microsoft.com/office/word/2006/wordml" xmlns:wps="http://schemas.microsoft.com/office/word/2010/wordprocessingShape" mc:Ignorable="w14 w15 w16se w16cid w16 w16cex w16sdtdh w16du wp14">
+<w:document xmlns:wpc="http://schemas.microsoft.com/office/word/2010/wordprocessingCanvas" xmlns:cx="http://schemas.microsoft.com/office/drawing/2014/chartex" xmlns:cx1="http://schemas.microsoft.com/office/drawing/2015/9/8/chartex" xmlns:cx2="http://schemas.microsoft.com/office/drawing/2015/10/21/chartex" xmlns:cx3="http://schemas.microsoft.com/office/drawing/2016/5/9/chartex" xmlns:cx4="http://schemas.microsoft.com/office/drawing/2016/5/10/chartex" xmlns:cx5="http://schemas.microsoft.com/office/drawing/2016/5/11/chartex" xmlns:cx6="http://schemas.microsoft.com/office/drawing/2016/5/12/chartex" xmlns:cx7="http://schemas.microsoft.com/office/drawing/2016/5/13/chartex" xmlns:cx8="http://schemas.microsoft.com/office/drawing/2016/5/14/chartex" xmlns:mc="http://schemas.openxmlformats.org/markup-compatibility/2006" xmlns:aink="http://schemas.microsoft.com/office/drawing/2016/ink" xmlns:am3d="http://schemas.microsoft.com/office/drawing/2017/model3d" xmlns:o="urn:schemas-microsoft-com:office:office" xmlns:oel="http://schemas.microsoft.com/office/2019/extlst" xmlns:r="http://schemas.openxmlformats.org/officeDocument/2006/relationships" xmlns:m="http://schemas.openxmlformats.org/officeDocument/2006/math" xmlns:v="urn:schemas-microsoft-com:vml" xmlns:wp14="http://schemas.microsoft.com/office/word/2010/wordprocessingDrawing" xmlns:wp="http://schemas.openxmlformats.org/drawingml/2006/wordprocessingDrawing" xmlns:w10="urn:schemas-microsoft-com:office:word" xmlns:w="http://schemas.openxmlformats.org/wordprocessingml/2006/main" xmlns:w14="http://schemas.microsoft.com/office/word/2010/wordml" xmlns:w15="http://schemas.microsoft.com/office/word/2012/wordml" xmlns:w16cei="http://schemas.microsoft.com/office/word/2026/wordml/cei" xmlns:w16cex="http://schemas.microsoft.com/office/word/2018/wordml/cex" xmlns:w16cid="http://schemas.microsoft.com/office/word/2016/wordml/cid" xmlns:w16="http://schemas.microsoft.com/office/word/2018/wordml" xmlns:w16du="http://schemas.microsoft.com/office/word/2023/wordml/word16du" xmlns:w16sdtdh="http://schemas.microsoft.com/office/word/2020/wordml/sdtdatahash" xmlns:w16sdtfl="http://schemas.microsoft.com/office/word/2024/wordml/sdtformatlock" xmlns:w16se="http://schemas.microsoft.com/office/word/2015/wordml/symex" xmlns:wpg="http://schemas.microsoft.com/office/word/2010/wordprocessingGroup" xmlns:wpi="http://schemas.microsoft.com/office/word/2010/wordprocessingInk" xmlns:wne="http://schemas.microsoft.com/office/word/2006/wordml" xmlns:wps="http://schemas.microsoft.com/office/word/2010/wordprocessingShape" mc:Ignorable="w14 w15 w16se w16cid w16 w16cex w16sdtdh w16sdtfl w16du wp14">
   <w:body>
     <w:p>
       <w:pPr>
@@ -283,7 +283,15 @@
       </w:r>
       <w:bookmarkEnd w:id="0"/>
       <w:r>
-        <w:t>. The error dialog seen by end-users.</w:t>
+        <w:t xml:space="preserve">. The error dialog </w:t>
+      </w:r>
+      <w:proofErr w:type="gramStart"/>
+      <w:r>
+        <w:t>seen</w:t>
+      </w:r>
+      <w:proofErr w:type="gramEnd"/>
+      <w:r>
+        <w:t xml:space="preserve"> by end-users.</w:t>
       </w:r>
     </w:p>
     <w:p>
@@ -308,10 +316,18 @@
       </w:pPr>
       <w:r>
         <w:lastRenderedPageBreak/>
-        <w:t xml:space="preserve">It prompts them for additional information about what they were doing when the error occurred. In my experience, </w:t>
+        <w:t xml:space="preserve">It prompts them </w:t>
       </w:r>
       <w:proofErr w:type="gramStart"/>
       <w:r>
+        <w:t>for</w:t>
+      </w:r>
+      <w:proofErr w:type="gramEnd"/>
+      <w:r>
+        <w:t xml:space="preserve"> additional information about what they were doing when the error occurred. In my experience, </w:t>
+      </w:r>
+      <w:proofErr w:type="gramStart"/>
+      <w:r>
         <w:t>end-users</w:t>
       </w:r>
       <w:proofErr w:type="gramEnd"/>
@@ -358,7 +374,15 @@
         <w:t xml:space="preserve">optionally </w:t>
       </w:r>
       <w:r>
-        <w:t>provides a Save button that creates a text file containing information about the error; we’ll see the contents of this file later. This button is there for us when we’re directly interacting with a customer or for when the Send button fails for some reason, such as no Internet connection.</w:t>
+        <w:t xml:space="preserve">provides a Save button that creates a text file containing information about the error; we’ll see the contents of this file later. This button is there for us when we’re directly interacting with a customer </w:t>
+      </w:r>
+      <w:proofErr w:type="gramStart"/>
+      <w:r>
+        <w:t>or for</w:t>
+      </w:r>
+      <w:proofErr w:type="gramEnd"/>
+      <w:r>
+        <w:t xml:space="preserve"> when the Send button fails for some reason, such as no Internet connection.</w:t>
       </w:r>
     </w:p>
     <w:p>
@@ -552,15 +576,7 @@
         <w:pStyle w:val="bulletfirst"/>
       </w:pPr>
       <w:r>
-        <w:t xml:space="preserve">It displays the error number, message, </w:t>
-      </w:r>
-      <w:proofErr w:type="gramStart"/>
-      <w:r>
-        <w:t>object</w:t>
-      </w:r>
-      <w:proofErr w:type="gramEnd"/>
-      <w:r>
-        <w:t xml:space="preserve"> and method name, and when running in the IDE, the line number and line of code where the error occurred (the latter two aren’t usually available at runtime).</w:t>
+        <w:t>It displays the error number, message, object and method name, and when running in the IDE, the line number and line of code where the error occurred (the latter two aren’t usually available at runtime).</w:t>
       </w:r>
     </w:p>
     <w:p>
@@ -577,7 +593,15 @@
         <w:pStyle w:val="bullet"/>
       </w:pPr>
       <w:r>
-        <w:t>If the application is running in the IDE, the Debug button opens the VFP Debugger at the line of code following the one that caused the error. I use this button most of the time, because I can often try something, like changing the value of a variable, and then use the Set Next Statement function to go back to the offending line and see if that fixe</w:t>
+        <w:t xml:space="preserve">If the application is running in the IDE, the Debug button opens the VFP Debugger at the line of code following the one that caused the error. I use this button most of the time, because I can often try something, like changing the value of a variable, and then </w:t>
+      </w:r>
+      <w:proofErr w:type="gramStart"/>
+      <w:r>
+        <w:t>use</w:t>
+      </w:r>
+      <w:proofErr w:type="gramEnd"/>
+      <w:r>
+        <w:t xml:space="preserve"> the Set Next Statement function to go back to the offending line and see if that fixe</w:t>
       </w:r>
       <w:r>
         <w:t>s</w:t>
@@ -679,15 +703,23 @@
         <w:t>s</w:t>
       </w:r>
       <w:r>
-        <w:t xml:space="preserve"> you to execute VFP commands at runtime, including opening and browsing tables, </w:t>
+        <w:t xml:space="preserve"> you to execute VFP commands at runtime, including opening and browsing tables, examining or changing the values of global variables, and so on. The Emulate Command Window checkbox determines whether code entered in the </w:t>
+      </w:r>
+      <w:proofErr w:type="spellStart"/>
+      <w:r>
+        <w:t>editbox</w:t>
+      </w:r>
+      <w:proofErr w:type="spellEnd"/>
+      <w:r>
+        <w:t xml:space="preserve"> is executed when you press Enter (like the Command window) or when you click the Execute button (allowing you to write multi-line code </w:t>
       </w:r>
       <w:proofErr w:type="gramStart"/>
       <w:r>
-        <w:t>examining</w:t>
+        <w:t>similar to</w:t>
       </w:r>
       <w:proofErr w:type="gramEnd"/>
       <w:r>
-        <w:t xml:space="preserve"> or changing the values of global variables, and so on. The Emulate Command Window checkbox determines whether code entered in the </w:t>
+        <w:t xml:space="preserve"> a PRG before executing it). The Clear button clears the </w:t>
       </w:r>
       <w:proofErr w:type="spellStart"/>
       <w:r>
@@ -695,30 +727,14 @@
       </w:r>
       <w:proofErr w:type="spellEnd"/>
       <w:r>
-        <w:t xml:space="preserve"> is executed when you press Enter (like the Command window) or when you click the Execute button (allowing you to write multi-line code </w:t>
+        <w:t xml:space="preserve">, the arrow keys scroll through statements you previously entered, and Load loads a PRG or text file so you can execute it. Of course, none of this is magic; it just relies on the VFP </w:t>
       </w:r>
       <w:proofErr w:type="gramStart"/>
       <w:r>
-        <w:t>similar to</w:t>
+        <w:t>EXECSCRIPT(</w:t>
       </w:r>
       <w:proofErr w:type="gramEnd"/>
       <w:r>
-        <w:t xml:space="preserve"> a PRG before executing it). The Clear button clears the </w:t>
-      </w:r>
-      <w:proofErr w:type="spellStart"/>
-      <w:r>
-        <w:t>editbox</w:t>
-      </w:r>
-      <w:proofErr w:type="spellEnd"/>
-      <w:r>
-        <w:t xml:space="preserve">, the arrow keys scroll through statements you previously entered, and Load loads a PRG or text file so you can execute it. Of course, none of this is magic; it just relies on the VFP </w:t>
-      </w:r>
-      <w:proofErr w:type="gramStart"/>
-      <w:r>
-        <w:t>EXECSCRIPT(</w:t>
-      </w:r>
-      <w:proofErr w:type="gramEnd"/>
-      <w:r>
         <w:t>) function to execute code at runtime.</w:t>
       </w:r>
     </w:p>
@@ -727,15 +743,7 @@
         <w:pStyle w:val="bullet"/>
       </w:pPr>
       <w:r>
-        <w:t xml:space="preserve">The Continue button essentially does a RETURN, sending execution back to the line of code following the one that caused the error. Retry does a RETRY. Neither of these are that useful unless the error was something </w:t>
-      </w:r>
-      <w:proofErr w:type="gramStart"/>
-      <w:r>
-        <w:t>environmental</w:t>
-      </w:r>
-      <w:proofErr w:type="gramEnd"/>
-      <w:r>
-        <w:t xml:space="preserve"> you can correct, such as a missing file.</w:t>
+        <w:t>The Continue button essentially does a RETURN, sending execution back to the line of code following the one that caused the error. Retry does a RETRY. Neither of these are that useful unless the error was something environmental you can correct, such as a missing file.</w:t>
       </w:r>
     </w:p>
     <w:p>
@@ -1070,7 +1078,35 @@
         <w:rPr>
           <w:lang w:eastAsia="en-US"/>
         </w:rPr>
-        <w:t xml:space="preserve">click the Cause an Error button in the form that appears. This causes an error by executing X = Y without defining a variable named Y. Click the Send button in the error dialog that appears to email an error report to the address you specified in </w:t>
+        <w:t xml:space="preserve">click the </w:t>
+      </w:r>
+      <w:proofErr w:type="gramStart"/>
+      <w:r>
+        <w:rPr>
+          <w:lang w:eastAsia="en-US"/>
+        </w:rPr>
+        <w:t>Cause an Error</w:t>
+      </w:r>
+      <w:proofErr w:type="gramEnd"/>
+      <w:r>
+        <w:rPr>
+          <w:lang w:eastAsia="en-US"/>
+        </w:rPr>
+        <w:t xml:space="preserve"> button </w:t>
+      </w:r>
+      <w:proofErr w:type="gramStart"/>
+      <w:r>
+        <w:rPr>
+          <w:lang w:eastAsia="en-US"/>
+        </w:rPr>
+        <w:t>in</w:t>
+      </w:r>
+      <w:proofErr w:type="gramEnd"/>
+      <w:r>
+        <w:rPr>
+          <w:lang w:eastAsia="en-US"/>
+        </w:rPr>
+        <w:t xml:space="preserve"> the form that appears. This causes an error by executing X = Y without defining a variable named Y. Click the Send button in the error dialog that appears to email an error report to the address you specified in </w:t>
       </w:r>
       <w:proofErr w:type="spellStart"/>
       <w:r>
@@ -1223,7 +1259,15 @@
       </w:r>
       <w:proofErr w:type="spellEnd"/>
       <w:r>
-        <w:t>: contains the error handling classes.</w:t>
+        <w:t xml:space="preserve">: </w:t>
+      </w:r>
+      <w:proofErr w:type="gramStart"/>
+      <w:r>
+        <w:t>contains</w:t>
+      </w:r>
+      <w:proofErr w:type="gramEnd"/>
+      <w:r>
+        <w:t xml:space="preserve"> the error handling classes.</w:t>
       </w:r>
     </w:p>
     <w:p>
@@ -1265,7 +1309,15 @@
       </w:r>
       <w:proofErr w:type="spellEnd"/>
       <w:r>
-        <w:t>: contains a localizer class.</w:t>
+        <w:t xml:space="preserve">: </w:t>
+      </w:r>
+      <w:proofErr w:type="gramStart"/>
+      <w:r>
+        <w:t>contains</w:t>
+      </w:r>
+      <w:proofErr w:type="gramEnd"/>
+      <w:r>
+        <w:t xml:space="preserve"> a localizer class.</w:t>
       </w:r>
     </w:p>
     <w:p>
@@ -1310,15 +1362,15 @@
         <w:t xml:space="preserve">: include files used by </w:t>
       </w:r>
       <w:proofErr w:type="spellStart"/>
+      <w:proofErr w:type="gramStart"/>
       <w:r>
         <w:t>SFErrorMgr</w:t>
       </w:r>
       <w:proofErr w:type="spellEnd"/>
-      <w:proofErr w:type="gramStart"/>
+      <w:proofErr w:type="gramEnd"/>
       <w:r>
         <w:t>.</w:t>
       </w:r>
-      <w:proofErr w:type="gramEnd"/>
     </w:p>
     <w:p>
       <w:pPr>
@@ -1465,11 +1517,32 @@
       </w:pPr>
       <w:proofErr w:type="spellStart"/>
       <w:r>
+        <w:t>Format.prg</w:t>
+      </w:r>
+      <w:proofErr w:type="spellEnd"/>
+      <w:r>
+        <w:t>: formats a string.</w:t>
+      </w:r>
+    </w:p>
+    <w:p>
+      <w:pPr>
+        <w:pStyle w:val="bullet"/>
+      </w:pPr>
+      <w:proofErr w:type="spellStart"/>
+      <w:r>
         <w:t>System.app</w:t>
       </w:r>
       <w:proofErr w:type="spellEnd"/>
       <w:r>
-        <w:t>: the main component of the GDIPlusX VFP project (</w:t>
+        <w:t xml:space="preserve">: the main component of the </w:t>
+      </w:r>
+      <w:proofErr w:type="spellStart"/>
+      <w:r>
+        <w:t>GDIPlusX</w:t>
+      </w:r>
+      <w:proofErr w:type="spellEnd"/>
+      <w:r>
+        <w:t xml:space="preserve"> VFP project (</w:t>
       </w:r>
       <w:hyperlink r:id="rId14" w:history="1">
         <w:r>
@@ -1502,6 +1575,7 @@
         <w:pStyle w:val="bulletlast"/>
       </w:pPr>
       <w:r>
+        <w:lastRenderedPageBreak/>
         <w:t>VFPEncryption</w:t>
       </w:r>
       <w:r>
@@ -1527,224 +1601,288 @@
         <w:pStyle w:val="bodytext"/>
       </w:pPr>
       <w:r>
+        <w:t>Add these files to your application’s project:</w:t>
+      </w:r>
+    </w:p>
+    <w:p>
+      <w:pPr>
+        <w:pStyle w:val="bulletfirst"/>
+      </w:pPr>
+      <w:proofErr w:type="spellStart"/>
+      <w:r>
+        <w:t>SFErrorMgr.vcx</w:t>
+      </w:r>
+      <w:proofErr w:type="spellEnd"/>
+    </w:p>
+    <w:p>
+      <w:pPr>
+        <w:pStyle w:val="bullet"/>
+      </w:pPr>
+      <w:proofErr w:type="spellStart"/>
+      <w:r>
+        <w:t>SFConsole.vcx</w:t>
+      </w:r>
+      <w:proofErr w:type="spellEnd"/>
+      <w:r>
+        <w:t xml:space="preserve"> (if you set the </w:t>
+      </w:r>
+      <w:proofErr w:type="spellStart"/>
+      <w:r>
+        <w:t>cConsoleForm</w:t>
+      </w:r>
+      <w:proofErr w:type="spellEnd"/>
+      <w:r>
+        <w:t xml:space="preserve"> and </w:t>
+      </w:r>
+      <w:proofErr w:type="spellStart"/>
+      <w:r>
+        <w:t>cConsoleLibrary</w:t>
+      </w:r>
+      <w:proofErr w:type="spellEnd"/>
+      <w:r>
+        <w:t xml:space="preserve"> properties of the error object to another class, add the library for that class instead)</w:t>
+      </w:r>
+    </w:p>
+    <w:p>
+      <w:pPr>
+        <w:pStyle w:val="bullet"/>
+      </w:pPr>
+      <w:proofErr w:type="spellStart"/>
+      <w:r>
+        <w:t>SFLocalize.vcx</w:t>
+      </w:r>
+      <w:proofErr w:type="spellEnd"/>
+    </w:p>
+    <w:p>
+      <w:pPr>
+        <w:pStyle w:val="bullet"/>
+      </w:pPr>
+      <w:proofErr w:type="spellStart"/>
+      <w:r>
+        <w:t>Resource.dbf</w:t>
+      </w:r>
+      <w:proofErr w:type="spellEnd"/>
+      <w:r>
+        <w:t xml:space="preserve"> (marked as included)</w:t>
+      </w:r>
+    </w:p>
+    <w:p>
+      <w:pPr>
+        <w:pStyle w:val="bullet"/>
+      </w:pPr>
+      <w:r>
+        <w:t>ErrorHeader.gif</w:t>
+      </w:r>
+    </w:p>
+    <w:p>
+      <w:pPr>
+        <w:pStyle w:val="bullet"/>
+      </w:pPr>
+      <w:proofErr w:type="spellStart"/>
+      <w:r>
+        <w:t>wwDotNetBridge.prg</w:t>
+      </w:r>
+      <w:proofErr w:type="spellEnd"/>
+    </w:p>
+    <w:p>
+      <w:pPr>
+        <w:pStyle w:val="bullet"/>
+      </w:pPr>
+      <w:proofErr w:type="spellStart"/>
+      <w:r>
+        <w:t>Format.prg</w:t>
+      </w:r>
+      <w:proofErr w:type="spellEnd"/>
+    </w:p>
+    <w:p>
+      <w:pPr>
+        <w:pStyle w:val="bulletlast"/>
+      </w:pPr>
+      <w:proofErr w:type="spellStart"/>
+      <w:r>
+        <w:t>SFMail.prg</w:t>
+      </w:r>
+      <w:proofErr w:type="spellEnd"/>
+    </w:p>
+    <w:p>
+      <w:pPr>
+        <w:pStyle w:val="bodytext"/>
+      </w:pPr>
+      <w:r>
+        <w:t>Deploy these files along with your application’s executable:</w:t>
+      </w:r>
+    </w:p>
+    <w:p>
+      <w:pPr>
+        <w:pStyle w:val="bulletfirst"/>
+      </w:pPr>
+      <w:r>
+        <w:t>ClrHost.dll</w:t>
+      </w:r>
+    </w:p>
+    <w:p>
+      <w:pPr>
+        <w:pStyle w:val="bulletfirst"/>
+      </w:pPr>
+      <w:r>
+        <w:t>wwDotNetBridge.dll</w:t>
+      </w:r>
+    </w:p>
+    <w:p>
+      <w:pPr>
+        <w:pStyle w:val="bullet"/>
+      </w:pPr>
+      <w:r>
+        <w:t>InTry.dll</w:t>
+      </w:r>
+    </w:p>
+    <w:p>
+      <w:pPr>
+        <w:pStyle w:val="bullet"/>
+      </w:pPr>
+      <w:r>
+        <w:t>SMTPLibrary2.dll</w:t>
+      </w:r>
+      <w:r>
+        <w:t xml:space="preserve"> (only needed if SMTP is used for emailing)</w:t>
+      </w:r>
+    </w:p>
+    <w:p>
+      <w:pPr>
+        <w:pStyle w:val="bullet"/>
+      </w:pPr>
+      <w:r>
+        <w:t>MailKit</w:t>
+      </w:r>
+      <w:r>
+        <w:t>Lite</w:t>
+      </w:r>
+      <w:r>
+        <w:t>.dll</w:t>
+      </w:r>
+      <w:r>
+        <w:t xml:space="preserve"> (only needed if SMTP is used for emailing)</w:t>
+      </w:r>
+    </w:p>
+    <w:p>
+      <w:pPr>
+        <w:pStyle w:val="bullet"/>
+      </w:pPr>
+      <w:r>
+        <w:t>MimeKit</w:t>
+      </w:r>
+      <w:r>
+        <w:t>Lite</w:t>
+      </w:r>
+      <w:r>
+        <w:t>.dll</w:t>
+      </w:r>
+      <w:r>
+        <w:t xml:space="preserve"> (only needed if SMTP is used for emailing)</w:t>
+      </w:r>
+    </w:p>
+    <w:p>
+      <w:pPr>
+        <w:pStyle w:val="bullet"/>
+      </w:pPr>
+      <w:r>
+        <w:t>System.Buffers.dll (only needed if SMTP is used for emailing)</w:t>
+      </w:r>
+    </w:p>
+    <w:p>
+      <w:pPr>
+        <w:pStyle w:val="bullet"/>
+      </w:pPr>
+      <w:r>
+        <w:t>System.Formats.Asn1.dll (only needed if SMTP is used for emailing)</w:t>
+      </w:r>
+    </w:p>
+    <w:p>
+      <w:pPr>
+        <w:pStyle w:val="bullet"/>
+      </w:pPr>
+      <w:r>
+        <w:t>System.Memory.dll (only needed if SMTP is used for emailing)</w:t>
+      </w:r>
+    </w:p>
+    <w:p>
+      <w:pPr>
+        <w:pStyle w:val="bullet"/>
+      </w:pPr>
+      <w:r>
+        <w:t>System.Numerics.Vectors.dll (only needed if SMTP is used for emailing)</w:t>
+      </w:r>
+    </w:p>
+    <w:p>
+      <w:pPr>
+        <w:pStyle w:val="bullet"/>
+      </w:pPr>
+      <w:r>
+        <w:t>System.Runtime.CompilerServices.Unsafe.dll (only needed if SMTP is used for emailing)</w:t>
+      </w:r>
+    </w:p>
+    <w:p>
+      <w:pPr>
+        <w:pStyle w:val="bullet"/>
+      </w:pPr>
+      <w:r>
+        <w:t>System.Threading.Tasks.Extensions.dll (only needed if SMTP is used for emailing)</w:t>
+      </w:r>
+    </w:p>
+    <w:p>
+      <w:pPr>
+        <w:pStyle w:val="bullet"/>
+      </w:pPr>
+      <w:r>
+        <w:t>System.ValueTuple.dll (only needed if SMTP is used for emailing)</w:t>
+      </w:r>
+    </w:p>
+    <w:p>
+      <w:pPr>
+        <w:pStyle w:val="bullet"/>
+      </w:pPr>
+      <w:proofErr w:type="spellStart"/>
+      <w:r>
+        <w:t>VFPExMAPI.fll</w:t>
+      </w:r>
+      <w:proofErr w:type="spellEnd"/>
+      <w:r>
+        <w:t xml:space="preserve"> (only needed if MAPI is used for emailing)</w:t>
+      </w:r>
+    </w:p>
+    <w:p>
+      <w:pPr>
+        <w:pStyle w:val="bullet"/>
+      </w:pPr>
+      <w:proofErr w:type="spellStart"/>
+      <w:r>
+        <w:t>System.app</w:t>
+      </w:r>
+      <w:proofErr w:type="spellEnd"/>
+      <w:r>
+        <w:t xml:space="preserve"> (only needed if you want screen shots taken)</w:t>
+      </w:r>
+    </w:p>
+    <w:p>
+      <w:pPr>
+        <w:pStyle w:val="bulletlast"/>
+      </w:pPr>
+      <w:r>
+        <w:t>VFPEncryption</w:t>
+      </w:r>
+      <w:r>
+        <w:t>71</w:t>
+      </w:r>
+      <w:r>
+        <w:t>.fll</w:t>
+      </w:r>
+    </w:p>
+    <w:p>
+      <w:pPr>
+        <w:pStyle w:val="Heading1"/>
+      </w:pPr>
+      <w:r>
         <w:lastRenderedPageBreak/>
-        <w:t>Add these files to your application’s project:</w:t>
-      </w:r>
-    </w:p>
-    <w:p>
-      <w:pPr>
-        <w:pStyle w:val="bulletfirst"/>
-      </w:pPr>
-      <w:proofErr w:type="spellStart"/>
-      <w:r>
-        <w:t>SFErrorMgr.vcx</w:t>
-      </w:r>
-      <w:proofErr w:type="spellEnd"/>
-    </w:p>
-    <w:p>
-      <w:pPr>
-        <w:pStyle w:val="bullet"/>
-      </w:pPr>
-      <w:proofErr w:type="spellStart"/>
-      <w:r>
-        <w:t>SFConsole.vcx</w:t>
-      </w:r>
-      <w:proofErr w:type="spellEnd"/>
-      <w:r>
-        <w:t xml:space="preserve"> (if you set the </w:t>
-      </w:r>
-      <w:proofErr w:type="spellStart"/>
-      <w:r>
-        <w:t>cConsoleForm</w:t>
-      </w:r>
-      <w:proofErr w:type="spellEnd"/>
-      <w:r>
-        <w:t xml:space="preserve"> and </w:t>
-      </w:r>
-      <w:proofErr w:type="spellStart"/>
-      <w:r>
-        <w:t>cConsoleLibrary</w:t>
-      </w:r>
-      <w:proofErr w:type="spellEnd"/>
-      <w:r>
-        <w:t xml:space="preserve"> properties of the error object to another class, add the library for that class instead)</w:t>
-      </w:r>
-    </w:p>
-    <w:p>
-      <w:pPr>
-        <w:pStyle w:val="bullet"/>
-      </w:pPr>
-      <w:proofErr w:type="spellStart"/>
-      <w:r>
-        <w:t>SFLocalize.vcx</w:t>
-      </w:r>
-      <w:proofErr w:type="spellEnd"/>
-    </w:p>
-    <w:p>
-      <w:pPr>
-        <w:pStyle w:val="bullet"/>
-      </w:pPr>
-      <w:proofErr w:type="spellStart"/>
-      <w:r>
-        <w:t>Resource.dbf</w:t>
-      </w:r>
-      <w:proofErr w:type="spellEnd"/>
-      <w:r>
-        <w:t xml:space="preserve"> (marked as included)</w:t>
-      </w:r>
-    </w:p>
-    <w:p>
-      <w:pPr>
-        <w:pStyle w:val="bullet"/>
-      </w:pPr>
-      <w:r>
-        <w:t>ErrorHeader.gif</w:t>
-      </w:r>
-    </w:p>
-    <w:p>
-      <w:pPr>
-        <w:pStyle w:val="bullet"/>
-      </w:pPr>
-      <w:proofErr w:type="spellStart"/>
-      <w:r>
-        <w:t>wwDotNetBridge.prg</w:t>
-      </w:r>
-      <w:proofErr w:type="spellEnd"/>
-    </w:p>
-    <w:p>
-      <w:pPr>
-        <w:pStyle w:val="bulletlast"/>
-      </w:pPr>
-      <w:proofErr w:type="spellStart"/>
-      <w:r>
-        <w:t>SFMail.prg</w:t>
-      </w:r>
-      <w:proofErr w:type="spellEnd"/>
-    </w:p>
-    <w:p>
-      <w:pPr>
-        <w:pStyle w:val="bodytext"/>
-      </w:pPr>
-      <w:r>
-        <w:t>Deploy these files along with your application’s executable:</w:t>
-      </w:r>
-    </w:p>
-    <w:p>
-      <w:pPr>
-        <w:pStyle w:val="bulletfirst"/>
-      </w:pPr>
-      <w:r>
-        <w:t>ClrHost.dll</w:t>
-      </w:r>
-    </w:p>
-    <w:p>
-      <w:pPr>
-        <w:pStyle w:val="bulletfirst"/>
-      </w:pPr>
-      <w:r>
-        <w:t>wwDotNetBridge.dll</w:t>
-      </w:r>
-    </w:p>
-    <w:p>
-      <w:pPr>
-        <w:pStyle w:val="bullet"/>
-      </w:pPr>
-      <w:r>
-        <w:t>InTry.dll</w:t>
-      </w:r>
-    </w:p>
-    <w:p>
-      <w:pPr>
-        <w:pStyle w:val="bullet"/>
-      </w:pPr>
-      <w:r>
-        <w:t>SMTPLibrary2.dll</w:t>
-      </w:r>
-      <w:r>
-        <w:t xml:space="preserve"> (only needed if SMTP is used for emailing)</w:t>
-      </w:r>
-    </w:p>
-    <w:p>
-      <w:pPr>
-        <w:pStyle w:val="bullet"/>
-      </w:pPr>
-      <w:r>
-        <w:t>MailKit.dll</w:t>
-      </w:r>
-      <w:r>
-        <w:t xml:space="preserve"> (only needed if SMTP is used for emailing)</w:t>
-      </w:r>
-    </w:p>
-    <w:p>
-      <w:pPr>
-        <w:pStyle w:val="bullet"/>
-      </w:pPr>
-      <w:r>
-        <w:t>MimeKit.dll</w:t>
-      </w:r>
-      <w:r>
-        <w:t xml:space="preserve"> (only needed if SMTP is used for emailing)</w:t>
-      </w:r>
-    </w:p>
-    <w:p>
-      <w:pPr>
-        <w:pStyle w:val="bullet"/>
-      </w:pPr>
-      <w:r>
-        <w:t>BouncyCastle.Crypto</w:t>
-      </w:r>
-      <w:r>
-        <w:t>.dll</w:t>
-      </w:r>
-      <w:r>
-        <w:t xml:space="preserve"> (only needed if SMTP is used for emailing)</w:t>
-      </w:r>
-    </w:p>
-    <w:p>
-      <w:pPr>
-        <w:pStyle w:val="bullet"/>
-      </w:pPr>
-      <w:proofErr w:type="spellStart"/>
-      <w:r>
-        <w:t>VFPExMAPI.fll</w:t>
-      </w:r>
-      <w:proofErr w:type="spellEnd"/>
-      <w:r>
-        <w:t xml:space="preserve"> (only needed if MAPI is used for emailing)</w:t>
-      </w:r>
-    </w:p>
-    <w:p>
-      <w:pPr>
-        <w:pStyle w:val="bullet"/>
-      </w:pPr>
-      <w:proofErr w:type="spellStart"/>
-      <w:r>
-        <w:t>System.app</w:t>
-      </w:r>
-      <w:proofErr w:type="spellEnd"/>
-      <w:r>
-        <w:t xml:space="preserve"> (only needed if you want screen shots taken)</w:t>
-      </w:r>
-    </w:p>
-    <w:p>
-      <w:pPr>
-        <w:pStyle w:val="bulletlast"/>
-      </w:pPr>
-      <w:r>
-        <w:t>VFPEncryption</w:t>
-      </w:r>
-      <w:r>
-        <w:t>71</w:t>
-      </w:r>
-      <w:r>
-        <w:t>.fll</w:t>
-      </w:r>
-    </w:p>
-    <w:p>
-      <w:pPr>
-        <w:pStyle w:val="Heading1"/>
-      </w:pPr>
-      <w:r>
         <w:t xml:space="preserve">Using </w:t>
       </w:r>
       <w:proofErr w:type="spellStart"/>
@@ -1835,7 +1973,14 @@
         <w:rPr>
           <w:rFonts w:eastAsiaTheme="minorHAnsi"/>
         </w:rPr>
-        <w:t>the title for error message dialogs,</w:t>
+        <w:t>the title for error message dialogs</w:t>
+      </w:r>
+      <w:proofErr w:type="gramStart"/>
+      <w:r>
+        <w:rPr>
+          <w:rFonts w:eastAsiaTheme="minorHAnsi"/>
+        </w:rPr>
+        <w:t>,</w:t>
       </w:r>
       <w:r>
         <w:rPr>
@@ -1847,7 +1992,14 @@
         <w:rPr>
           <w:rFonts w:eastAsiaTheme="minorHAnsi"/>
         </w:rPr>
-        <w:t>.T. is passed so ON ERROR is set up</w:t>
+        <w:t>.</w:t>
+      </w:r>
+      <w:proofErr w:type="gramEnd"/>
+      <w:r>
+        <w:rPr>
+          <w:rFonts w:eastAsiaTheme="minorHAnsi"/>
+        </w:rPr>
+        <w:t>T. is passed so ON ERROR is set up</w:t>
       </w:r>
       <w:r>
         <w:rPr>
@@ -2089,7 +2241,6 @@
         <w:rPr>
           <w:rStyle w:val="figurename"/>
         </w:rPr>
-        <w:lastRenderedPageBreak/>
         <w:t xml:space="preserve">Table </w:t>
       </w:r>
       <w:r>
@@ -2467,7 +2618,15 @@
               <w:cnfStyle w:val="000000010000" w:firstRow="0" w:lastRow="0" w:firstColumn="0" w:lastColumn="0" w:oddVBand="0" w:evenVBand="0" w:oddHBand="0" w:evenHBand="1" w:firstRowFirstColumn="0" w:firstRowLastColumn="0" w:lastRowFirstColumn="0" w:lastRowLastColumn="0"/>
             </w:pPr>
             <w:r>
-              <w:t xml:space="preserve">The library containing the class specified in </w:t>
+              <w:t xml:space="preserve">The library </w:t>
+            </w:r>
+            <w:proofErr w:type="gramStart"/>
+            <w:r>
+              <w:t>containing</w:t>
+            </w:r>
+            <w:proofErr w:type="gramEnd"/>
+            <w:r>
+              <w:t xml:space="preserve"> the class specified in </w:t>
             </w:r>
             <w:proofErr w:type="spellStart"/>
             <w:r>
@@ -3126,7 +3285,15 @@
               <w:t>T</w:t>
             </w:r>
             <w:r>
-              <w:t>he library containing the class specified in</w:t>
+              <w:t xml:space="preserve">he library </w:t>
+            </w:r>
+            <w:proofErr w:type="gramStart"/>
+            <w:r>
+              <w:t>containing</w:t>
+            </w:r>
+            <w:proofErr w:type="gramEnd"/>
+            <w:r>
+              <w:t xml:space="preserve"> the class specified in</w:t>
             </w:r>
             <w:r>
               <w:t xml:space="preserve"> </w:t>
@@ -3332,7 +3499,15 @@
               <w:cnfStyle w:val="000000010000" w:firstRow="0" w:lastRow="0" w:firstColumn="0" w:lastColumn="0" w:oddVBand="0" w:evenVBand="0" w:oddHBand="0" w:evenHBand="1" w:firstRowFirstColumn="0" w:firstRowLastColumn="0" w:lastRowFirstColumn="0" w:lastRowLastColumn="0"/>
             </w:pPr>
             <w:r>
-              <w:t xml:space="preserve">The class library containing the class specified in </w:t>
+              <w:t xml:space="preserve">The class library </w:t>
+            </w:r>
+            <w:proofErr w:type="gramStart"/>
+            <w:r>
+              <w:t>containing</w:t>
+            </w:r>
+            <w:proofErr w:type="gramEnd"/>
+            <w:r>
+              <w:t xml:space="preserve"> the class specified in </w:t>
             </w:r>
             <w:proofErr w:type="spellStart"/>
             <w:r>
@@ -3466,6 +3641,7 @@
                 <w:b w:val="0"/>
                 <w:bCs w:val="0"/>
               </w:rPr>
+              <w:lastRenderedPageBreak/>
               <w:t>cResourceTable</w:t>
             </w:r>
             <w:proofErr w:type="spellEnd"/>
@@ -3714,31 +3890,7 @@
               <w:cnfStyle w:val="000000010000" w:firstRow="0" w:lastRow="0" w:firstColumn="0" w:lastColumn="0" w:oddVBand="0" w:evenVBand="0" w:oddHBand="0" w:evenHBand="1" w:firstRowFirstColumn="0" w:firstRowLastColumn="0" w:lastRowFirstColumn="0" w:lastRowLastColumn="0"/>
             </w:pPr>
             <w:r>
-              <w:t>N</w:t>
-            </w:r>
-            <w:r>
-              <w:t>ames of objects, members, or variables to skip</w:t>
-            </w:r>
-            <w:r>
-              <w:t xml:space="preserve"> </w:t>
-            </w:r>
-            <w:r>
-              <w:t>log information about</w:t>
-            </w:r>
-            <w:r>
-              <w:t>;</w:t>
-            </w:r>
-            <w:r>
-              <w:t xml:space="preserve"> contains names of error</w:t>
-            </w:r>
-            <w:r>
-              <w:t xml:space="preserve"> </w:t>
-            </w:r>
-            <w:r>
-              <w:t>chain methods by default</w:t>
-            </w:r>
-            <w:r>
-              <w:t>.</w:t>
+              <w:t>Names of objects, members, or variables to skip log information about; contains names of error chain methods by default.</w:t>
             </w:r>
           </w:p>
         </w:tc>
@@ -3916,15 +4068,7 @@
               <w:cnfStyle w:val="000000010000" w:firstRow="0" w:lastRow="0" w:firstColumn="0" w:lastColumn="0" w:oddVBand="0" w:evenVBand="0" w:oddHBand="0" w:evenHBand="1" w:firstRowFirstColumn="0" w:firstRowLastColumn="0" w:lastRowFirstColumn="0" w:lastRowLastColumn="0"/>
             </w:pPr>
             <w:r>
-              <w:t xml:space="preserve">The application version </w:t>
-            </w:r>
-            <w:proofErr w:type="gramStart"/>
-            <w:r>
-              <w:t>number;</w:t>
-            </w:r>
-            <w:proofErr w:type="gramEnd"/>
-            <w:r>
-              <w:t xml:space="preserve"> this is used in the subject of an email sent to developers.</w:t>
+              <w:t>The application version number; this is used in the subject of an email sent to developers.</w:t>
             </w:r>
           </w:p>
         </w:tc>
@@ -4216,7 +4360,6 @@
                 <w:b w:val="0"/>
                 <w:bCs w:val="0"/>
               </w:rPr>
-              <w:lastRenderedPageBreak/>
               <w:t>lEmailLogging</w:t>
             </w:r>
             <w:proofErr w:type="spellEnd"/>
@@ -4302,7 +4445,15 @@
               <w:t xml:space="preserve"> </w:t>
             </w:r>
             <w:r>
-              <w:t>report; .F. if an ActiveX control would cause a</w:t>
+              <w:t>report</w:t>
+            </w:r>
+            <w:proofErr w:type="gramStart"/>
+            <w:r>
+              <w:t>; .</w:t>
+            </w:r>
+            <w:proofErr w:type="gramEnd"/>
+            <w:r>
+              <w:t>F. if an ActiveX control would cause a</w:t>
             </w:r>
             <w:r>
               <w:t xml:space="preserve"> </w:t>
@@ -4365,13 +4516,21 @@
               <w:t xml:space="preserve"> </w:t>
             </w:r>
             <w:r>
-              <w:t>an Access method can check it and do nothing if</w:t>
+              <w:t xml:space="preserve">an Access method can check it and do nothing </w:t>
+            </w:r>
+            <w:proofErr w:type="gramStart"/>
+            <w:r>
+              <w:t>if</w:t>
             </w:r>
             <w:r>
               <w:t xml:space="preserve"> </w:t>
             </w:r>
             <w:r>
-              <w:t>.T.</w:t>
+              <w:t>.</w:t>
+            </w:r>
+            <w:proofErr w:type="gramEnd"/>
+            <w:r>
+              <w:t>T.</w:t>
             </w:r>
           </w:p>
         </w:tc>
@@ -4518,15 +4677,7 @@
             </w:r>
             <w:proofErr w:type="gramEnd"/>
             <w:r>
-              <w:t xml:space="preserve"> if the error should be logged </w:t>
-            </w:r>
-            <w:proofErr w:type="gramStart"/>
-            <w:r>
-              <w:t>to</w:t>
-            </w:r>
-            <w:proofErr w:type="gramEnd"/>
-            <w:r>
-              <w:t xml:space="preserve"> a table</w:t>
+              <w:t xml:space="preserve"> if the error should be logged to a table</w:t>
             </w:r>
             <w:r>
               <w:t xml:space="preserve">. Defaults </w:t>
@@ -4588,7 +4739,15 @@
               <w:t xml:space="preserve"> to use MAPI for the email</w:t>
             </w:r>
             <w:r>
-              <w:t xml:space="preserve"> or .F. (the default) for SMTP.</w:t>
+              <w:t xml:space="preserve"> </w:t>
+            </w:r>
+            <w:proofErr w:type="gramStart"/>
+            <w:r>
+              <w:t>or .</w:t>
+            </w:r>
+            <w:proofErr w:type="gramEnd"/>
+            <w:r>
+              <w:t>F. (the default) for SMTP.</w:t>
             </w:r>
           </w:p>
         </w:tc>
@@ -5444,6 +5603,7 @@
         <w:rPr>
           <w:rFonts w:eastAsiaTheme="minorHAnsi"/>
         </w:rPr>
+        <w:lastRenderedPageBreak/>
         <w:t>Catching an error</w:t>
       </w:r>
     </w:p>
@@ -5588,31 +5748,83 @@
         <w:rPr>
           <w:rFonts w:eastAsiaTheme="minorHAnsi"/>
         </w:rPr>
-        <w:t xml:space="preserve"> of which are optional: log the error, </w:t>
-      </w:r>
-      <w:r>
-        <w:rPr>
-          <w:rFonts w:eastAsiaTheme="minorHAnsi"/>
-        </w:rPr>
-        <w:t xml:space="preserve">notify support staff, </w:t>
-      </w:r>
-      <w:r>
-        <w:rPr>
-          <w:rFonts w:eastAsiaTheme="minorHAnsi"/>
-        </w:rPr>
-        <w:t xml:space="preserve">display the error to the user, and </w:t>
-      </w:r>
-      <w:r>
-        <w:rPr>
-          <w:rFonts w:eastAsiaTheme="minorHAnsi"/>
-        </w:rPr>
-        <w:t>recover from</w:t>
-      </w:r>
-      <w:r>
-        <w:rPr>
-          <w:rFonts w:eastAsiaTheme="minorHAnsi"/>
-        </w:rPr>
-        <w:t xml:space="preserve"> the error (quit the application, RETRY, return to the offending method or somewhere else, and so on).</w:t>
+        <w:t xml:space="preserve"> of which are optional: </w:t>
+      </w:r>
+      <w:proofErr w:type="gramStart"/>
+      <w:r>
+        <w:rPr>
+          <w:rFonts w:eastAsiaTheme="minorHAnsi"/>
+        </w:rPr>
+        <w:t>log</w:t>
+      </w:r>
+      <w:proofErr w:type="gramEnd"/>
+      <w:r>
+        <w:rPr>
+          <w:rFonts w:eastAsiaTheme="minorHAnsi"/>
+        </w:rPr>
+        <w:t xml:space="preserve"> the error, </w:t>
+      </w:r>
+      <w:proofErr w:type="gramStart"/>
+      <w:r>
+        <w:rPr>
+          <w:rFonts w:eastAsiaTheme="minorHAnsi"/>
+        </w:rPr>
+        <w:t>notify</w:t>
+      </w:r>
+      <w:proofErr w:type="gramEnd"/>
+      <w:r>
+        <w:rPr>
+          <w:rFonts w:eastAsiaTheme="minorHAnsi"/>
+        </w:rPr>
+        <w:t xml:space="preserve"> support staff, </w:t>
+      </w:r>
+      <w:proofErr w:type="gramStart"/>
+      <w:r>
+        <w:rPr>
+          <w:rFonts w:eastAsiaTheme="minorHAnsi"/>
+        </w:rPr>
+        <w:t>display</w:t>
+      </w:r>
+      <w:proofErr w:type="gramEnd"/>
+      <w:r>
+        <w:rPr>
+          <w:rFonts w:eastAsiaTheme="minorHAnsi"/>
+        </w:rPr>
+        <w:t xml:space="preserve"> the error to the user, and </w:t>
+      </w:r>
+      <w:proofErr w:type="gramStart"/>
+      <w:r>
+        <w:rPr>
+          <w:rFonts w:eastAsiaTheme="minorHAnsi"/>
+        </w:rPr>
+        <w:t>recover</w:t>
+      </w:r>
+      <w:proofErr w:type="gramEnd"/>
+      <w:r>
+        <w:rPr>
+          <w:rFonts w:eastAsiaTheme="minorHAnsi"/>
+        </w:rPr>
+        <w:t xml:space="preserve"> from</w:t>
+      </w:r>
+      <w:r>
+        <w:rPr>
+          <w:rFonts w:eastAsiaTheme="minorHAnsi"/>
+        </w:rPr>
+        <w:t xml:space="preserve"> the error (quit the application, RETRY, </w:t>
+      </w:r>
+      <w:proofErr w:type="gramStart"/>
+      <w:r>
+        <w:rPr>
+          <w:rFonts w:eastAsiaTheme="minorHAnsi"/>
+        </w:rPr>
+        <w:t>return</w:t>
+      </w:r>
+      <w:proofErr w:type="gramEnd"/>
+      <w:r>
+        <w:rPr>
+          <w:rFonts w:eastAsiaTheme="minorHAnsi"/>
+        </w:rPr>
+        <w:t xml:space="preserve"> to the offending method or somewhere else, and so on).</w:t>
       </w:r>
     </w:p>
     <w:p>
@@ -5678,7 +5890,21 @@
         <w:rPr>
           <w:rFonts w:eastAsiaTheme="minorHAnsi"/>
         </w:rPr>
-        <w:t xml:space="preserve">) and MESSAGE(1). It then </w:t>
+        <w:t xml:space="preserve">) and </w:t>
+      </w:r>
+      <w:proofErr w:type="gramStart"/>
+      <w:r>
+        <w:rPr>
+          <w:rFonts w:eastAsiaTheme="minorHAnsi"/>
+        </w:rPr>
+        <w:t>MESSAGE(</w:t>
+      </w:r>
+      <w:proofErr w:type="gramEnd"/>
+      <w:r>
+        <w:rPr>
+          <w:rFonts w:eastAsiaTheme="minorHAnsi"/>
+        </w:rPr>
+        <w:t xml:space="preserve">1). It then </w:t>
       </w:r>
       <w:r>
         <w:rPr>
@@ -5857,14 +6083,7 @@
         <w:rPr>
           <w:rFonts w:eastAsiaTheme="minorHAnsi"/>
         </w:rPr>
-        <w:t xml:space="preserve">This is due to a restriction in TRY: you can’t issue a RETURN statement when a TRY is active. </w:t>
-      </w:r>
-      <w:r>
-        <w:rPr>
-          <w:rFonts w:eastAsiaTheme="minorHAnsi"/>
-        </w:rPr>
-        <w:lastRenderedPageBreak/>
-        <w:t xml:space="preserve">Typically, </w:t>
+        <w:t xml:space="preserve">This is due to a restriction in TRY: you can’t issue a RETURN statement when a TRY is active. Typically, </w:t>
       </w:r>
       <w:proofErr w:type="spellStart"/>
       <w:r>
@@ -6021,7 +6240,15 @@
       </w:r>
       <w:bookmarkEnd w:id="4"/>
       <w:r>
-        <w:t>. CATCH doesn't always catch errors.</w:t>
+        <w:t xml:space="preserve">. CATCH doesn't always </w:t>
+      </w:r>
+      <w:proofErr w:type="gramStart"/>
+      <w:r>
+        <w:t>catch</w:t>
+      </w:r>
+      <w:proofErr w:type="gramEnd"/>
+      <w:r>
+        <w:t xml:space="preserve"> errors.</w:t>
       </w:r>
     </w:p>
     <w:p>
@@ -6286,7 +6513,11 @@
       </w:r>
       <w:proofErr w:type="gramEnd"/>
       <w:r>
-        <w:t>2410), which tells you how an error will be handled, would help, but it can’t tell whether there’s a TRY somewhere in the call stack, so it returns 2 (Error method) or 3 (ON ERROR). Funny that VFP can’t tell whether a TRY is involved until you try to do a RETURN TO!</w:t>
+        <w:t xml:space="preserve">2410), which tells you how an error will be </w:t>
+      </w:r>
+      <w:r>
+        <w:lastRenderedPageBreak/>
+        <w:t>handled, would help, but it can’t tell whether there’s a TRY somewhere in the call stack, so it returns 2 (Error method) or 3 (ON ERROR). Funny that VFP can’t tell whether a TRY is involved until you try to do a RETURN TO!</w:t>
       </w:r>
     </w:p>
     <w:p>
@@ -6430,21 +6661,441 @@
         <w:rPr>
           <w:rFonts w:eastAsiaTheme="minorHAnsi"/>
         </w:rPr>
-        <w:t xml:space="preserve"> to package the various pieces of information about the error (error number, message, </w:t>
+        <w:t xml:space="preserve"> to package the various pieces of information about the error (error number, message, procedure or method where it occurred, and so on) into a message string.</w:t>
+      </w:r>
+    </w:p>
+    <w:p>
+      <w:pPr>
+        <w:pStyle w:val="Heading1"/>
+        <w:rPr>
+          <w:rFonts w:eastAsiaTheme="minorHAnsi"/>
+        </w:rPr>
+      </w:pPr>
+      <w:r>
+        <w:rPr>
+          <w:rFonts w:eastAsiaTheme="minorHAnsi"/>
+        </w:rPr>
+        <w:t xml:space="preserve">Error </w:t>
+      </w:r>
+      <w:r>
+        <w:rPr>
+          <w:rFonts w:eastAsiaTheme="minorHAnsi"/>
+        </w:rPr>
+        <w:t>suppression</w:t>
+      </w:r>
+    </w:p>
+    <w:p>
+      <w:pPr>
+        <w:pStyle w:val="firstparagraph"/>
+        <w:rPr>
+          <w:rFonts w:eastAsiaTheme="minorHAnsi"/>
+          <w:lang w:eastAsia="en-US"/>
+        </w:rPr>
+      </w:pPr>
+      <w:r>
+        <w:rPr>
+          <w:rFonts w:eastAsiaTheme="minorHAnsi"/>
+          <w:lang w:eastAsia="en-US"/>
+        </w:rPr>
+        <w:t>Rick Schummer once told me a humorous story. His company’s error handler sends an email to a service which automatically creates a support ticket. One day, a network problem caused error after error after error to occur, so they suddenly had a thousand support tickets created for what was ultimately a single problem.</w:t>
+      </w:r>
+    </w:p>
+    <w:p>
+      <w:pPr>
+        <w:pStyle w:val="bodytext"/>
+        <w:rPr>
+          <w:rFonts w:eastAsiaTheme="minorHAnsi"/>
+          <w:lang w:eastAsia="en-US"/>
+        </w:rPr>
+      </w:pPr>
+      <w:proofErr w:type="spellStart"/>
+      <w:r>
+        <w:rPr>
+          <w:rFonts w:eastAsiaTheme="minorHAnsi"/>
+          <w:lang w:eastAsia="en-US"/>
+        </w:rPr>
+        <w:t>SFErrorMgr</w:t>
+      </w:r>
+      <w:proofErr w:type="spellEnd"/>
+      <w:r>
+        <w:rPr>
+          <w:rFonts w:eastAsiaTheme="minorHAnsi"/>
+          <w:lang w:eastAsia="en-US"/>
+        </w:rPr>
+        <w:t xml:space="preserve"> handles this by supporting </w:t>
+      </w:r>
+      <w:r>
+        <w:rPr>
+          <w:rFonts w:eastAsiaTheme="minorHAnsi"/>
+          <w:lang w:eastAsia="en-US"/>
+        </w:rPr>
+        <w:t>error suppression</w:t>
+      </w:r>
+      <w:r>
+        <w:rPr>
+          <w:rFonts w:eastAsiaTheme="minorHAnsi"/>
+          <w:lang w:eastAsia="en-US"/>
+        </w:rPr>
+        <w:t xml:space="preserve">. </w:t>
+      </w:r>
+      <w:proofErr w:type="spellStart"/>
+      <w:r>
+        <w:rPr>
+          <w:rFonts w:eastAsiaTheme="minorHAnsi"/>
+          <w:lang w:eastAsia="en-US"/>
+        </w:rPr>
+        <w:t>nThrottleThreshold</w:t>
+      </w:r>
+      <w:proofErr w:type="spellEnd"/>
+      <w:r>
+        <w:rPr>
+          <w:rFonts w:eastAsiaTheme="minorHAnsi"/>
+          <w:lang w:eastAsia="en-US"/>
+        </w:rPr>
+        <w:t xml:space="preserve"> </w:t>
+      </w:r>
+      <w:r>
+        <w:rPr>
+          <w:rFonts w:eastAsiaTheme="minorHAnsi"/>
+          <w:lang w:eastAsia="en-US"/>
+        </w:rPr>
+        <w:t xml:space="preserve">specifies </w:t>
+      </w:r>
+      <w:r>
+        <w:rPr>
+          <w:rFonts w:eastAsiaTheme="minorHAnsi"/>
+          <w:lang w:eastAsia="en-US"/>
+        </w:rPr>
+        <w:t xml:space="preserve">the number of seconds </w:t>
+      </w:r>
+      <w:r>
+        <w:rPr>
+          <w:rFonts w:eastAsiaTheme="minorHAnsi"/>
+          <w:lang w:eastAsia="en-US"/>
+        </w:rPr>
+        <w:t xml:space="preserve">a certain number of errors (specified in </w:t>
+      </w:r>
+      <w:proofErr w:type="spellStart"/>
+      <w:r>
+        <w:rPr>
+          <w:rFonts w:eastAsiaTheme="minorHAnsi"/>
+          <w:lang w:eastAsia="en-US"/>
+        </w:rPr>
+        <w:t>nThrottleErrorCount</w:t>
+      </w:r>
+      <w:proofErr w:type="spellEnd"/>
+      <w:r>
+        <w:rPr>
+          <w:rFonts w:eastAsiaTheme="minorHAnsi"/>
+          <w:lang w:eastAsia="en-US"/>
+        </w:rPr>
+        <w:t>)</w:t>
+      </w:r>
+      <w:r>
+        <w:rPr>
+          <w:rFonts w:eastAsiaTheme="minorHAnsi"/>
+          <w:lang w:eastAsia="en-US"/>
+        </w:rPr>
+        <w:t xml:space="preserve"> must occur within for error suppression</w:t>
+      </w:r>
+      <w:r>
+        <w:rPr>
+          <w:rFonts w:eastAsiaTheme="minorHAnsi"/>
+          <w:lang w:eastAsia="en-US"/>
+        </w:rPr>
+        <w:t xml:space="preserve"> </w:t>
+      </w:r>
+      <w:r>
+        <w:rPr>
+          <w:rFonts w:eastAsiaTheme="minorHAnsi"/>
+          <w:lang w:eastAsia="en-US"/>
+        </w:rPr>
+        <w:t>to be enabled</w:t>
+      </w:r>
+      <w:r>
+        <w:rPr>
+          <w:rFonts w:eastAsiaTheme="minorHAnsi"/>
+          <w:lang w:eastAsia="en-US"/>
+        </w:rPr>
+        <w:t xml:space="preserve">. If </w:t>
+      </w:r>
+      <w:proofErr w:type="spellStart"/>
+      <w:r>
+        <w:rPr>
+          <w:rFonts w:eastAsiaTheme="minorHAnsi"/>
+          <w:lang w:eastAsia="en-US"/>
+        </w:rPr>
+        <w:t>nThrottleThreshold</w:t>
+      </w:r>
+      <w:proofErr w:type="spellEnd"/>
+      <w:r>
+        <w:rPr>
+          <w:rFonts w:eastAsiaTheme="minorHAnsi"/>
+          <w:lang w:eastAsia="en-US"/>
+        </w:rPr>
+        <w:t xml:space="preserve"> </w:t>
+      </w:r>
+      <w:r>
+        <w:rPr>
+          <w:rFonts w:eastAsiaTheme="minorHAnsi"/>
+          <w:lang w:eastAsia="en-US"/>
+        </w:rPr>
+        <w:t>is set to something other than zero</w:t>
+      </w:r>
+      <w:r>
+        <w:rPr>
+          <w:rFonts w:eastAsiaTheme="minorHAnsi"/>
+          <w:lang w:eastAsia="en-US"/>
+        </w:rPr>
+        <w:t xml:space="preserve">, </w:t>
+      </w:r>
+      <w:proofErr w:type="spellStart"/>
+      <w:r>
+        <w:rPr>
+          <w:rFonts w:eastAsiaTheme="minorHAnsi"/>
+          <w:lang w:eastAsia="en-US"/>
+        </w:rPr>
+        <w:t>ErrorHandler</w:t>
+      </w:r>
+      <w:proofErr w:type="spellEnd"/>
+      <w:r>
+        <w:rPr>
+          <w:rFonts w:eastAsiaTheme="minorHAnsi"/>
+          <w:lang w:eastAsia="en-US"/>
+        </w:rPr>
+        <w:t xml:space="preserve"> checks if </w:t>
+      </w:r>
+      <w:proofErr w:type="spellStart"/>
+      <w:r>
+        <w:rPr>
+          <w:rFonts w:eastAsiaTheme="minorHAnsi"/>
+          <w:lang w:eastAsia="en-US"/>
+        </w:rPr>
+        <w:t>nThrottleErrorCount</w:t>
+      </w:r>
+      <w:proofErr w:type="spellEnd"/>
+      <w:r>
+        <w:rPr>
+          <w:rFonts w:eastAsiaTheme="minorHAnsi"/>
+          <w:lang w:eastAsia="en-US"/>
+        </w:rPr>
+        <w:t xml:space="preserve"> or more errors have occurred within </w:t>
+      </w:r>
+      <w:proofErr w:type="spellStart"/>
+      <w:r>
+        <w:rPr>
+          <w:rFonts w:eastAsiaTheme="minorHAnsi"/>
+          <w:lang w:eastAsia="en-US"/>
+        </w:rPr>
+        <w:t>nThrottleThreshold</w:t>
+      </w:r>
+      <w:proofErr w:type="spellEnd"/>
+      <w:r>
+        <w:rPr>
+          <w:rFonts w:eastAsiaTheme="minorHAnsi"/>
+          <w:lang w:eastAsia="en-US"/>
+        </w:rPr>
+        <w:t xml:space="preserve"> seconds and if so, sets </w:t>
+      </w:r>
+      <w:proofErr w:type="spellStart"/>
+      <w:r>
+        <w:rPr>
+          <w:rFonts w:eastAsiaTheme="minorHAnsi"/>
+          <w:lang w:eastAsia="en-US"/>
+        </w:rPr>
+        <w:t>lSuppressErrors</w:t>
+      </w:r>
+      <w:proofErr w:type="spellEnd"/>
+      <w:r>
+        <w:rPr>
+          <w:rFonts w:eastAsiaTheme="minorHAnsi"/>
+          <w:lang w:eastAsia="en-US"/>
+        </w:rPr>
+        <w:t xml:space="preserve"> </w:t>
       </w:r>
       <w:proofErr w:type="gramStart"/>
       <w:r>
         <w:rPr>
           <w:rFonts w:eastAsiaTheme="minorHAnsi"/>
-        </w:rPr>
-        <w:t>procedure</w:t>
+          <w:lang w:eastAsia="en-US"/>
+        </w:rPr>
+        <w:t>to .</w:t>
       </w:r>
       <w:proofErr w:type="gramEnd"/>
       <w:r>
         <w:rPr>
           <w:rFonts w:eastAsiaTheme="minorHAnsi"/>
-        </w:rPr>
-        <w:t xml:space="preserve"> or method where it occurred, and so on) into a message string.</w:t>
+          <w:lang w:eastAsia="en-US"/>
+        </w:rPr>
+        <w:t>T. so no errors are logged</w:t>
+      </w:r>
+      <w:r>
+        <w:rPr>
+          <w:rFonts w:eastAsiaTheme="minorHAnsi"/>
+          <w:lang w:eastAsia="en-US"/>
+        </w:rPr>
+        <w:t xml:space="preserve">, </w:t>
+      </w:r>
+      <w:r>
+        <w:rPr>
+          <w:rFonts w:eastAsiaTheme="minorHAnsi"/>
+          <w:lang w:eastAsia="en-US"/>
+        </w:rPr>
+        <w:t>displayed to the user</w:t>
+      </w:r>
+      <w:r>
+        <w:rPr>
+          <w:rFonts w:eastAsiaTheme="minorHAnsi"/>
+          <w:lang w:eastAsia="en-US"/>
+        </w:rPr>
+        <w:t xml:space="preserve">, or passed on to </w:t>
+      </w:r>
+      <w:r>
+        <w:rPr>
+          <w:rFonts w:eastAsiaTheme="minorHAnsi"/>
+          <w:lang w:eastAsia="en-US"/>
+        </w:rPr>
+        <w:t>support</w:t>
+      </w:r>
+      <w:r>
+        <w:rPr>
+          <w:rFonts w:eastAsiaTheme="minorHAnsi"/>
+          <w:lang w:eastAsia="en-US"/>
+        </w:rPr>
+        <w:t xml:space="preserve"> staff</w:t>
+      </w:r>
+      <w:r>
+        <w:rPr>
+          <w:rFonts w:eastAsiaTheme="minorHAnsi"/>
+          <w:lang w:eastAsia="en-US"/>
+        </w:rPr>
+        <w:t xml:space="preserve">. Suppression remains in place until the number of seconds in </w:t>
+      </w:r>
+      <w:proofErr w:type="spellStart"/>
+      <w:r>
+        <w:rPr>
+          <w:rFonts w:eastAsiaTheme="minorHAnsi"/>
+          <w:lang w:eastAsia="en-US"/>
+        </w:rPr>
+        <w:t>nThrottleWindow</w:t>
+      </w:r>
+      <w:proofErr w:type="spellEnd"/>
+      <w:r>
+        <w:rPr>
+          <w:rFonts w:eastAsiaTheme="minorHAnsi"/>
+          <w:lang w:eastAsia="en-US"/>
+        </w:rPr>
+        <w:t xml:space="preserve"> has passed without another error occurring.</w:t>
+      </w:r>
+    </w:p>
+    <w:p>
+      <w:pPr>
+        <w:pStyle w:val="bodytext"/>
+        <w:rPr>
+          <w:rFonts w:eastAsiaTheme="minorHAnsi"/>
+          <w:lang w:eastAsia="en-US"/>
+        </w:rPr>
+      </w:pPr>
+      <w:r>
+        <w:rPr>
+          <w:rFonts w:eastAsiaTheme="minorHAnsi"/>
+          <w:lang w:eastAsia="en-US"/>
+        </w:rPr>
+        <w:t xml:space="preserve">For example, suppose </w:t>
+      </w:r>
+      <w:proofErr w:type="spellStart"/>
+      <w:r>
+        <w:rPr>
+          <w:rFonts w:eastAsiaTheme="minorHAnsi"/>
+          <w:lang w:eastAsia="en-US"/>
+        </w:rPr>
+        <w:t>nThrottleThreshold</w:t>
+      </w:r>
+      <w:proofErr w:type="spellEnd"/>
+      <w:r>
+        <w:rPr>
+          <w:rFonts w:eastAsiaTheme="minorHAnsi"/>
+          <w:lang w:eastAsia="en-US"/>
+        </w:rPr>
+        <w:t xml:space="preserve"> is set to 10, </w:t>
+      </w:r>
+      <w:proofErr w:type="spellStart"/>
+      <w:r>
+        <w:rPr>
+          <w:rFonts w:eastAsiaTheme="minorHAnsi"/>
+          <w:lang w:eastAsia="en-US"/>
+        </w:rPr>
+        <w:t>nThrottleErrorCount</w:t>
+      </w:r>
+      <w:proofErr w:type="spellEnd"/>
+      <w:r>
+        <w:rPr>
+          <w:rFonts w:eastAsiaTheme="minorHAnsi"/>
+          <w:lang w:eastAsia="en-US"/>
+        </w:rPr>
+        <w:t xml:space="preserve"> is set to 3, and </w:t>
+      </w:r>
+      <w:proofErr w:type="spellStart"/>
+      <w:r>
+        <w:rPr>
+          <w:rFonts w:eastAsiaTheme="minorHAnsi"/>
+          <w:lang w:eastAsia="en-US"/>
+        </w:rPr>
+        <w:t>nThrottleWindow</w:t>
+      </w:r>
+      <w:proofErr w:type="spellEnd"/>
+      <w:r>
+        <w:rPr>
+          <w:rFonts w:eastAsiaTheme="minorHAnsi"/>
+          <w:lang w:eastAsia="en-US"/>
+        </w:rPr>
+        <w:t xml:space="preserve"> is set to 3600. That means if three or more errors occur within a span of ten seconds, error suppression occurs for an hour, after which error handling goes back to normal.</w:t>
+      </w:r>
+    </w:p>
+    <w:p>
+      <w:pPr>
+        <w:pStyle w:val="bodytext"/>
+        <w:rPr>
+          <w:rFonts w:eastAsiaTheme="minorHAnsi"/>
+          <w:lang w:eastAsia="en-US"/>
+        </w:rPr>
+      </w:pPr>
+      <w:r>
+        <w:rPr>
+          <w:rFonts w:eastAsiaTheme="minorHAnsi"/>
+          <w:lang w:eastAsia="en-US"/>
+        </w:rPr>
+        <w:t xml:space="preserve">You can also manually set </w:t>
+      </w:r>
+      <w:proofErr w:type="spellStart"/>
+      <w:r>
+        <w:rPr>
+          <w:rFonts w:eastAsiaTheme="minorHAnsi"/>
+          <w:lang w:eastAsia="en-US"/>
+        </w:rPr>
+        <w:t>lSuppressErrors</w:t>
+      </w:r>
+      <w:proofErr w:type="spellEnd"/>
+      <w:r>
+        <w:rPr>
+          <w:rFonts w:eastAsiaTheme="minorHAnsi"/>
+          <w:lang w:eastAsia="en-US"/>
+        </w:rPr>
+        <w:t xml:space="preserve"> if you don’t want errors logged, displayed to the user, or passed on to </w:t>
+      </w:r>
+      <w:r>
+        <w:rPr>
+          <w:rFonts w:eastAsiaTheme="minorHAnsi"/>
+          <w:lang w:eastAsia="en-US"/>
+        </w:rPr>
+        <w:t xml:space="preserve">support </w:t>
+      </w:r>
+      <w:r>
+        <w:rPr>
+          <w:rFonts w:eastAsiaTheme="minorHAnsi"/>
+          <w:lang w:eastAsia="en-US"/>
+        </w:rPr>
+        <w:t>staff.</w:t>
       </w:r>
     </w:p>
     <w:p>
@@ -6458,37 +7109,356 @@
         <w:rPr>
           <w:rFonts w:eastAsiaTheme="minorHAnsi"/>
         </w:rPr>
-        <w:t xml:space="preserve">Error </w:t>
-      </w:r>
-      <w:r>
-        <w:rPr>
-          <w:rFonts w:eastAsiaTheme="minorHAnsi"/>
-        </w:rPr>
-        <w:t>suppression</w:t>
-      </w:r>
-    </w:p>
-    <w:p>
-      <w:pPr>
-        <w:pStyle w:val="firstparagraph"/>
-        <w:rPr>
-          <w:rFonts w:eastAsiaTheme="minorHAnsi"/>
-          <w:lang w:eastAsia="en-US"/>
-        </w:rPr>
-      </w:pPr>
-      <w:r>
-        <w:rPr>
-          <w:rFonts w:eastAsiaTheme="minorHAnsi"/>
-          <w:lang w:eastAsia="en-US"/>
-        </w:rPr>
-        <w:t xml:space="preserve">Rick Schummer once told me a humorous story. His company’s error handler sends an email to a service which automatically creates a support ticket. One day, a network </w:t>
-      </w:r>
-      <w:r>
-        <w:rPr>
-          <w:rFonts w:eastAsiaTheme="minorHAnsi"/>
-          <w:lang w:eastAsia="en-US"/>
+        <w:t>Logging the error</w:t>
+      </w:r>
+    </w:p>
+    <w:p>
+      <w:pPr>
+        <w:pStyle w:val="bodytext"/>
+        <w:rPr>
+          <w:rFonts w:eastAsiaTheme="minorHAnsi"/>
+        </w:rPr>
+      </w:pPr>
+      <w:r>
+        <w:rPr>
+          <w:rFonts w:eastAsiaTheme="minorHAnsi"/>
+        </w:rPr>
+        <w:t xml:space="preserve">If </w:t>
+      </w:r>
+      <w:r>
+        <w:rPr>
+          <w:rFonts w:eastAsiaTheme="minorHAnsi"/>
+        </w:rPr>
+        <w:t>errors are</w:t>
+      </w:r>
+      <w:r>
+        <w:rPr>
+          <w:rFonts w:eastAsiaTheme="minorHAnsi"/>
+        </w:rPr>
+        <w:t>n’t being suppressed</w:t>
+      </w:r>
+      <w:r>
+        <w:rPr>
+          <w:rFonts w:eastAsiaTheme="minorHAnsi"/>
+        </w:rPr>
+        <w:t xml:space="preserve">, </w:t>
+      </w:r>
+      <w:proofErr w:type="spellStart"/>
+      <w:r>
+        <w:rPr>
+          <w:rFonts w:eastAsiaTheme="minorHAnsi"/>
+        </w:rPr>
+        <w:t>ErrorHandler</w:t>
+      </w:r>
+      <w:proofErr w:type="spellEnd"/>
+      <w:r>
+        <w:rPr>
+          <w:rFonts w:eastAsiaTheme="minorHAnsi"/>
+        </w:rPr>
+        <w:t xml:space="preserve"> </w:t>
+      </w:r>
+      <w:r>
+        <w:rPr>
+          <w:rFonts w:eastAsiaTheme="minorHAnsi"/>
+        </w:rPr>
+        <w:t>log</w:t>
+      </w:r>
+      <w:r>
+        <w:rPr>
+          <w:rFonts w:eastAsiaTheme="minorHAnsi"/>
+        </w:rPr>
+        <w:t xml:space="preserve">s </w:t>
+      </w:r>
+      <w:r>
+        <w:rPr>
+          <w:rFonts w:eastAsiaTheme="minorHAnsi"/>
+        </w:rPr>
+        <w:t xml:space="preserve">the error </w:t>
+      </w:r>
+      <w:r>
+        <w:rPr>
+          <w:rFonts w:eastAsiaTheme="minorHAnsi"/>
+        </w:rPr>
+        <w:t xml:space="preserve">by calling </w:t>
+      </w:r>
+      <w:proofErr w:type="spellStart"/>
+      <w:r>
+        <w:rPr>
+          <w:rFonts w:eastAsiaTheme="minorHAnsi"/>
+        </w:rPr>
+        <w:t>LogError</w:t>
+      </w:r>
+      <w:proofErr w:type="spellEnd"/>
+      <w:r>
+        <w:rPr>
+          <w:rFonts w:eastAsiaTheme="minorHAnsi"/>
+        </w:rPr>
+        <w:t xml:space="preserve">. </w:t>
+      </w:r>
+      <w:proofErr w:type="spellStart"/>
+      <w:r>
+        <w:rPr>
+          <w:rFonts w:eastAsiaTheme="minorHAnsi"/>
+        </w:rPr>
+        <w:t>LogError</w:t>
+      </w:r>
+      <w:proofErr w:type="spellEnd"/>
+      <w:r>
+        <w:rPr>
+          <w:rFonts w:eastAsiaTheme="minorHAnsi"/>
+        </w:rPr>
+        <w:t xml:space="preserve"> logs the error to </w:t>
+      </w:r>
+      <w:r>
+        <w:rPr>
+          <w:rFonts w:eastAsiaTheme="minorHAnsi"/>
+        </w:rPr>
+        <w:t>the</w:t>
+      </w:r>
+      <w:r>
+        <w:rPr>
+          <w:rFonts w:eastAsiaTheme="minorHAnsi"/>
+        </w:rPr>
+        <w:t xml:space="preserve"> table </w:t>
+      </w:r>
+      <w:r>
+        <w:rPr>
+          <w:rFonts w:eastAsiaTheme="minorHAnsi"/>
+        </w:rPr>
+        <w:t xml:space="preserve">specified in </w:t>
+      </w:r>
+      <w:proofErr w:type="spellStart"/>
+      <w:r>
+        <w:rPr>
+          <w:rFonts w:eastAsiaTheme="minorHAnsi"/>
+        </w:rPr>
+        <w:t>cErrorLogFile</w:t>
+      </w:r>
+      <w:proofErr w:type="spellEnd"/>
+      <w:r>
+        <w:rPr>
+          <w:rFonts w:eastAsiaTheme="minorHAnsi"/>
+        </w:rPr>
+        <w:t xml:space="preserve"> if </w:t>
+      </w:r>
+      <w:proofErr w:type="spellStart"/>
+      <w:r>
+        <w:rPr>
+          <w:rFonts w:eastAsiaTheme="minorHAnsi"/>
+        </w:rPr>
+        <w:t>lLogToTable</w:t>
+      </w:r>
+      <w:proofErr w:type="spellEnd"/>
+      <w:r>
+        <w:rPr>
+          <w:rFonts w:eastAsiaTheme="minorHAnsi"/>
+        </w:rPr>
+        <w:t xml:space="preserve"> </w:t>
+      </w:r>
+      <w:proofErr w:type="gramStart"/>
+      <w:r>
+        <w:rPr>
+          <w:rFonts w:eastAsiaTheme="minorHAnsi"/>
+        </w:rPr>
+        <w:t>is .</w:t>
+      </w:r>
+      <w:proofErr w:type="gramEnd"/>
+      <w:r>
+        <w:rPr>
+          <w:rFonts w:eastAsiaTheme="minorHAnsi"/>
+        </w:rPr>
+        <w:t>T.</w:t>
+      </w:r>
+      <w:r>
+        <w:rPr>
+          <w:rFonts w:eastAsiaTheme="minorHAnsi"/>
+        </w:rPr>
+        <w:t xml:space="preserve"> (that table is created if it doesn’t exist).</w:t>
+      </w:r>
+      <w:r>
+        <w:rPr>
+          <w:rFonts w:eastAsiaTheme="minorHAnsi"/>
+        </w:rPr>
+        <w:t xml:space="preserve"> Among the things logged are:</w:t>
+      </w:r>
+    </w:p>
+    <w:p>
+      <w:pPr>
+        <w:pStyle w:val="bulletfirst"/>
+        <w:rPr>
+          <w:rFonts w:eastAsiaTheme="minorHAnsi"/>
+        </w:rPr>
+      </w:pPr>
+      <w:r>
+        <w:rPr>
+          <w:rFonts w:eastAsiaTheme="minorHAnsi"/>
+        </w:rPr>
+        <w:t>The date and time the error occurred.</w:t>
+      </w:r>
+    </w:p>
+    <w:p>
+      <w:pPr>
+        <w:pStyle w:val="bullet"/>
+        <w:rPr>
+          <w:rFonts w:eastAsiaTheme="minorHAnsi"/>
+        </w:rPr>
+      </w:pPr>
+      <w:r>
+        <w:rPr>
+          <w:rFonts w:eastAsiaTheme="minorHAnsi"/>
+        </w:rPr>
+        <w:t xml:space="preserve">The name of the user (taken from the </w:t>
+      </w:r>
+      <w:proofErr w:type="spellStart"/>
+      <w:r>
+        <w:rPr>
+          <w:rFonts w:eastAsiaTheme="minorHAnsi"/>
+        </w:rPr>
+        <w:t>cUser</w:t>
+      </w:r>
+      <w:proofErr w:type="spellEnd"/>
+      <w:r>
+        <w:rPr>
+          <w:rFonts w:eastAsiaTheme="minorHAnsi"/>
+        </w:rPr>
+        <w:t xml:space="preserve"> property).</w:t>
+      </w:r>
+    </w:p>
+    <w:p>
+      <w:pPr>
+        <w:pStyle w:val="bullet"/>
+        <w:rPr>
+          <w:rFonts w:eastAsiaTheme="minorHAnsi"/>
+        </w:rPr>
+      </w:pPr>
+      <w:r>
+        <w:rPr>
+          <w:rFonts w:eastAsiaTheme="minorHAnsi"/>
         </w:rPr>
         <w:lastRenderedPageBreak/>
-        <w:t>problem caused error after error after error to occur, so they suddenly had a thousand support tickets created for what was ultimately a single problem.</w:t>
+        <w:t>The error number, message, method, line number and source (</w:t>
+      </w:r>
+      <w:r>
+        <w:rPr>
+          <w:rFonts w:eastAsiaTheme="minorHAnsi"/>
+        </w:rPr>
+        <w:t>the latter two</w:t>
+      </w:r>
+      <w:r>
+        <w:rPr>
+          <w:rFonts w:eastAsiaTheme="minorHAnsi"/>
+        </w:rPr>
+        <w:t xml:space="preserve"> of which may </w:t>
+      </w:r>
+      <w:r>
+        <w:rPr>
+          <w:rFonts w:eastAsiaTheme="minorHAnsi"/>
+        </w:rPr>
+        <w:t xml:space="preserve">not </w:t>
+      </w:r>
+      <w:r>
+        <w:rPr>
+          <w:rFonts w:eastAsiaTheme="minorHAnsi"/>
+        </w:rPr>
+        <w:t>be available in a runtime environment)</w:t>
+      </w:r>
+      <w:r>
+        <w:rPr>
+          <w:rFonts w:eastAsiaTheme="minorHAnsi"/>
+        </w:rPr>
+        <w:t>.</w:t>
+      </w:r>
+    </w:p>
+    <w:p>
+      <w:pPr>
+        <w:pStyle w:val="bullet"/>
+        <w:rPr>
+          <w:rFonts w:eastAsiaTheme="minorHAnsi"/>
+        </w:rPr>
+      </w:pPr>
+      <w:r>
+        <w:rPr>
+          <w:rFonts w:eastAsiaTheme="minorHAnsi"/>
+        </w:rPr>
+        <w:t>Current alias.</w:t>
+      </w:r>
+    </w:p>
+    <w:p>
+      <w:pPr>
+        <w:pStyle w:val="bullet"/>
+        <w:rPr>
+          <w:rFonts w:eastAsiaTheme="minorHAnsi"/>
+        </w:rPr>
+      </w:pPr>
+      <w:r>
+        <w:rPr>
+          <w:rFonts w:eastAsiaTheme="minorHAnsi"/>
+        </w:rPr>
+        <w:t>Trigger type if an error occurred in a trigger.</w:t>
+      </w:r>
+    </w:p>
+    <w:p>
+      <w:pPr>
+        <w:pStyle w:val="bullet"/>
+        <w:rPr>
+          <w:rFonts w:eastAsiaTheme="minorHAnsi"/>
+        </w:rPr>
+      </w:pPr>
+      <w:r>
+        <w:rPr>
+          <w:rFonts w:eastAsiaTheme="minorHAnsi"/>
+        </w:rPr>
+        <w:t>The values of all relevant memory variables.</w:t>
+      </w:r>
+    </w:p>
+    <w:p>
+      <w:pPr>
+        <w:pStyle w:val="bullet"/>
+        <w:rPr>
+          <w:rFonts w:eastAsiaTheme="minorHAnsi"/>
+        </w:rPr>
+      </w:pPr>
+      <w:r>
+        <w:rPr>
+          <w:rFonts w:eastAsiaTheme="minorHAnsi"/>
+        </w:rPr>
+        <w:t>The call stack.</w:t>
+      </w:r>
+    </w:p>
+    <w:p>
+      <w:pPr>
+        <w:pStyle w:val="bullet"/>
+        <w:rPr>
+          <w:rFonts w:eastAsiaTheme="minorHAnsi"/>
+        </w:rPr>
+      </w:pPr>
+      <w:r>
+        <w:rPr>
+          <w:rFonts w:eastAsiaTheme="minorHAnsi"/>
+        </w:rPr>
+        <w:t>The values of public properties for all accessible objects.</w:t>
+      </w:r>
+    </w:p>
+    <w:p>
+      <w:pPr>
+        <w:pStyle w:val="bullet"/>
+        <w:rPr>
+          <w:rFonts w:eastAsiaTheme="minorHAnsi"/>
+        </w:rPr>
+      </w:pPr>
+      <w:r>
+        <w:rPr>
+          <w:rFonts w:eastAsiaTheme="minorHAnsi"/>
+        </w:rPr>
+        <w:t>The text of LIST STATUS.</w:t>
+      </w:r>
+    </w:p>
+    <w:p>
+      <w:pPr>
+        <w:pStyle w:val="bulletlast"/>
+      </w:pPr>
+      <w:r>
+        <w:t>The contents of all Windows environment variables.</w:t>
       </w:r>
     </w:p>
     <w:p>
@@ -6496,14 +7466,184 @@
         <w:pStyle w:val="bodytext"/>
         <w:rPr>
           <w:rFonts w:eastAsiaTheme="minorHAnsi"/>
-          <w:lang w:eastAsia="en-US"/>
-        </w:rPr>
-      </w:pPr>
-      <w:proofErr w:type="spellStart"/>
-      <w:r>
-        <w:rPr>
-          <w:rFonts w:eastAsiaTheme="minorHAnsi"/>
-          <w:lang w:eastAsia="en-US"/>
+        </w:rPr>
+      </w:pPr>
+      <w:r>
+        <w:rPr>
+          <w:rFonts w:eastAsiaTheme="minorHAnsi"/>
+        </w:rPr>
+        <w:t xml:space="preserve">The latter five items are handled by the by-now slightly misnamed </w:t>
+      </w:r>
+      <w:proofErr w:type="spellStart"/>
+      <w:r>
+        <w:rPr>
+          <w:rFonts w:eastAsiaTheme="minorHAnsi"/>
+        </w:rPr>
+        <w:t>GetMemVars</w:t>
+      </w:r>
+      <w:proofErr w:type="spellEnd"/>
+      <w:r>
+        <w:rPr>
+          <w:rFonts w:eastAsiaTheme="minorHAnsi"/>
+        </w:rPr>
+        <w:t xml:space="preserve"> method. Some interesting things about </w:t>
+      </w:r>
+      <w:proofErr w:type="spellStart"/>
+      <w:r>
+        <w:rPr>
+          <w:rFonts w:eastAsiaTheme="minorHAnsi"/>
+        </w:rPr>
+        <w:t>GetMemVars</w:t>
+      </w:r>
+      <w:proofErr w:type="spellEnd"/>
+      <w:r>
+        <w:rPr>
+          <w:rFonts w:eastAsiaTheme="minorHAnsi"/>
+        </w:rPr>
+        <w:t xml:space="preserve"> are:</w:t>
+      </w:r>
+    </w:p>
+    <w:p>
+      <w:pPr>
+        <w:pStyle w:val="bulletfirst"/>
+        <w:rPr>
+          <w:rFonts w:eastAsiaTheme="minorHAnsi"/>
+        </w:rPr>
+      </w:pPr>
+      <w:r>
+        <w:rPr>
+          <w:rFonts w:eastAsiaTheme="minorHAnsi"/>
+        </w:rPr>
+        <w:t>It uses an interesting capability of the LIST MEMORY function: it can “see” all variables in the application, including those declared LOCAL. This is very important because otherwise there’d be no way to know the values of those variables, which is a key thing when debugging an application.</w:t>
+      </w:r>
+    </w:p>
+    <w:p>
+      <w:pPr>
+        <w:pStyle w:val="bullet"/>
+        <w:rPr>
+          <w:rFonts w:eastAsiaTheme="minorHAnsi"/>
+        </w:rPr>
+      </w:pPr>
+      <w:proofErr w:type="spellStart"/>
+      <w:r>
+        <w:rPr>
+          <w:rFonts w:eastAsiaTheme="minorHAnsi"/>
+        </w:rPr>
+        <w:t>GetMemVars</w:t>
+      </w:r>
+      <w:proofErr w:type="spellEnd"/>
+      <w:r>
+        <w:rPr>
+          <w:rFonts w:eastAsiaTheme="minorHAnsi"/>
+        </w:rPr>
+        <w:t xml:space="preserve"> cleans up </w:t>
+      </w:r>
+      <w:r>
+        <w:rPr>
+          <w:rFonts w:eastAsiaTheme="minorHAnsi"/>
+        </w:rPr>
+        <w:t>some quirks LIST MEMORY has in formatting.</w:t>
+      </w:r>
+    </w:p>
+    <w:p>
+      <w:pPr>
+        <w:pStyle w:val="bullet"/>
+        <w:rPr>
+          <w:rFonts w:eastAsiaTheme="minorHAnsi"/>
+        </w:rPr>
+      </w:pPr>
+      <w:r>
+        <w:rPr>
+          <w:rFonts w:eastAsiaTheme="minorHAnsi"/>
+        </w:rPr>
+        <w:t>I don’t care about variables used in certain functions and methods, including those in the error handler itself, so those are removed from the list of variables.</w:t>
+      </w:r>
+      <w:r>
+        <w:rPr>
+          <w:rFonts w:eastAsiaTheme="minorHAnsi"/>
+        </w:rPr>
+        <w:t xml:space="preserve"> You can adapt that list as necessary</w:t>
+      </w:r>
+      <w:r>
+        <w:rPr>
+          <w:rFonts w:eastAsiaTheme="minorHAnsi"/>
+        </w:rPr>
+        <w:t xml:space="preserve"> by adding the names of variables to the </w:t>
+      </w:r>
+      <w:proofErr w:type="spellStart"/>
+      <w:r>
+        <w:rPr>
+          <w:rFonts w:eastAsiaTheme="minorHAnsi"/>
+        </w:rPr>
+        <w:t>cSkipNames</w:t>
+      </w:r>
+      <w:proofErr w:type="spellEnd"/>
+      <w:r>
+        <w:rPr>
+          <w:rFonts w:eastAsiaTheme="minorHAnsi"/>
+        </w:rPr>
+        <w:t xml:space="preserve"> property.</w:t>
+      </w:r>
+    </w:p>
+    <w:p>
+      <w:pPr>
+        <w:pStyle w:val="bullet"/>
+        <w:rPr>
+          <w:rFonts w:eastAsiaTheme="minorHAnsi"/>
+        </w:rPr>
+      </w:pPr>
+      <w:r>
+        <w:rPr>
+          <w:rFonts w:eastAsiaTheme="minorHAnsi"/>
+        </w:rPr>
+        <w:t xml:space="preserve">Under some conditions, LIST MEMORY causes a buffer overrun error. When she encountered this problem, Tamar </w:t>
+      </w:r>
+      <w:proofErr w:type="spellStart"/>
+      <w:r>
+        <w:rPr>
+          <w:rFonts w:eastAsiaTheme="minorHAnsi"/>
+        </w:rPr>
+        <w:t>Granor</w:t>
+      </w:r>
+      <w:proofErr w:type="spellEnd"/>
+      <w:r>
+        <w:rPr>
+          <w:rFonts w:eastAsiaTheme="minorHAnsi"/>
+        </w:rPr>
+        <w:t xml:space="preserve"> found that using LIST MEMORY LIKE A*, LIST MEMORY LIKE B*, etc. helped. If you encounter this when an error occurs in a particular section of code, you can set </w:t>
+      </w:r>
+      <w:proofErr w:type="spellStart"/>
+      <w:r>
+        <w:rPr>
+          <w:rFonts w:eastAsiaTheme="minorHAnsi"/>
+        </w:rPr>
+        <w:t>oError.lGetMemVars</w:t>
+      </w:r>
+      <w:proofErr w:type="spellEnd"/>
+      <w:r>
+        <w:rPr>
+          <w:rFonts w:eastAsiaTheme="minorHAnsi"/>
+        </w:rPr>
+        <w:t xml:space="preserve"> </w:t>
+      </w:r>
+      <w:proofErr w:type="gramStart"/>
+      <w:r>
+        <w:rPr>
+          <w:rFonts w:eastAsiaTheme="minorHAnsi"/>
+        </w:rPr>
+        <w:t>to .</w:t>
+      </w:r>
+      <w:proofErr w:type="gramEnd"/>
+      <w:r>
+        <w:rPr>
+          <w:rFonts w:eastAsiaTheme="minorHAnsi"/>
+        </w:rPr>
+        <w:t xml:space="preserve">F.; </w:t>
+      </w:r>
+      <w:proofErr w:type="spellStart"/>
+      <w:r>
+        <w:rPr>
+          <w:rFonts w:eastAsiaTheme="minorHAnsi"/>
         </w:rPr>
         <w:t>SFErrorMgr</w:t>
       </w:r>
@@ -6511,1133 +7651,166 @@
       <w:r>
         <w:rPr>
           <w:rFonts w:eastAsiaTheme="minorHAnsi"/>
-          <w:lang w:eastAsia="en-US"/>
-        </w:rPr>
-        <w:t xml:space="preserve"> handles this by supporting </w:t>
-      </w:r>
-      <w:r>
-        <w:rPr>
-          <w:rFonts w:eastAsiaTheme="minorHAnsi"/>
-          <w:lang w:eastAsia="en-US"/>
-        </w:rPr>
-        <w:t>error suppression</w:t>
-      </w:r>
-      <w:r>
-        <w:rPr>
-          <w:rFonts w:eastAsiaTheme="minorHAnsi"/>
-          <w:lang w:eastAsia="en-US"/>
-        </w:rPr>
-        <w:t xml:space="preserve">. </w:t>
-      </w:r>
-      <w:proofErr w:type="spellStart"/>
-      <w:r>
-        <w:rPr>
-          <w:rFonts w:eastAsiaTheme="minorHAnsi"/>
-          <w:lang w:eastAsia="en-US"/>
-        </w:rPr>
-        <w:t>nThrottleThreshold</w:t>
-      </w:r>
-      <w:proofErr w:type="spellEnd"/>
-      <w:r>
-        <w:rPr>
-          <w:rFonts w:eastAsiaTheme="minorHAnsi"/>
-          <w:lang w:eastAsia="en-US"/>
+        </w:rPr>
+        <w:t xml:space="preserve"> won’t use LIST MEMORY in that case.</w:t>
+      </w:r>
+    </w:p>
+    <w:p>
+      <w:pPr>
+        <w:pStyle w:val="bullet"/>
+        <w:rPr>
+          <w:rFonts w:eastAsiaTheme="minorHAnsi"/>
+        </w:rPr>
+      </w:pPr>
+      <w:r>
+        <w:rPr>
+          <w:rFonts w:eastAsiaTheme="minorHAnsi"/>
+        </w:rPr>
+        <w:t>Like LIST MEMORY, LIST OBJECTS can “see” objects contained in variables, even LOCAL ones, and it lists the values of all public properties of those objects. However, LIST OBJECTS can crash under some conditions, such as when accessing certain types of properties of COM objects, so the code using it is wrapped in a TRY.</w:t>
+      </w:r>
+      <w:r>
+        <w:rPr>
+          <w:rFonts w:eastAsiaTheme="minorHAnsi"/>
+        </w:rPr>
+        <w:t xml:space="preserve"> I’ve also run into issues with the Access method of properties causing a problem, so </w:t>
+      </w:r>
+      <w:proofErr w:type="spellStart"/>
+      <w:r>
+        <w:rPr>
+          <w:rFonts w:eastAsiaTheme="minorHAnsi"/>
+        </w:rPr>
+        <w:t>GetMemVars</w:t>
+      </w:r>
+      <w:proofErr w:type="spellEnd"/>
+      <w:r>
+        <w:rPr>
+          <w:rFonts w:eastAsiaTheme="minorHAnsi"/>
+        </w:rPr>
+        <w:t xml:space="preserve"> sets </w:t>
+      </w:r>
+      <w:proofErr w:type="spellStart"/>
+      <w:r>
+        <w:rPr>
+          <w:rFonts w:eastAsiaTheme="minorHAnsi"/>
+        </w:rPr>
+        <w:t>lGettingMemVars</w:t>
+      </w:r>
+      <w:proofErr w:type="spellEnd"/>
+      <w:r>
+        <w:rPr>
+          <w:rFonts w:eastAsiaTheme="minorHAnsi"/>
         </w:rPr>
         <w:t xml:space="preserve"> </w:t>
       </w:r>
-      <w:r>
-        <w:rPr>
-          <w:rFonts w:eastAsiaTheme="minorHAnsi"/>
-          <w:lang w:eastAsia="en-US"/>
-        </w:rPr>
-        <w:t xml:space="preserve">specifies </w:t>
-      </w:r>
-      <w:r>
-        <w:rPr>
-          <w:rFonts w:eastAsiaTheme="minorHAnsi"/>
-          <w:lang w:eastAsia="en-US"/>
-        </w:rPr>
-        <w:t xml:space="preserve">the number of seconds </w:t>
-      </w:r>
-      <w:r>
-        <w:rPr>
-          <w:rFonts w:eastAsiaTheme="minorHAnsi"/>
-          <w:lang w:eastAsia="en-US"/>
-        </w:rPr>
-        <w:t xml:space="preserve">a certain number of errors (specified in </w:t>
-      </w:r>
-      <w:proofErr w:type="spellStart"/>
-      <w:r>
-        <w:rPr>
-          <w:rFonts w:eastAsiaTheme="minorHAnsi"/>
-          <w:lang w:eastAsia="en-US"/>
-        </w:rPr>
-        <w:t>nThrottleErrorCount</w:t>
-      </w:r>
-      <w:proofErr w:type="spellEnd"/>
-      <w:r>
-        <w:rPr>
-          <w:rFonts w:eastAsiaTheme="minorHAnsi"/>
-          <w:lang w:eastAsia="en-US"/>
-        </w:rPr>
-        <w:t>)</w:t>
-      </w:r>
-      <w:r>
-        <w:rPr>
-          <w:rFonts w:eastAsiaTheme="minorHAnsi"/>
-          <w:lang w:eastAsia="en-US"/>
-        </w:rPr>
-        <w:t xml:space="preserve"> must occur within for error suppression</w:t>
-      </w:r>
-      <w:r>
-        <w:rPr>
-          <w:rFonts w:eastAsiaTheme="minorHAnsi"/>
-          <w:lang w:eastAsia="en-US"/>
+      <w:proofErr w:type="gramStart"/>
+      <w:r>
+        <w:rPr>
+          <w:rFonts w:eastAsiaTheme="minorHAnsi"/>
+        </w:rPr>
+        <w:t>to .</w:t>
+      </w:r>
+      <w:proofErr w:type="gramEnd"/>
+      <w:r>
+        <w:rPr>
+          <w:rFonts w:eastAsiaTheme="minorHAnsi"/>
+        </w:rPr>
+        <w:t xml:space="preserve">T. before issuing the LIST OBJECTS command; problematic Access methods can then check </w:t>
+      </w:r>
+      <w:proofErr w:type="spellStart"/>
+      <w:r>
+        <w:rPr>
+          <w:rFonts w:eastAsiaTheme="minorHAnsi"/>
+        </w:rPr>
+        <w:t>oError.</w:t>
+      </w:r>
+      <w:r>
+        <w:rPr>
+          <w:rFonts w:eastAsiaTheme="minorHAnsi"/>
+        </w:rPr>
+        <w:t>lGettingMemVars</w:t>
+      </w:r>
+      <w:proofErr w:type="spellEnd"/>
+      <w:r>
+        <w:rPr>
+          <w:rFonts w:eastAsiaTheme="minorHAnsi"/>
+        </w:rPr>
+        <w:t xml:space="preserve"> if necessary.</w:t>
+      </w:r>
+    </w:p>
+    <w:p>
+      <w:pPr>
+        <w:pStyle w:val="bullet"/>
+        <w:rPr>
+          <w:rFonts w:eastAsiaTheme="minorHAnsi"/>
+        </w:rPr>
+      </w:pPr>
+      <w:r>
+        <w:rPr>
+          <w:rFonts w:eastAsiaTheme="minorHAnsi"/>
+        </w:rPr>
+        <w:t>Like variables, the code cleans up some formatting quirks</w:t>
+      </w:r>
+      <w:r>
+        <w:rPr>
+          <w:rFonts w:eastAsiaTheme="minorHAnsi"/>
+        </w:rPr>
+        <w:t xml:space="preserve"> with LIST OBJECTS</w:t>
+      </w:r>
+      <w:r>
+        <w:rPr>
+          <w:rFonts w:eastAsiaTheme="minorHAnsi"/>
+        </w:rPr>
+        <w:t xml:space="preserve"> and because there are some objects I don’t want listed, such as the error handler itself, it removes those</w:t>
+      </w:r>
+      <w:r>
+        <w:rPr>
+          <w:rFonts w:eastAsiaTheme="minorHAnsi"/>
+        </w:rPr>
+        <w:t xml:space="preserve"> from the listing. You can adapt that list of objects as necessary</w:t>
+      </w:r>
+      <w:r>
+        <w:rPr>
+          <w:rFonts w:eastAsiaTheme="minorHAnsi"/>
         </w:rPr>
         <w:t xml:space="preserve"> </w:t>
       </w:r>
       <w:r>
         <w:rPr>
           <w:rFonts w:eastAsiaTheme="minorHAnsi"/>
-          <w:lang w:eastAsia="en-US"/>
-        </w:rPr>
-        <w:t>to be enabled</w:t>
-      </w:r>
-      <w:r>
-        <w:rPr>
-          <w:rFonts w:eastAsiaTheme="minorHAnsi"/>
-          <w:lang w:eastAsia="en-US"/>
-        </w:rPr>
-        <w:t xml:space="preserve">. If </w:t>
-      </w:r>
-      <w:proofErr w:type="spellStart"/>
-      <w:r>
-        <w:rPr>
-          <w:rFonts w:eastAsiaTheme="minorHAnsi"/>
-          <w:lang w:eastAsia="en-US"/>
-        </w:rPr>
-        <w:t>nThrottleThreshold</w:t>
-      </w:r>
-      <w:proofErr w:type="spellEnd"/>
-      <w:r>
-        <w:rPr>
-          <w:rFonts w:eastAsiaTheme="minorHAnsi"/>
-          <w:lang w:eastAsia="en-US"/>
-        </w:rPr>
-        <w:t xml:space="preserve"> </w:t>
-      </w:r>
-      <w:r>
-        <w:rPr>
-          <w:rFonts w:eastAsiaTheme="minorHAnsi"/>
-          <w:lang w:eastAsia="en-US"/>
-        </w:rPr>
-        <w:t>is set to something other than zero</w:t>
-      </w:r>
-      <w:r>
-        <w:rPr>
-          <w:rFonts w:eastAsiaTheme="minorHAnsi"/>
-          <w:lang w:eastAsia="en-US"/>
-        </w:rPr>
-        <w:t xml:space="preserve">, </w:t>
-      </w:r>
-      <w:proofErr w:type="spellStart"/>
-      <w:r>
-        <w:rPr>
-          <w:rFonts w:eastAsiaTheme="minorHAnsi"/>
-          <w:lang w:eastAsia="en-US"/>
-        </w:rPr>
-        <w:t>ErrorHandler</w:t>
-      </w:r>
-      <w:proofErr w:type="spellEnd"/>
-      <w:r>
-        <w:rPr>
-          <w:rFonts w:eastAsiaTheme="minorHAnsi"/>
-          <w:lang w:eastAsia="en-US"/>
-        </w:rPr>
-        <w:t xml:space="preserve"> checks if </w:t>
-      </w:r>
-      <w:proofErr w:type="spellStart"/>
-      <w:r>
-        <w:rPr>
-          <w:rFonts w:eastAsiaTheme="minorHAnsi"/>
-          <w:lang w:eastAsia="en-US"/>
-        </w:rPr>
-        <w:t>nThrottleErrorCount</w:t>
-      </w:r>
-      <w:proofErr w:type="spellEnd"/>
-      <w:r>
-        <w:rPr>
-          <w:rFonts w:eastAsiaTheme="minorHAnsi"/>
-          <w:lang w:eastAsia="en-US"/>
-        </w:rPr>
-        <w:t xml:space="preserve"> or more errors have occurred within </w:t>
-      </w:r>
-      <w:proofErr w:type="spellStart"/>
-      <w:r>
-        <w:rPr>
-          <w:rFonts w:eastAsiaTheme="minorHAnsi"/>
-          <w:lang w:eastAsia="en-US"/>
-        </w:rPr>
-        <w:t>nThrottleThreshold</w:t>
-      </w:r>
-      <w:proofErr w:type="spellEnd"/>
-      <w:r>
-        <w:rPr>
-          <w:rFonts w:eastAsiaTheme="minorHAnsi"/>
-          <w:lang w:eastAsia="en-US"/>
-        </w:rPr>
-        <w:t xml:space="preserve"> seconds and if so, sets </w:t>
-      </w:r>
-      <w:proofErr w:type="spellStart"/>
-      <w:r>
-        <w:rPr>
-          <w:rFonts w:eastAsiaTheme="minorHAnsi"/>
-          <w:lang w:eastAsia="en-US"/>
-        </w:rPr>
-        <w:t>lSuppressErrors</w:t>
-      </w:r>
-      <w:proofErr w:type="spellEnd"/>
-      <w:r>
-        <w:rPr>
-          <w:rFonts w:eastAsiaTheme="minorHAnsi"/>
-          <w:lang w:eastAsia="en-US"/>
-        </w:rPr>
-        <w:t xml:space="preserve"> </w:t>
-      </w:r>
-      <w:proofErr w:type="gramStart"/>
-      <w:r>
-        <w:rPr>
-          <w:rFonts w:eastAsiaTheme="minorHAnsi"/>
-          <w:lang w:eastAsia="en-US"/>
-        </w:rPr>
-        <w:t>to .</w:t>
-      </w:r>
-      <w:proofErr w:type="gramEnd"/>
-      <w:r>
-        <w:rPr>
-          <w:rFonts w:eastAsiaTheme="minorHAnsi"/>
-          <w:lang w:eastAsia="en-US"/>
-        </w:rPr>
-        <w:t>T. so no errors are logged</w:t>
-      </w:r>
-      <w:r>
-        <w:rPr>
-          <w:rFonts w:eastAsiaTheme="minorHAnsi"/>
-          <w:lang w:eastAsia="en-US"/>
-        </w:rPr>
-        <w:t xml:space="preserve">, </w:t>
-      </w:r>
-      <w:r>
-        <w:rPr>
-          <w:rFonts w:eastAsiaTheme="minorHAnsi"/>
-          <w:lang w:eastAsia="en-US"/>
-        </w:rPr>
-        <w:t>displayed to the user</w:t>
-      </w:r>
-      <w:r>
-        <w:rPr>
-          <w:rFonts w:eastAsiaTheme="minorHAnsi"/>
-          <w:lang w:eastAsia="en-US"/>
-        </w:rPr>
-        <w:t xml:space="preserve">, or passed on to </w:t>
-      </w:r>
-      <w:r>
-        <w:rPr>
-          <w:rFonts w:eastAsiaTheme="minorHAnsi"/>
-          <w:lang w:eastAsia="en-US"/>
-        </w:rPr>
-        <w:t>support</w:t>
-      </w:r>
-      <w:r>
-        <w:rPr>
-          <w:rFonts w:eastAsiaTheme="minorHAnsi"/>
-          <w:lang w:eastAsia="en-US"/>
-        </w:rPr>
-        <w:t xml:space="preserve"> staff</w:t>
-      </w:r>
-      <w:r>
-        <w:rPr>
-          <w:rFonts w:eastAsiaTheme="minorHAnsi"/>
-          <w:lang w:eastAsia="en-US"/>
-        </w:rPr>
-        <w:t xml:space="preserve">. Suppression remains in place until the number of seconds in </w:t>
-      </w:r>
-      <w:proofErr w:type="spellStart"/>
-      <w:r>
-        <w:rPr>
-          <w:rFonts w:eastAsiaTheme="minorHAnsi"/>
-          <w:lang w:eastAsia="en-US"/>
-        </w:rPr>
-        <w:t>nThrottleWindow</w:t>
-      </w:r>
-      <w:proofErr w:type="spellEnd"/>
-      <w:r>
-        <w:rPr>
-          <w:rFonts w:eastAsiaTheme="minorHAnsi"/>
-          <w:lang w:eastAsia="en-US"/>
-        </w:rPr>
-        <w:t xml:space="preserve"> has passed without another error occurring.</w:t>
-      </w:r>
-    </w:p>
-    <w:p>
-      <w:pPr>
-        <w:pStyle w:val="bodytext"/>
-        <w:rPr>
-          <w:rFonts w:eastAsiaTheme="minorHAnsi"/>
-          <w:lang w:eastAsia="en-US"/>
-        </w:rPr>
-      </w:pPr>
-      <w:r>
-        <w:rPr>
-          <w:rFonts w:eastAsiaTheme="minorHAnsi"/>
-          <w:lang w:eastAsia="en-US"/>
-        </w:rPr>
-        <w:t xml:space="preserve">For example, suppose </w:t>
-      </w:r>
-      <w:proofErr w:type="spellStart"/>
-      <w:r>
-        <w:rPr>
-          <w:rFonts w:eastAsiaTheme="minorHAnsi"/>
-          <w:lang w:eastAsia="en-US"/>
-        </w:rPr>
-        <w:t>nThrottleThreshold</w:t>
-      </w:r>
-      <w:proofErr w:type="spellEnd"/>
-      <w:r>
-        <w:rPr>
-          <w:rFonts w:eastAsiaTheme="minorHAnsi"/>
-          <w:lang w:eastAsia="en-US"/>
-        </w:rPr>
-        <w:t xml:space="preserve"> is set to 10, </w:t>
-      </w:r>
-      <w:proofErr w:type="spellStart"/>
-      <w:r>
-        <w:rPr>
-          <w:rFonts w:eastAsiaTheme="minorHAnsi"/>
-          <w:lang w:eastAsia="en-US"/>
-        </w:rPr>
-        <w:t>nThrottleErrorCount</w:t>
-      </w:r>
-      <w:proofErr w:type="spellEnd"/>
-      <w:r>
-        <w:rPr>
-          <w:rFonts w:eastAsiaTheme="minorHAnsi"/>
-          <w:lang w:eastAsia="en-US"/>
-        </w:rPr>
-        <w:t xml:space="preserve"> is set to 3, and </w:t>
-      </w:r>
-      <w:proofErr w:type="spellStart"/>
-      <w:r>
-        <w:rPr>
-          <w:rFonts w:eastAsiaTheme="minorHAnsi"/>
-          <w:lang w:eastAsia="en-US"/>
-        </w:rPr>
-        <w:t>nThrottleWindow</w:t>
-      </w:r>
-      <w:proofErr w:type="spellEnd"/>
-      <w:r>
-        <w:rPr>
-          <w:rFonts w:eastAsiaTheme="minorHAnsi"/>
-          <w:lang w:eastAsia="en-US"/>
-        </w:rPr>
-        <w:t xml:space="preserve"> is set to 3600. That means if three or more errors occur within a span of ten seconds, error suppression occurs for an hour, after which error handling goes back to normal.</w:t>
-      </w:r>
-    </w:p>
-    <w:p>
-      <w:pPr>
-        <w:pStyle w:val="bodytext"/>
-        <w:rPr>
-          <w:rFonts w:eastAsiaTheme="minorHAnsi"/>
-          <w:lang w:eastAsia="en-US"/>
-        </w:rPr>
-      </w:pPr>
-      <w:r>
-        <w:rPr>
-          <w:rFonts w:eastAsiaTheme="minorHAnsi"/>
-          <w:lang w:eastAsia="en-US"/>
-        </w:rPr>
-        <w:t xml:space="preserve">You can also manually set </w:t>
-      </w:r>
-      <w:proofErr w:type="spellStart"/>
-      <w:r>
-        <w:rPr>
-          <w:rFonts w:eastAsiaTheme="minorHAnsi"/>
-          <w:lang w:eastAsia="en-US"/>
-        </w:rPr>
-        <w:t>lSuppressErrors</w:t>
-      </w:r>
-      <w:proofErr w:type="spellEnd"/>
-      <w:r>
-        <w:rPr>
-          <w:rFonts w:eastAsiaTheme="minorHAnsi"/>
-          <w:lang w:eastAsia="en-US"/>
-        </w:rPr>
-        <w:t xml:space="preserve"> if you don’t want errors logged, displayed to the user, or passed on to </w:t>
-      </w:r>
-      <w:r>
-        <w:rPr>
-          <w:rFonts w:eastAsiaTheme="minorHAnsi"/>
-          <w:lang w:eastAsia="en-US"/>
-        </w:rPr>
-        <w:t xml:space="preserve">support </w:t>
-      </w:r>
-      <w:r>
-        <w:rPr>
-          <w:rFonts w:eastAsiaTheme="minorHAnsi"/>
-          <w:lang w:eastAsia="en-US"/>
-        </w:rPr>
-        <w:t>staff.</w:t>
-      </w:r>
-    </w:p>
-    <w:p>
-      <w:pPr>
-        <w:pStyle w:val="Heading1"/>
-        <w:rPr>
-          <w:rFonts w:eastAsiaTheme="minorHAnsi"/>
-        </w:rPr>
-      </w:pPr>
-      <w:r>
-        <w:rPr>
-          <w:rFonts w:eastAsiaTheme="minorHAnsi"/>
-        </w:rPr>
-        <w:t>Logging the error</w:t>
-      </w:r>
-    </w:p>
-    <w:p>
-      <w:pPr>
-        <w:pStyle w:val="bodytext"/>
-        <w:rPr>
-          <w:rFonts w:eastAsiaTheme="minorHAnsi"/>
-        </w:rPr>
-      </w:pPr>
-      <w:r>
-        <w:rPr>
-          <w:rFonts w:eastAsiaTheme="minorHAnsi"/>
-        </w:rPr>
-        <w:t xml:space="preserve">If </w:t>
-      </w:r>
-      <w:r>
-        <w:rPr>
-          <w:rFonts w:eastAsiaTheme="minorHAnsi"/>
-        </w:rPr>
-        <w:t>errors are</w:t>
-      </w:r>
-      <w:r>
-        <w:rPr>
-          <w:rFonts w:eastAsiaTheme="minorHAnsi"/>
-        </w:rPr>
-        <w:t>n’t being suppressed</w:t>
-      </w:r>
-      <w:r>
-        <w:rPr>
-          <w:rFonts w:eastAsiaTheme="minorHAnsi"/>
-        </w:rPr>
-        <w:t xml:space="preserve">, </w:t>
-      </w:r>
-      <w:proofErr w:type="spellStart"/>
-      <w:r>
-        <w:rPr>
-          <w:rFonts w:eastAsiaTheme="minorHAnsi"/>
-        </w:rPr>
-        <w:t>ErrorHandler</w:t>
-      </w:r>
-      <w:proofErr w:type="spellEnd"/>
-      <w:r>
-        <w:rPr>
-          <w:rFonts w:eastAsiaTheme="minorHAnsi"/>
-        </w:rPr>
-        <w:t xml:space="preserve"> </w:t>
-      </w:r>
-      <w:r>
-        <w:rPr>
-          <w:rFonts w:eastAsiaTheme="minorHAnsi"/>
-        </w:rPr>
-        <w:t>log</w:t>
-      </w:r>
-      <w:r>
-        <w:rPr>
-          <w:rFonts w:eastAsiaTheme="minorHAnsi"/>
-        </w:rPr>
-        <w:t xml:space="preserve">s </w:t>
-      </w:r>
-      <w:r>
-        <w:rPr>
-          <w:rFonts w:eastAsiaTheme="minorHAnsi"/>
-        </w:rPr>
-        <w:t xml:space="preserve">the error </w:t>
-      </w:r>
-      <w:r>
-        <w:rPr>
-          <w:rFonts w:eastAsiaTheme="minorHAnsi"/>
-        </w:rPr>
-        <w:t xml:space="preserve">by calling </w:t>
-      </w:r>
-      <w:proofErr w:type="spellStart"/>
-      <w:r>
-        <w:rPr>
-          <w:rFonts w:eastAsiaTheme="minorHAnsi"/>
-        </w:rPr>
-        <w:t>LogError</w:t>
-      </w:r>
-      <w:proofErr w:type="spellEnd"/>
-      <w:r>
-        <w:rPr>
-          <w:rFonts w:eastAsiaTheme="minorHAnsi"/>
-        </w:rPr>
-        <w:t xml:space="preserve">. </w:t>
-      </w:r>
-      <w:proofErr w:type="spellStart"/>
-      <w:r>
-        <w:rPr>
-          <w:rFonts w:eastAsiaTheme="minorHAnsi"/>
-        </w:rPr>
-        <w:t>LogError</w:t>
-      </w:r>
-      <w:proofErr w:type="spellEnd"/>
-      <w:r>
-        <w:rPr>
-          <w:rFonts w:eastAsiaTheme="minorHAnsi"/>
-        </w:rPr>
-        <w:t xml:space="preserve"> logs the error to </w:t>
-      </w:r>
-      <w:r>
-        <w:rPr>
-          <w:rFonts w:eastAsiaTheme="minorHAnsi"/>
-        </w:rPr>
-        <w:t>the</w:t>
-      </w:r>
-      <w:r>
-        <w:rPr>
-          <w:rFonts w:eastAsiaTheme="minorHAnsi"/>
-        </w:rPr>
-        <w:t xml:space="preserve"> table </w:t>
-      </w:r>
-      <w:r>
-        <w:rPr>
-          <w:rFonts w:eastAsiaTheme="minorHAnsi"/>
-        </w:rPr>
-        <w:t xml:space="preserve">specified in </w:t>
-      </w:r>
-      <w:proofErr w:type="spellStart"/>
-      <w:r>
-        <w:rPr>
-          <w:rFonts w:eastAsiaTheme="minorHAnsi"/>
-        </w:rPr>
-        <w:t>cErrorLogFile</w:t>
-      </w:r>
-      <w:proofErr w:type="spellEnd"/>
-      <w:r>
-        <w:rPr>
-          <w:rFonts w:eastAsiaTheme="minorHAnsi"/>
-        </w:rPr>
-        <w:t xml:space="preserve"> if </w:t>
-      </w:r>
-      <w:proofErr w:type="spellStart"/>
-      <w:r>
-        <w:rPr>
-          <w:rFonts w:eastAsiaTheme="minorHAnsi"/>
-        </w:rPr>
-        <w:t>lLogToTable</w:t>
-      </w:r>
-      <w:proofErr w:type="spellEnd"/>
-      <w:r>
-        <w:rPr>
-          <w:rFonts w:eastAsiaTheme="minorHAnsi"/>
-        </w:rPr>
-        <w:t xml:space="preserve"> </w:t>
-      </w:r>
-      <w:proofErr w:type="gramStart"/>
-      <w:r>
-        <w:rPr>
-          <w:rFonts w:eastAsiaTheme="minorHAnsi"/>
-        </w:rPr>
-        <w:t>is .</w:t>
-      </w:r>
-      <w:proofErr w:type="gramEnd"/>
-      <w:r>
-        <w:rPr>
-          <w:rFonts w:eastAsiaTheme="minorHAnsi"/>
-        </w:rPr>
-        <w:t>T.</w:t>
-      </w:r>
-      <w:r>
-        <w:rPr>
-          <w:rFonts w:eastAsiaTheme="minorHAnsi"/>
-        </w:rPr>
-        <w:t xml:space="preserve"> (that table is created if it doesn’t exist).</w:t>
-      </w:r>
-      <w:r>
-        <w:rPr>
-          <w:rFonts w:eastAsiaTheme="minorHAnsi"/>
-        </w:rPr>
-        <w:t xml:space="preserve"> Among the things logged are:</w:t>
-      </w:r>
-    </w:p>
-    <w:p>
-      <w:pPr>
-        <w:pStyle w:val="bulletfirst"/>
-        <w:rPr>
-          <w:rFonts w:eastAsiaTheme="minorHAnsi"/>
-        </w:rPr>
-      </w:pPr>
-      <w:r>
-        <w:rPr>
-          <w:rFonts w:eastAsiaTheme="minorHAnsi"/>
-        </w:rPr>
-        <w:t>The date and time the error occurred.</w:t>
-      </w:r>
-    </w:p>
-    <w:p>
-      <w:pPr>
-        <w:pStyle w:val="bullet"/>
-        <w:rPr>
-          <w:rFonts w:eastAsiaTheme="minorHAnsi"/>
-        </w:rPr>
-      </w:pPr>
-      <w:r>
-        <w:rPr>
-          <w:rFonts w:eastAsiaTheme="minorHAnsi"/>
-        </w:rPr>
-        <w:t xml:space="preserve">The name of the user (taken from the </w:t>
-      </w:r>
-      <w:proofErr w:type="spellStart"/>
-      <w:r>
-        <w:rPr>
-          <w:rFonts w:eastAsiaTheme="minorHAnsi"/>
-        </w:rPr>
-        <w:t>cUser</w:t>
-      </w:r>
-      <w:proofErr w:type="spellEnd"/>
-      <w:r>
-        <w:rPr>
-          <w:rFonts w:eastAsiaTheme="minorHAnsi"/>
-        </w:rPr>
-        <w:t xml:space="preserve"> property).</w:t>
-      </w:r>
-    </w:p>
-    <w:p>
-      <w:pPr>
-        <w:pStyle w:val="bullet"/>
-        <w:rPr>
-          <w:rFonts w:eastAsiaTheme="minorHAnsi"/>
-        </w:rPr>
-      </w:pPr>
-      <w:r>
-        <w:rPr>
-          <w:rFonts w:eastAsiaTheme="minorHAnsi"/>
-        </w:rPr>
-        <w:t>The error number, message, method, line number and source (</w:t>
-      </w:r>
-      <w:r>
-        <w:rPr>
-          <w:rFonts w:eastAsiaTheme="minorHAnsi"/>
-        </w:rPr>
-        <w:t>the latter two</w:t>
-      </w:r>
-      <w:r>
-        <w:rPr>
-          <w:rFonts w:eastAsiaTheme="minorHAnsi"/>
-        </w:rPr>
-        <w:t xml:space="preserve"> of which may </w:t>
-      </w:r>
-      <w:r>
-        <w:rPr>
-          <w:rFonts w:eastAsiaTheme="minorHAnsi"/>
-        </w:rPr>
-        <w:t xml:space="preserve">not </w:t>
-      </w:r>
-      <w:r>
-        <w:rPr>
-          <w:rFonts w:eastAsiaTheme="minorHAnsi"/>
-        </w:rPr>
-        <w:t>be available in a runtime environment)</w:t>
-      </w:r>
-      <w:r>
-        <w:rPr>
-          <w:rFonts w:eastAsiaTheme="minorHAnsi"/>
-        </w:rPr>
-        <w:t>.</w:t>
-      </w:r>
-    </w:p>
-    <w:p>
-      <w:pPr>
-        <w:pStyle w:val="bullet"/>
-        <w:rPr>
-          <w:rFonts w:eastAsiaTheme="minorHAnsi"/>
-        </w:rPr>
-      </w:pPr>
-      <w:r>
-        <w:rPr>
-          <w:rFonts w:eastAsiaTheme="minorHAnsi"/>
-        </w:rPr>
-        <w:t>Current alias.</w:t>
-      </w:r>
-    </w:p>
-    <w:p>
-      <w:pPr>
-        <w:pStyle w:val="bullet"/>
-        <w:rPr>
-          <w:rFonts w:eastAsiaTheme="minorHAnsi"/>
-        </w:rPr>
-      </w:pPr>
-      <w:r>
-        <w:rPr>
-          <w:rFonts w:eastAsiaTheme="minorHAnsi"/>
-        </w:rPr>
-        <w:t>Trigger type if an error occurred in a trigger.</w:t>
-      </w:r>
-    </w:p>
-    <w:p>
-      <w:pPr>
-        <w:pStyle w:val="bullet"/>
-        <w:rPr>
-          <w:rFonts w:eastAsiaTheme="minorHAnsi"/>
-        </w:rPr>
-      </w:pPr>
-      <w:r>
-        <w:rPr>
-          <w:rFonts w:eastAsiaTheme="minorHAnsi"/>
-        </w:rPr>
-        <w:t>The values of all relevant memory variables.</w:t>
-      </w:r>
-    </w:p>
-    <w:p>
-      <w:pPr>
-        <w:pStyle w:val="bullet"/>
-        <w:rPr>
-          <w:rFonts w:eastAsiaTheme="minorHAnsi"/>
-        </w:rPr>
-      </w:pPr>
-      <w:r>
-        <w:rPr>
-          <w:rFonts w:eastAsiaTheme="minorHAnsi"/>
-        </w:rPr>
-        <w:t xml:space="preserve">The call </w:t>
-      </w:r>
-      <w:proofErr w:type="gramStart"/>
-      <w:r>
-        <w:rPr>
-          <w:rFonts w:eastAsiaTheme="minorHAnsi"/>
-        </w:rPr>
-        <w:t>stack</w:t>
-      </w:r>
-      <w:proofErr w:type="gramEnd"/>
-      <w:r>
-        <w:rPr>
-          <w:rFonts w:eastAsiaTheme="minorHAnsi"/>
-        </w:rPr>
-        <w:t>.</w:t>
-      </w:r>
-    </w:p>
-    <w:p>
-      <w:pPr>
-        <w:pStyle w:val="bullet"/>
-        <w:rPr>
-          <w:rFonts w:eastAsiaTheme="minorHAnsi"/>
-        </w:rPr>
-      </w:pPr>
-      <w:r>
-        <w:rPr>
-          <w:rFonts w:eastAsiaTheme="minorHAnsi"/>
-        </w:rPr>
-        <w:t>The values of public properties for all accessible objects.</w:t>
-      </w:r>
-    </w:p>
-    <w:p>
-      <w:pPr>
-        <w:pStyle w:val="bullet"/>
-        <w:rPr>
-          <w:rFonts w:eastAsiaTheme="minorHAnsi"/>
-        </w:rPr>
-      </w:pPr>
-      <w:r>
-        <w:rPr>
-          <w:rFonts w:eastAsiaTheme="minorHAnsi"/>
-        </w:rPr>
-        <w:t>The text of LIST STATUS.</w:t>
+        </w:rPr>
+        <w:t xml:space="preserve">by adding the names of objects and properties to the </w:t>
+      </w:r>
+      <w:proofErr w:type="spellStart"/>
+      <w:r>
+        <w:rPr>
+          <w:rFonts w:eastAsiaTheme="minorHAnsi"/>
+        </w:rPr>
+        <w:t>cSkipNames</w:t>
+      </w:r>
+      <w:proofErr w:type="spellEnd"/>
+      <w:r>
+        <w:rPr>
+          <w:rFonts w:eastAsiaTheme="minorHAnsi"/>
+        </w:rPr>
+        <w:t xml:space="preserve"> property.</w:t>
       </w:r>
     </w:p>
     <w:p>
       <w:pPr>
         <w:pStyle w:val="bulletlast"/>
       </w:pPr>
-      <w:r>
-        <w:t>The contents of all Windows environment variables.</w:t>
-      </w:r>
-    </w:p>
-    <w:p>
-      <w:pPr>
-        <w:pStyle w:val="bodytext"/>
-        <w:rPr>
-          <w:rFonts w:eastAsiaTheme="minorHAnsi"/>
-        </w:rPr>
-      </w:pPr>
-      <w:r>
-        <w:rPr>
-          <w:rFonts w:eastAsiaTheme="minorHAnsi"/>
-        </w:rPr>
-        <w:t xml:space="preserve">The latter five items are handled by the by-now slightly misnamed </w:t>
-      </w:r>
-      <w:proofErr w:type="spellStart"/>
-      <w:r>
-        <w:rPr>
-          <w:rFonts w:eastAsiaTheme="minorHAnsi"/>
-        </w:rPr>
+      <w:proofErr w:type="spellStart"/>
+      <w:r>
+        <w:lastRenderedPageBreak/>
         <w:t>GetMemVars</w:t>
       </w:r>
       <w:proofErr w:type="spellEnd"/>
       <w:r>
-        <w:rPr>
-          <w:rFonts w:eastAsiaTheme="minorHAnsi"/>
-        </w:rPr>
-        <w:t xml:space="preserve"> method. Some interesting things about </w:t>
-      </w:r>
-      <w:proofErr w:type="spellStart"/>
-      <w:r>
-        <w:rPr>
-          <w:rFonts w:eastAsiaTheme="minorHAnsi"/>
-        </w:rPr>
-        <w:t>GetMemVars</w:t>
-      </w:r>
-      <w:proofErr w:type="spellEnd"/>
-      <w:r>
-        <w:rPr>
-          <w:rFonts w:eastAsiaTheme="minorHAnsi"/>
-        </w:rPr>
-        <w:t xml:space="preserve"> are:</w:t>
-      </w:r>
-    </w:p>
-    <w:p>
-      <w:pPr>
-        <w:pStyle w:val="bulletfirst"/>
-        <w:rPr>
-          <w:rFonts w:eastAsiaTheme="minorHAnsi"/>
-        </w:rPr>
-      </w:pPr>
-      <w:r>
-        <w:rPr>
-          <w:rFonts w:eastAsiaTheme="minorHAnsi"/>
-        </w:rPr>
-        <w:t xml:space="preserve">It uses an interesting capability of the LIST MEMORY function: it can “see” all variables in the application, including those declared LOCAL. This is very important </w:t>
-      </w:r>
-      <w:r>
-        <w:rPr>
-          <w:rFonts w:eastAsiaTheme="minorHAnsi"/>
-        </w:rPr>
-        <w:lastRenderedPageBreak/>
-        <w:t>because otherwise there’d be no way to know the values of those variables, which is a key thing when debugging an application.</w:t>
-      </w:r>
-    </w:p>
-    <w:p>
-      <w:pPr>
-        <w:pStyle w:val="bullet"/>
-        <w:rPr>
-          <w:rFonts w:eastAsiaTheme="minorHAnsi"/>
-        </w:rPr>
-      </w:pPr>
-      <w:proofErr w:type="spellStart"/>
-      <w:r>
-        <w:rPr>
-          <w:rFonts w:eastAsiaTheme="minorHAnsi"/>
-        </w:rPr>
-        <w:t>GetMemVars</w:t>
-      </w:r>
-      <w:proofErr w:type="spellEnd"/>
-      <w:r>
-        <w:rPr>
-          <w:rFonts w:eastAsiaTheme="minorHAnsi"/>
-        </w:rPr>
-        <w:t xml:space="preserve"> cleans up </w:t>
-      </w:r>
-      <w:r>
-        <w:rPr>
-          <w:rFonts w:eastAsiaTheme="minorHAnsi"/>
-        </w:rPr>
-        <w:t>some quirks LIST MEMORY has in formatting.</w:t>
-      </w:r>
-    </w:p>
-    <w:p>
-      <w:pPr>
-        <w:pStyle w:val="bullet"/>
-        <w:rPr>
-          <w:rFonts w:eastAsiaTheme="minorHAnsi"/>
-        </w:rPr>
-      </w:pPr>
-      <w:r>
-        <w:rPr>
-          <w:rFonts w:eastAsiaTheme="minorHAnsi"/>
-        </w:rPr>
-        <w:t>I don’t care about variables used in certain functions and methods, including those in the error handler itself, so those are removed from the list of variables.</w:t>
-      </w:r>
-      <w:r>
-        <w:rPr>
-          <w:rFonts w:eastAsiaTheme="minorHAnsi"/>
-        </w:rPr>
-        <w:t xml:space="preserve"> You can adapt that list as necessary</w:t>
-      </w:r>
-      <w:r>
-        <w:rPr>
-          <w:rFonts w:eastAsiaTheme="minorHAnsi"/>
-        </w:rPr>
-        <w:t xml:space="preserve"> by adding the names of variables to the </w:t>
-      </w:r>
-      <w:proofErr w:type="spellStart"/>
-      <w:r>
-        <w:rPr>
-          <w:rFonts w:eastAsiaTheme="minorHAnsi"/>
-        </w:rPr>
-        <w:t>cSkipNames</w:t>
-      </w:r>
-      <w:proofErr w:type="spellEnd"/>
-      <w:r>
-        <w:rPr>
-          <w:rFonts w:eastAsiaTheme="minorHAnsi"/>
-        </w:rPr>
-        <w:t xml:space="preserve"> property.</w:t>
-      </w:r>
-    </w:p>
-    <w:p>
-      <w:pPr>
-        <w:pStyle w:val="bullet"/>
-        <w:rPr>
-          <w:rFonts w:eastAsiaTheme="minorHAnsi"/>
-        </w:rPr>
-      </w:pPr>
-      <w:r>
-        <w:rPr>
-          <w:rFonts w:eastAsiaTheme="minorHAnsi"/>
-        </w:rPr>
-        <w:t xml:space="preserve">Under some conditions, LIST MEMORY causes a buffer overrun error. When she encountered this problem, Tamar </w:t>
-      </w:r>
-      <w:proofErr w:type="spellStart"/>
-      <w:r>
-        <w:rPr>
-          <w:rFonts w:eastAsiaTheme="minorHAnsi"/>
-        </w:rPr>
-        <w:t>Granor</w:t>
-      </w:r>
-      <w:proofErr w:type="spellEnd"/>
-      <w:r>
-        <w:rPr>
-          <w:rFonts w:eastAsiaTheme="minorHAnsi"/>
-        </w:rPr>
-        <w:t xml:space="preserve"> found that using LIST MEMORY LIKE A*, LIST MEMORY LIKE B*, etc. helped. If you encounter this when an error occurs in a particular section of code, you can set </w:t>
-      </w:r>
-      <w:proofErr w:type="spellStart"/>
-      <w:r>
-        <w:rPr>
-          <w:rFonts w:eastAsiaTheme="minorHAnsi"/>
-        </w:rPr>
-        <w:t>oError.lGetMemVars</w:t>
-      </w:r>
-      <w:proofErr w:type="spellEnd"/>
-      <w:r>
-        <w:rPr>
-          <w:rFonts w:eastAsiaTheme="minorHAnsi"/>
-        </w:rPr>
-        <w:t xml:space="preserve"> </w:t>
-      </w:r>
-      <w:proofErr w:type="gramStart"/>
-      <w:r>
-        <w:rPr>
-          <w:rFonts w:eastAsiaTheme="minorHAnsi"/>
-        </w:rPr>
-        <w:t>to .</w:t>
-      </w:r>
-      <w:proofErr w:type="gramEnd"/>
-      <w:r>
-        <w:rPr>
-          <w:rFonts w:eastAsiaTheme="minorHAnsi"/>
-        </w:rPr>
-        <w:t xml:space="preserve">F.; </w:t>
-      </w:r>
-      <w:proofErr w:type="spellStart"/>
-      <w:r>
-        <w:rPr>
-          <w:rFonts w:eastAsiaTheme="minorHAnsi"/>
-        </w:rPr>
-        <w:t>SFErrorMgr</w:t>
-      </w:r>
-      <w:proofErr w:type="spellEnd"/>
-      <w:r>
-        <w:rPr>
-          <w:rFonts w:eastAsiaTheme="minorHAnsi"/>
-        </w:rPr>
-        <w:t xml:space="preserve"> won’t use LIST MEMORY in that case.</w:t>
-      </w:r>
-    </w:p>
-    <w:p>
-      <w:pPr>
-        <w:pStyle w:val="bullet"/>
-        <w:rPr>
-          <w:rFonts w:eastAsiaTheme="minorHAnsi"/>
-        </w:rPr>
-      </w:pPr>
-      <w:r>
-        <w:rPr>
-          <w:rFonts w:eastAsiaTheme="minorHAnsi"/>
-        </w:rPr>
-        <w:t>Like LIST MEMORY, LIST OBJECTS can “see” objects contained in variables, even LOCAL ones, and it lists the values of all public properties of those objects. However, LIST OBJECTS can crash under some conditions, such as when accessing certain types of properties of COM objects, so the code using it is wrapped in a TRY.</w:t>
-      </w:r>
-      <w:r>
-        <w:rPr>
-          <w:rFonts w:eastAsiaTheme="minorHAnsi"/>
-        </w:rPr>
-        <w:t xml:space="preserve"> I’ve also run into issues with the Access method of properties causing a problem, so </w:t>
-      </w:r>
-      <w:proofErr w:type="spellStart"/>
-      <w:r>
-        <w:rPr>
-          <w:rFonts w:eastAsiaTheme="minorHAnsi"/>
-        </w:rPr>
-        <w:t>GetMemVars</w:t>
-      </w:r>
-      <w:proofErr w:type="spellEnd"/>
-      <w:r>
-        <w:rPr>
-          <w:rFonts w:eastAsiaTheme="minorHAnsi"/>
-        </w:rPr>
-        <w:t xml:space="preserve"> sets </w:t>
-      </w:r>
-      <w:proofErr w:type="spellStart"/>
-      <w:r>
-        <w:rPr>
-          <w:rFonts w:eastAsiaTheme="minorHAnsi"/>
-        </w:rPr>
-        <w:t>lGettingMemVars</w:t>
-      </w:r>
-      <w:proofErr w:type="spellEnd"/>
-      <w:r>
-        <w:rPr>
-          <w:rFonts w:eastAsiaTheme="minorHAnsi"/>
-        </w:rPr>
-        <w:t xml:space="preserve"> </w:t>
-      </w:r>
-      <w:proofErr w:type="gramStart"/>
-      <w:r>
-        <w:rPr>
-          <w:rFonts w:eastAsiaTheme="minorHAnsi"/>
-        </w:rPr>
-        <w:t>to .</w:t>
-      </w:r>
-      <w:proofErr w:type="gramEnd"/>
-      <w:r>
-        <w:rPr>
-          <w:rFonts w:eastAsiaTheme="minorHAnsi"/>
-        </w:rPr>
-        <w:t xml:space="preserve">T. before issuing the LIST OBJECTS command; problematic Access methods can then check </w:t>
-      </w:r>
-      <w:proofErr w:type="spellStart"/>
-      <w:r>
-        <w:rPr>
-          <w:rFonts w:eastAsiaTheme="minorHAnsi"/>
-        </w:rPr>
-        <w:t>oError.</w:t>
-      </w:r>
-      <w:r>
-        <w:rPr>
-          <w:rFonts w:eastAsiaTheme="minorHAnsi"/>
-        </w:rPr>
-        <w:t>lGettingMemVars</w:t>
-      </w:r>
-      <w:proofErr w:type="spellEnd"/>
-      <w:r>
-        <w:rPr>
-          <w:rFonts w:eastAsiaTheme="minorHAnsi"/>
-        </w:rPr>
-        <w:t xml:space="preserve"> if necessary.</w:t>
-      </w:r>
-    </w:p>
-    <w:p>
-      <w:pPr>
-        <w:pStyle w:val="bullet"/>
-        <w:rPr>
-          <w:rFonts w:eastAsiaTheme="minorHAnsi"/>
-        </w:rPr>
-      </w:pPr>
-      <w:r>
-        <w:rPr>
-          <w:rFonts w:eastAsiaTheme="minorHAnsi"/>
-        </w:rPr>
-        <w:t>Like variables, the code cleans up some formatting quirks</w:t>
-      </w:r>
-      <w:r>
-        <w:rPr>
-          <w:rFonts w:eastAsiaTheme="minorHAnsi"/>
-        </w:rPr>
-        <w:t xml:space="preserve"> with LIST OBJECTS</w:t>
-      </w:r>
-      <w:r>
-        <w:rPr>
-          <w:rFonts w:eastAsiaTheme="minorHAnsi"/>
-        </w:rPr>
-        <w:t xml:space="preserve"> and because there are some objects I don’t want listed, such as the error handler itself, it removes those</w:t>
-      </w:r>
-      <w:r>
-        <w:rPr>
-          <w:rFonts w:eastAsiaTheme="minorHAnsi"/>
-        </w:rPr>
-        <w:t xml:space="preserve"> from the listing. You can adapt that list of objects as necessary</w:t>
-      </w:r>
-      <w:r>
-        <w:rPr>
-          <w:rFonts w:eastAsiaTheme="minorHAnsi"/>
-        </w:rPr>
-        <w:t xml:space="preserve"> </w:t>
-      </w:r>
-      <w:r>
-        <w:rPr>
-          <w:rFonts w:eastAsiaTheme="minorHAnsi"/>
-        </w:rPr>
-        <w:t xml:space="preserve">by adding the names of </w:t>
-      </w:r>
-      <w:r>
-        <w:rPr>
-          <w:rFonts w:eastAsiaTheme="minorHAnsi"/>
-        </w:rPr>
-        <w:t xml:space="preserve">objects and properties </w:t>
-      </w:r>
-      <w:r>
-        <w:rPr>
-          <w:rFonts w:eastAsiaTheme="minorHAnsi"/>
-        </w:rPr>
-        <w:t xml:space="preserve">to the </w:t>
-      </w:r>
-      <w:proofErr w:type="spellStart"/>
-      <w:r>
-        <w:rPr>
-          <w:rFonts w:eastAsiaTheme="minorHAnsi"/>
-        </w:rPr>
-        <w:t>cSkipNames</w:t>
-      </w:r>
-      <w:proofErr w:type="spellEnd"/>
-      <w:r>
-        <w:rPr>
-          <w:rFonts w:eastAsiaTheme="minorHAnsi"/>
-        </w:rPr>
-        <w:t xml:space="preserve"> property.</w:t>
-      </w:r>
-    </w:p>
-    <w:p>
-      <w:pPr>
-        <w:pStyle w:val="bulletlast"/>
-      </w:pPr>
-      <w:proofErr w:type="spellStart"/>
-      <w:r>
-        <w:t>GetMemVars</w:t>
-      </w:r>
-      <w:proofErr w:type="spellEnd"/>
-      <w:r>
         <w:t xml:space="preserve"> retrieves the names and values of environment variables using WMI, thanks </w:t>
       </w:r>
       <w:r>
-        <w:t xml:space="preserve">to code written by Sergey </w:t>
-      </w:r>
-      <w:proofErr w:type="spellStart"/>
-      <w:r>
-        <w:t>Berezniker</w:t>
-      </w:r>
-      <w:proofErr w:type="spellEnd"/>
+        <w:t>to code written by Sergey Berezniker</w:t>
+      </w:r>
       <w:r>
         <w:t xml:space="preserve"> </w:t>
       </w:r>
@@ -7728,7 +7901,15 @@
       </w:r>
       <w:proofErr w:type="spellEnd"/>
       <w:r>
-        <w:t xml:space="preserve"> uses GDIPlusX to do the actual work.</w:t>
+        <w:t xml:space="preserve"> uses </w:t>
+      </w:r>
+      <w:proofErr w:type="spellStart"/>
+      <w:r>
+        <w:t>GDIPlusX</w:t>
+      </w:r>
+      <w:proofErr w:type="spellEnd"/>
+      <w:r>
+        <w:t xml:space="preserve"> to do the actual work.</w:t>
       </w:r>
     </w:p>
     <w:p>
@@ -8057,15 +8238,7 @@
           <w:rFonts w:eastAsiaTheme="minorHAnsi"/>
           <w:lang w:eastAsia="en-US"/>
         </w:rPr>
-        <w:t xml:space="preserve">, </w:t>
-      </w:r>
-      <w:r>
-        <w:rPr>
-          <w:rFonts w:eastAsiaTheme="minorHAnsi"/>
-          <w:lang w:eastAsia="en-US"/>
-        </w:rPr>
-        <w:lastRenderedPageBreak/>
-        <w:t xml:space="preserve">which is an abstract method </w:t>
+        <w:t xml:space="preserve">, which is an abstract method </w:t>
       </w:r>
       <w:proofErr w:type="gramStart"/>
       <w:r>
@@ -8676,6 +8849,7 @@
         <w:rPr>
           <w:rFonts w:eastAsiaTheme="minorHAnsi"/>
         </w:rPr>
+        <w:lastRenderedPageBreak/>
         <w:t>lcAPIKey = 'API</w:t>
       </w:r>
       <w:r>
@@ -8977,7 +9151,6 @@
         <w:rPr>
           <w:rFonts w:eastAsiaTheme="minorHAnsi"/>
         </w:rPr>
-        <w:lastRenderedPageBreak/>
         <w:t>* display the ticket number.</w:t>
       </w:r>
     </w:p>
@@ -9588,6 +9761,7 @@
           <w:rFonts w:eastAsiaTheme="minorHAnsi"/>
           <w:lang w:eastAsia="en-US"/>
         </w:rPr>
+        <w:lastRenderedPageBreak/>
         <w:t xml:space="preserve">If </w:t>
       </w:r>
       <w:proofErr w:type="spellStart"/>
@@ -10185,7 +10359,6 @@
         <w:rPr>
           <w:rFonts w:eastAsiaTheme="minorHAnsi"/>
         </w:rPr>
-        <w:lastRenderedPageBreak/>
         <w:t>Displaying the error to the user</w:t>
       </w:r>
       <w:bookmarkEnd w:id="7"/>
@@ -10292,19 +10465,33 @@
         <w:rPr>
           <w:rFonts w:eastAsiaTheme="minorHAnsi"/>
         </w:rPr>
-        <w:t xml:space="preserve"> is</w:t>
-      </w:r>
-      <w:r>
-        <w:rPr>
-          <w:rFonts w:eastAsiaTheme="minorHAnsi"/>
-        </w:rPr>
         <w:t xml:space="preserve"> </w:t>
       </w:r>
-      <w:r>
-        <w:rPr>
-          <w:rFonts w:eastAsiaTheme="minorHAnsi"/>
-        </w:rPr>
-        <w:t xml:space="preserve">.T.) by calling </w:t>
+      <w:proofErr w:type="gramStart"/>
+      <w:r>
+        <w:rPr>
+          <w:rFonts w:eastAsiaTheme="minorHAnsi"/>
+        </w:rPr>
+        <w:t>is</w:t>
+      </w:r>
+      <w:r>
+        <w:rPr>
+          <w:rFonts w:eastAsiaTheme="minorHAnsi"/>
+        </w:rPr>
+        <w:t xml:space="preserve"> </w:t>
+      </w:r>
+      <w:r>
+        <w:rPr>
+          <w:rFonts w:eastAsiaTheme="minorHAnsi"/>
+        </w:rPr>
+        <w:t>.</w:t>
+      </w:r>
+      <w:proofErr w:type="gramEnd"/>
+      <w:r>
+        <w:rPr>
+          <w:rFonts w:eastAsiaTheme="minorHAnsi"/>
+        </w:rPr>
+        <w:t xml:space="preserve">T.) by calling </w:t>
       </w:r>
       <w:proofErr w:type="spellStart"/>
       <w:r>
@@ -10705,6 +10892,7 @@
         <w:rPr>
           <w:rFonts w:eastAsiaTheme="minorHAnsi"/>
         </w:rPr>
+        <w:lastRenderedPageBreak/>
         <w:t xml:space="preserve">If the user clicks the Send button, the same mechanism described in the </w:t>
       </w:r>
       <w:r>
@@ -10993,7 +11181,6 @@
         <w:rPr>
           <w:noProof/>
         </w:rPr>
-        <w:lastRenderedPageBreak/>
         <w:drawing>
           <wp:inline distT="0" distB="0" distL="0" distR="0" wp14:anchorId="3BBB8424" wp14:editId="24C7AFA6">
             <wp:extent cx="5943600" cy="1793240"/>
@@ -11171,7 +11358,21 @@
         <w:rPr>
           <w:rFonts w:eastAsiaTheme="minorHAnsi"/>
         </w:rPr>
-        <w:t xml:space="preserve"> decides what to do based on the action the user chose:</w:t>
+        <w:t xml:space="preserve"> decides what to do based on the action the user </w:t>
+      </w:r>
+      <w:proofErr w:type="gramStart"/>
+      <w:r>
+        <w:rPr>
+          <w:rFonts w:eastAsiaTheme="minorHAnsi"/>
+        </w:rPr>
+        <w:t>chose</w:t>
+      </w:r>
+      <w:proofErr w:type="gramEnd"/>
+      <w:r>
+        <w:rPr>
+          <w:rFonts w:eastAsiaTheme="minorHAnsi"/>
+        </w:rPr>
+        <w:t>:</w:t>
       </w:r>
     </w:p>
     <w:p>
@@ -11273,6 +11474,7 @@
         <w:rPr>
           <w:rFonts w:eastAsiaTheme="minorHAnsi"/>
         </w:rPr>
+        <w:lastRenderedPageBreak/>
         <w:t xml:space="preserve">If the </w:t>
       </w:r>
       <w:r>
@@ -11566,108 +11768,354 @@
         <w:pStyle w:val="bulletlast"/>
       </w:pPr>
       <w:r>
+        <w:t xml:space="preserve">For “Quit” in a runtime environment, the code calls </w:t>
+      </w:r>
+      <w:proofErr w:type="spellStart"/>
+      <w:r>
+        <w:t>RevertAllTables</w:t>
+      </w:r>
+      <w:proofErr w:type="spellEnd"/>
+      <w:r>
+        <w:t xml:space="preserve"> as described earlier, issues ON SHUTDOWN and CLEAR EVENTS to prepare for shutting down the </w:t>
+      </w:r>
+      <w:proofErr w:type="gramStart"/>
+      <w:r>
+        <w:t>application, and</w:t>
+      </w:r>
+      <w:proofErr w:type="gramEnd"/>
+      <w:r>
+        <w:t xml:space="preserve"> then sets a flag to return to the top-most program in the call stack.</w:t>
+      </w:r>
+    </w:p>
+    <w:p>
+      <w:pPr>
+        <w:pStyle w:val="bodytext"/>
+        <w:rPr>
+          <w:rFonts w:eastAsiaTheme="minorHAnsi"/>
+        </w:rPr>
+      </w:pPr>
+      <w:r>
+        <w:rPr>
+          <w:rFonts w:eastAsiaTheme="minorHAnsi"/>
+        </w:rPr>
+        <w:t xml:space="preserve">The actual error </w:t>
+      </w:r>
+      <w:r>
+        <w:rPr>
+          <w:rFonts w:eastAsiaTheme="minorHAnsi"/>
+        </w:rPr>
+        <w:t xml:space="preserve">recovery </w:t>
+      </w:r>
+      <w:r>
+        <w:rPr>
+          <w:rFonts w:eastAsiaTheme="minorHAnsi"/>
+        </w:rPr>
+        <w:t>is a little complicated</w:t>
+      </w:r>
+      <w:r>
+        <w:rPr>
+          <w:rFonts w:eastAsiaTheme="minorHAnsi"/>
+        </w:rPr>
+        <w:t>. Normally, we’d do one of a few things:</w:t>
+      </w:r>
+    </w:p>
+    <w:p>
+      <w:pPr>
+        <w:pStyle w:val="bulletfirst"/>
+        <w:rPr>
+          <w:rFonts w:eastAsiaTheme="minorHAnsi"/>
+        </w:rPr>
+      </w:pPr>
+      <w:r>
+        <w:rPr>
+          <w:rFonts w:eastAsiaTheme="minorHAnsi"/>
+        </w:rPr>
+        <w:t xml:space="preserve">If we’re supposed to continue in the program, use RETURN TO </w:t>
+      </w:r>
+      <w:proofErr w:type="spellStart"/>
+      <w:r>
+        <w:rPr>
+          <w:rFonts w:eastAsiaTheme="minorHAnsi"/>
+          <w:i/>
+        </w:rPr>
+        <w:t>SomeMethod</w:t>
+      </w:r>
+      <w:proofErr w:type="spellEnd"/>
+      <w:r>
+        <w:rPr>
+          <w:rFonts w:eastAsiaTheme="minorHAnsi"/>
+        </w:rPr>
+        <w:t xml:space="preserve">, where </w:t>
+      </w:r>
+      <w:proofErr w:type="spellStart"/>
+      <w:r>
+        <w:rPr>
+          <w:rFonts w:eastAsiaTheme="minorHAnsi"/>
+          <w:i/>
+        </w:rPr>
+        <w:t>SomeMethod</w:t>
+      </w:r>
+      <w:proofErr w:type="spellEnd"/>
+      <w:r>
+        <w:rPr>
+          <w:rFonts w:eastAsiaTheme="minorHAnsi"/>
+        </w:rPr>
+        <w:t xml:space="preserve"> is the name of the routine where READ EVENTS exists. This has the effect of unwinding the call stack that caused </w:t>
+      </w:r>
+      <w:proofErr w:type="gramStart"/>
+      <w:r>
+        <w:rPr>
+          <w:rFonts w:eastAsiaTheme="minorHAnsi"/>
+        </w:rPr>
+        <w:t>the</w:t>
+      </w:r>
+      <w:proofErr w:type="gramEnd"/>
+      <w:r>
+        <w:rPr>
+          <w:rFonts w:eastAsiaTheme="minorHAnsi"/>
+        </w:rPr>
+        <w:t xml:space="preserve"> error to </w:t>
+      </w:r>
+      <w:proofErr w:type="gramStart"/>
+      <w:r>
+        <w:rPr>
+          <w:rFonts w:eastAsiaTheme="minorHAnsi"/>
+        </w:rPr>
+        <w:t>occur</w:t>
+      </w:r>
+      <w:proofErr w:type="gramEnd"/>
+      <w:r>
+        <w:rPr>
+          <w:rFonts w:eastAsiaTheme="minorHAnsi"/>
+        </w:rPr>
+        <w:t xml:space="preserve"> and the application is sitting in the event loop, waiting for the next action by the user.</w:t>
+      </w:r>
+    </w:p>
+    <w:p>
+      <w:pPr>
+        <w:pStyle w:val="bulletlast"/>
+      </w:pPr>
+      <w:r>
+        <w:t>If we’re supposed to quit the application, use RETURN TO MASTER to unwind the call stack and go back to the top-level program so we can do an orderly shutdown.</w:t>
+      </w:r>
+    </w:p>
+    <w:p>
+      <w:pPr>
+        <w:pStyle w:val="bodytext"/>
+      </w:pPr>
+      <w:r>
+        <w:t>As discussed earlier, RETURN TO can’t be used if there’s a TRY structure on the call stack. In that case, the only thing we can do is cancel or quit the program.</w:t>
+      </w:r>
+    </w:p>
+    <w:p>
+      <w:pPr>
+        <w:pStyle w:val="bodytext"/>
+      </w:pPr>
+      <w:r>
+        <w:t xml:space="preserve">The code at the end of </w:t>
+      </w:r>
+      <w:proofErr w:type="spellStart"/>
+      <w:r>
+        <w:t>ErrorHandler</w:t>
+      </w:r>
+      <w:proofErr w:type="spellEnd"/>
+      <w:r>
+        <w:t xml:space="preserve"> does one of the following things:</w:t>
+      </w:r>
+    </w:p>
+    <w:p>
+      <w:pPr>
+        <w:pStyle w:val="bulletfirst"/>
+      </w:pPr>
+      <w:r>
+        <w:t xml:space="preserve">If we’re inside a TRY or the error occurred in the startup program at runtime, call </w:t>
+      </w:r>
+      <w:proofErr w:type="spellStart"/>
+      <w:r>
+        <w:t>ImmediateExit</w:t>
+      </w:r>
+      <w:proofErr w:type="spellEnd"/>
+      <w:r>
+        <w:t>, which closes all forms, releases all global objects, closes all procedure and library files, does other cleanup, and terminates the program with either CANCEL (</w:t>
+      </w:r>
+      <w:r>
+        <w:t xml:space="preserve">when </w:t>
+      </w:r>
+      <w:r>
+        <w:t>running in the IDE) or the</w:t>
+      </w:r>
+      <w:r>
+        <w:t xml:space="preserve"> </w:t>
+      </w:r>
+      <w:proofErr w:type="spellStart"/>
+      <w:r>
+        <w:t>ExitProcess</w:t>
+      </w:r>
+      <w:proofErr w:type="spellEnd"/>
+      <w:r>
+        <w:t xml:space="preserve"> Windows API function</w:t>
+      </w:r>
+      <w:r>
+        <w:t xml:space="preserve"> (when running an executable)</w:t>
+      </w:r>
+      <w:r>
+        <w:t>, which returns an error code (discuss</w:t>
+      </w:r>
+      <w:r>
+        <w:t>ed</w:t>
+      </w:r>
+      <w:r>
+        <w:t xml:space="preserve"> in more detail later).</w:t>
+      </w:r>
+    </w:p>
+    <w:p>
+      <w:pPr>
+        <w:pStyle w:val="bullet"/>
+      </w:pPr>
+      <w:r>
+        <w:t>If we’re supposed to continue in the program, do some cleanup and then RETURN TO the routine containing the READ EVENT</w:t>
+      </w:r>
+      <w:r>
+        <w:t>S statement</w:t>
+      </w:r>
+      <w:r>
+        <w:t>.</w:t>
+      </w:r>
+    </w:p>
+    <w:p>
+      <w:pPr>
+        <w:pStyle w:val="bulletlast"/>
+      </w:pPr>
+      <w:r>
+        <w:t xml:space="preserve">If </w:t>
+      </w:r>
+      <w:r>
+        <w:t>none</w:t>
+      </w:r>
+      <w:r>
+        <w:t xml:space="preserve"> of the above </w:t>
+      </w:r>
+      <w:r>
+        <w:t>is</w:t>
+      </w:r>
+      <w:r>
+        <w:t xml:space="preserve"> done, do some cleanup and RETURN TO </w:t>
+      </w:r>
+      <w:r>
+        <w:t xml:space="preserve">the routine specified in the </w:t>
+      </w:r>
+      <w:proofErr w:type="spellStart"/>
+      <w:r>
+        <w:t>cReturnToOnQuit</w:t>
+      </w:r>
+      <w:proofErr w:type="spellEnd"/>
+      <w:r>
+        <w:t xml:space="preserve"> property to shut down the program in an orderly manner</w:t>
+      </w:r>
+      <w:r>
+        <w:t>.</w:t>
+      </w:r>
+    </w:p>
+    <w:p>
+      <w:pPr>
+        <w:pStyle w:val="Heading1"/>
+      </w:pPr>
+      <w:r>
         <w:lastRenderedPageBreak/>
-        <w:t xml:space="preserve">For “Quit” in a runtime environment, the code calls </w:t>
-      </w:r>
-      <w:proofErr w:type="spellStart"/>
-      <w:r>
-        <w:t>RevertAllTables</w:t>
-      </w:r>
-      <w:proofErr w:type="spellEnd"/>
-      <w:r>
-        <w:t xml:space="preserve"> as described earlier, issues ON SHUTDOWN and CLEAR EVENTS to prepare for shutting down the application, and then sets a flag to return to the top-most program in the call stack.</w:t>
+        <w:t>Returning an error code</w:t>
       </w:r>
     </w:p>
     <w:p>
       <w:pPr>
         <w:pStyle w:val="bodytext"/>
-        <w:rPr>
-          <w:rFonts w:eastAsiaTheme="minorHAnsi"/>
-        </w:rPr>
-      </w:pPr>
-      <w:r>
-        <w:rPr>
-          <w:rFonts w:eastAsiaTheme="minorHAnsi"/>
-        </w:rPr>
-        <w:t xml:space="preserve">The actual error </w:t>
-      </w:r>
-      <w:r>
-        <w:rPr>
-          <w:rFonts w:eastAsiaTheme="minorHAnsi"/>
-        </w:rPr>
-        <w:t xml:space="preserve">recovery </w:t>
-      </w:r>
-      <w:r>
-        <w:rPr>
-          <w:rFonts w:eastAsiaTheme="minorHAnsi"/>
-        </w:rPr>
-        <w:t>is a little complicated</w:t>
-      </w:r>
-      <w:r>
-        <w:rPr>
-          <w:rFonts w:eastAsiaTheme="minorHAnsi"/>
-        </w:rPr>
-        <w:t>. Normally, we’d do one of a few things:</w:t>
-      </w:r>
-    </w:p>
-    <w:p>
-      <w:pPr>
-        <w:pStyle w:val="bulletfirst"/>
-        <w:rPr>
-          <w:rFonts w:eastAsiaTheme="minorHAnsi"/>
-        </w:rPr>
-      </w:pPr>
-      <w:r>
-        <w:rPr>
-          <w:rFonts w:eastAsiaTheme="minorHAnsi"/>
-        </w:rPr>
-        <w:t xml:space="preserve">If we’re supposed to continue in the program, use RETURN TO </w:t>
-      </w:r>
-      <w:proofErr w:type="spellStart"/>
-      <w:r>
-        <w:rPr>
-          <w:rFonts w:eastAsiaTheme="minorHAnsi"/>
-          <w:i/>
-        </w:rPr>
-        <w:t>SomeMethod</w:t>
-      </w:r>
-      <w:proofErr w:type="spellEnd"/>
-      <w:r>
-        <w:rPr>
-          <w:rFonts w:eastAsiaTheme="minorHAnsi"/>
-        </w:rPr>
-        <w:t xml:space="preserve">, where </w:t>
-      </w:r>
-      <w:proofErr w:type="spellStart"/>
-      <w:r>
-        <w:rPr>
-          <w:rFonts w:eastAsiaTheme="minorHAnsi"/>
-          <w:i/>
-        </w:rPr>
-        <w:t>SomeMethod</w:t>
-      </w:r>
-      <w:proofErr w:type="spellEnd"/>
-      <w:r>
-        <w:rPr>
-          <w:rFonts w:eastAsiaTheme="minorHAnsi"/>
-        </w:rPr>
-        <w:t xml:space="preserve"> is the name of the routine where READ EVENTS exists. This has the effect of unwinding the call stack that caused the error to occur and the application is sitting in the event loop, waiting for the next action by the user.</w:t>
-      </w:r>
-    </w:p>
-    <w:p>
-      <w:pPr>
-        <w:pStyle w:val="bulletlast"/>
-      </w:pPr>
-      <w:r>
-        <w:t>If we’re supposed to quit the application, use RETURN TO MASTER to unwind the call stack and go back to the top-level program so we can do an orderly shutdown.</w:t>
+      </w:pPr>
+      <w:r>
+        <w:t xml:space="preserve">While a function or method can return a value to the caller, </w:t>
+      </w:r>
+      <w:r>
+        <w:t xml:space="preserve">a VFP executable normally </w:t>
+      </w:r>
+      <w:r>
+        <w:t>can’t. So, if you</w:t>
+      </w:r>
+      <w:r>
+        <w:t>r application was launched from another application, such as the Windows Task Scheduler, and you</w:t>
+      </w:r>
+      <w:r>
+        <w:t xml:space="preserve"> want to </w:t>
+      </w:r>
+      <w:r>
+        <w:t xml:space="preserve">tell that application </w:t>
+      </w:r>
+      <w:r>
+        <w:t xml:space="preserve">whether </w:t>
+      </w:r>
+      <w:r>
+        <w:t>your</w:t>
+      </w:r>
+      <w:r>
+        <w:t xml:space="preserve"> application succeeded or terminated with an error, you need some way to </w:t>
+      </w:r>
+      <w:r>
+        <w:t xml:space="preserve">send </w:t>
+      </w:r>
+      <w:r>
+        <w:t xml:space="preserve">that to the caller. One way is to terminate the application using the </w:t>
+      </w:r>
+      <w:proofErr w:type="spellStart"/>
+      <w:r>
+        <w:t>ExitProcess</w:t>
+      </w:r>
+      <w:proofErr w:type="spellEnd"/>
+      <w:r>
+        <w:t xml:space="preserve"> Windows API</w:t>
+      </w:r>
+      <w:r>
+        <w:t xml:space="preserve"> function. </w:t>
+      </w:r>
+      <w:r>
+        <w:t>The function returns an exit code the other application can use; 0 means the application succeeded.</w:t>
       </w:r>
     </w:p>
     <w:p>
       <w:pPr>
         <w:pStyle w:val="bodytext"/>
       </w:pPr>
-      <w:r>
-        <w:t>As discussed earlier, RETURN TO can’t be used if there’s a TRY structure on the call stack. In that case, the only thing we can do is cancel or quit the program.</w:t>
+      <w:proofErr w:type="spellStart"/>
+      <w:r>
+        <w:t>ExitProcess</w:t>
+      </w:r>
+      <w:proofErr w:type="spellEnd"/>
+      <w:r>
+        <w:t xml:space="preserve"> is easy to use:</w:t>
+      </w:r>
+    </w:p>
+    <w:p>
+      <w:pPr>
+        <w:pStyle w:val="codefirstline"/>
+        <w:rPr>
+          <w:rFonts w:eastAsiaTheme="minorHAnsi"/>
+        </w:rPr>
+      </w:pPr>
+      <w:r>
+        <w:rPr>
+          <w:rFonts w:eastAsiaTheme="minorHAnsi"/>
+        </w:rPr>
+        <w:t>declare ExitProcess in Win32API integer ExitCode</w:t>
+      </w:r>
+    </w:p>
+    <w:p>
+      <w:pPr>
+        <w:pStyle w:val="codelastline"/>
+        <w:rPr>
+          <w:rFonts w:eastAsiaTheme="minorHAnsi"/>
+        </w:rPr>
+      </w:pPr>
+      <w:r>
+        <w:rPr>
+          <w:rFonts w:eastAsiaTheme="minorHAnsi"/>
+        </w:rPr>
+        <w:t>ExitProcess(lnReturnCode)</w:t>
       </w:r>
     </w:p>
     <w:p>
@@ -11675,23 +12123,7 @@
         <w:pStyle w:val="bodytext"/>
       </w:pPr>
       <w:r>
-        <w:t xml:space="preserve">The code at the end of </w:t>
-      </w:r>
-      <w:proofErr w:type="spellStart"/>
-      <w:r>
-        <w:t>ErrorHandler</w:t>
-      </w:r>
-      <w:proofErr w:type="spellEnd"/>
-      <w:r>
-        <w:t xml:space="preserve"> does one of the following things:</w:t>
-      </w:r>
-    </w:p>
-    <w:p>
-      <w:pPr>
-        <w:pStyle w:val="bulletfirst"/>
-      </w:pPr>
-      <w:r>
-        <w:t xml:space="preserve">If we’re inside a TRY or the error occurred in the startup program at runtime, call </w:t>
+        <w:t xml:space="preserve">However, since it terminates the application immediately, be sure to do this as the last thing in your application. If you look at the </w:t>
       </w:r>
       <w:proofErr w:type="spellStart"/>
       <w:r>
@@ -11699,200 +12131,6 @@
       </w:r>
       <w:proofErr w:type="spellEnd"/>
       <w:r>
-        <w:t>, which closes all forms, releases all global objects, closes all procedure and library files, does other cleanup, and terminates the program with either CANCEL (</w:t>
-      </w:r>
-      <w:r>
-        <w:t xml:space="preserve">when </w:t>
-      </w:r>
-      <w:r>
-        <w:t>running in the IDE) or the</w:t>
-      </w:r>
-      <w:r>
-        <w:t xml:space="preserve"> </w:t>
-      </w:r>
-      <w:proofErr w:type="spellStart"/>
-      <w:r>
-        <w:t>ExitProcess</w:t>
-      </w:r>
-      <w:proofErr w:type="spellEnd"/>
-      <w:r>
-        <w:t xml:space="preserve"> Windows API function</w:t>
-      </w:r>
-      <w:r>
-        <w:t xml:space="preserve"> (when running an executable)</w:t>
-      </w:r>
-      <w:r>
-        <w:t>, which returns an error code (discuss</w:t>
-      </w:r>
-      <w:r>
-        <w:t>ed</w:t>
-      </w:r>
-      <w:r>
-        <w:t xml:space="preserve"> in more detail later).</w:t>
-      </w:r>
-    </w:p>
-    <w:p>
-      <w:pPr>
-        <w:pStyle w:val="bullet"/>
-      </w:pPr>
-      <w:r>
-        <w:t>If we’re supposed to continue in the program, do some cleanup and then RETURN TO the routine containing the READ EVENT</w:t>
-      </w:r>
-      <w:r>
-        <w:t>S statement</w:t>
-      </w:r>
-      <w:r>
-        <w:t>.</w:t>
-      </w:r>
-    </w:p>
-    <w:p>
-      <w:pPr>
-        <w:pStyle w:val="bulletlast"/>
-      </w:pPr>
-      <w:r>
-        <w:t xml:space="preserve">If </w:t>
-      </w:r>
-      <w:r>
-        <w:t>none</w:t>
-      </w:r>
-      <w:r>
-        <w:t xml:space="preserve"> of the above </w:t>
-      </w:r>
-      <w:r>
-        <w:t>is</w:t>
-      </w:r>
-      <w:r>
-        <w:t xml:space="preserve"> done, do some cleanup and RETURN TO </w:t>
-      </w:r>
-      <w:r>
-        <w:t xml:space="preserve">the routine specified in the </w:t>
-      </w:r>
-      <w:proofErr w:type="spellStart"/>
-      <w:r>
-        <w:t>cReturnToOnQuit</w:t>
-      </w:r>
-      <w:proofErr w:type="spellEnd"/>
-      <w:r>
-        <w:t xml:space="preserve"> property to shut down the program in an orderly manner</w:t>
-      </w:r>
-      <w:r>
-        <w:t>.</w:t>
-      </w:r>
-    </w:p>
-    <w:p>
-      <w:pPr>
-        <w:pStyle w:val="Heading1"/>
-      </w:pPr>
-      <w:r>
-        <w:t>Returning an error code</w:t>
-      </w:r>
-    </w:p>
-    <w:p>
-      <w:pPr>
-        <w:pStyle w:val="bodytext"/>
-      </w:pPr>
-      <w:r>
-        <w:t xml:space="preserve">While a function or method can return a value to the caller, </w:t>
-      </w:r>
-      <w:r>
-        <w:t xml:space="preserve">a VFP executable normally </w:t>
-      </w:r>
-      <w:r>
-        <w:t>can’t. So, if you</w:t>
-      </w:r>
-      <w:r>
-        <w:t>r application was launched from another application, such as the Windows Task Scheduler, and you</w:t>
-      </w:r>
-      <w:r>
-        <w:t xml:space="preserve"> want to </w:t>
-      </w:r>
-      <w:r>
-        <w:t xml:space="preserve">tell that application </w:t>
-      </w:r>
-      <w:r>
-        <w:t xml:space="preserve">whether </w:t>
-      </w:r>
-      <w:r>
-        <w:t>your</w:t>
-      </w:r>
-      <w:r>
-        <w:t xml:space="preserve"> application succeeded or terminated with an error, you need some way to </w:t>
-      </w:r>
-      <w:r>
-        <w:t xml:space="preserve">send </w:t>
-      </w:r>
-      <w:r>
-        <w:t xml:space="preserve">that to the caller. One way is to terminate the application using the </w:t>
-      </w:r>
-      <w:proofErr w:type="spellStart"/>
-      <w:r>
-        <w:t>ExitProcess</w:t>
-      </w:r>
-      <w:proofErr w:type="spellEnd"/>
-      <w:r>
-        <w:t xml:space="preserve"> Windows API</w:t>
-      </w:r>
-      <w:r>
-        <w:t xml:space="preserve"> function. </w:t>
-      </w:r>
-      <w:r>
-        <w:t>The function returns an exit code the other application can use; 0 means the application succeeded.</w:t>
-      </w:r>
-    </w:p>
-    <w:p>
-      <w:pPr>
-        <w:pStyle w:val="bodytext"/>
-      </w:pPr>
-      <w:proofErr w:type="spellStart"/>
-      <w:r>
-        <w:t>ExitProcess</w:t>
-      </w:r>
-      <w:proofErr w:type="spellEnd"/>
-      <w:r>
-        <w:t xml:space="preserve"> is easy to use:</w:t>
-      </w:r>
-    </w:p>
-    <w:p>
-      <w:pPr>
-        <w:pStyle w:val="codefirstline"/>
-        <w:rPr>
-          <w:rFonts w:eastAsiaTheme="minorHAnsi"/>
-        </w:rPr>
-      </w:pPr>
-      <w:r>
-        <w:rPr>
-          <w:rFonts w:eastAsiaTheme="minorHAnsi"/>
-        </w:rPr>
-        <w:t>declare ExitProcess in Win32API integer ExitCode</w:t>
-      </w:r>
-    </w:p>
-    <w:p>
-      <w:pPr>
-        <w:pStyle w:val="codelastline"/>
-        <w:rPr>
-          <w:rFonts w:eastAsiaTheme="minorHAnsi"/>
-        </w:rPr>
-      </w:pPr>
-      <w:r>
-        <w:rPr>
-          <w:rFonts w:eastAsiaTheme="minorHAnsi"/>
-        </w:rPr>
-        <w:t>ExitProcess(lnReturnCode)</w:t>
-      </w:r>
-    </w:p>
-    <w:p>
-      <w:pPr>
-        <w:pStyle w:val="bodytext"/>
-      </w:pPr>
-      <w:r>
-        <w:t xml:space="preserve">However, since it terminates the application immediately, be sure to do this as the last thing in your application. If you look at the </w:t>
-      </w:r>
-      <w:proofErr w:type="spellStart"/>
-      <w:r>
-        <w:t>ImmediateExit</w:t>
-      </w:r>
-      <w:proofErr w:type="spellEnd"/>
-      <w:r>
         <w:t xml:space="preserve"> method of </w:t>
       </w:r>
       <w:proofErr w:type="spellStart"/>
@@ -11904,16 +12142,7 @@
         <w:t xml:space="preserve">, you’ll see </w:t>
       </w:r>
       <w:r>
-        <w:lastRenderedPageBreak/>
-        <w:t xml:space="preserve">it </w:t>
-      </w:r>
-      <w:proofErr w:type="gramStart"/>
-      <w:r>
-        <w:t>calls</w:t>
-      </w:r>
-      <w:proofErr w:type="gramEnd"/>
-      <w:r>
-        <w:t xml:space="preserve"> </w:t>
+        <w:t xml:space="preserve">it calls </w:t>
       </w:r>
       <w:proofErr w:type="spellStart"/>
       <w:r>
@@ -12110,7 +12339,15 @@
       </w:r>
       <w:proofErr w:type="spellEnd"/>
       <w:r>
-        <w:t xml:space="preserve"> method instantiates a form class, which fails when loading the class (otherwise the error would have occurring in a method of the class). “Class not registered” means an ActiveX control on the form isn’t registered on the user’s system. A quick check of the controls on the form tells me it’s TaskScheduler.dll that for some reason isn’t registered, so using RegSvr32 fixed the problem.</w:t>
+        <w:t xml:space="preserve"> method instantiates a form class, which fails when loading the class (otherwise the error would have </w:t>
+      </w:r>
+      <w:proofErr w:type="gramStart"/>
+      <w:r>
+        <w:t>occurring</w:t>
+      </w:r>
+      <w:proofErr w:type="gramEnd"/>
+      <w:r>
+        <w:t xml:space="preserve"> in a method of the class). “Class not registered” means an ActiveX control on the form isn’t registered on the user’s system. A quick check of the controls on the form tells me it’s TaskScheduler.dll that for some reason isn’t registered, so using RegSvr32 fixed the problem.</w:t>
       </w:r>
     </w:p>
     <w:p>
@@ -12162,6 +12399,7 @@
         <w:pStyle w:val="indented"/>
       </w:pPr>
       <w:r>
+        <w:lastRenderedPageBreak/>
         <w:t xml:space="preserve">Looking at the Decrypt method, I see a call to a Decrypt function. However, that function is </w:t>
       </w:r>
       <w:proofErr w:type="gramStart"/>
@@ -12271,11 +12509,7 @@
       </w:r>
       <w:proofErr w:type="spellEnd"/>
       <w:r>
-        <w:t xml:space="preserve"> was set to “Z:\Data\Export.csv.” The user used to have a drive mapping for Z: but doesn’t </w:t>
-      </w:r>
-      <w:r>
-        <w:lastRenderedPageBreak/>
-        <w:t>anymore, hence the error.</w:t>
+        <w:t xml:space="preserve"> was set to “Z:\Data\Export.csv.” The user used to have a drive mapping for Z: but doesn’t anymore, hence the error.</w:t>
       </w:r>
       <w:r>
         <w:t xml:space="preserve"> The immediate solution is to tell the user to use a different path, but this also gives us an opportunity to improve the error handling of the application: rather than letting the user get the “red error dialog,” we could test whether the specified path is valid and display an appropriate warning message if not.</w:t>
@@ -12403,7 +12637,15 @@
         <w:pStyle w:val="bullet"/>
       </w:pPr>
       <w:r>
-        <w:t>Unless you’re running the application in the IDE or had Debug Info turned on when you built the EXE (which make</w:t>
+        <w:t xml:space="preserve">Unless you’re running the application in the IDE or </w:t>
+      </w:r>
+      <w:proofErr w:type="gramStart"/>
+      <w:r>
+        <w:t>had</w:t>
+      </w:r>
+      <w:proofErr w:type="gramEnd"/>
+      <w:r>
+        <w:t xml:space="preserve"> Debug Info turned on when you built the EXE (which make</w:t>
       </w:r>
       <w:r>
         <w:t>s</w:t>
@@ -12435,7 +12677,15 @@
       </w:r>
       <w:proofErr w:type="gramEnd"/>
       <w:r>
-        <w:t>F. probably weren’t touched (they’re .F. because the LOCAL statement that declared them made them logical by default)</w:t>
+        <w:t>F. probably weren’t touched (</w:t>
+      </w:r>
+      <w:proofErr w:type="gramStart"/>
+      <w:r>
+        <w:t>they’re .</w:t>
+      </w:r>
+      <w:proofErr w:type="gramEnd"/>
+      <w:r>
+        <w:t>F. because the LOCAL statement that declared them made them logical by default)</w:t>
       </w:r>
       <w:r>
         <w:t>, so I know execution didn’t get to the point where those</w:t>
@@ -12476,6 +12726,7 @@
         <w:pStyle w:val="code"/>
       </w:pPr>
       <w:r>
+        <w:lastRenderedPageBreak/>
         <w:tab/>
       </w:r>
       <w:r>
@@ -12598,15 +12849,19 @@
         <w:t>)</w:t>
       </w:r>
       <w:r>
-        <w:t>, which I’ve assigned a hotkey to.</w:t>
-      </w:r>
+        <w:t xml:space="preserve">, which I’ve assigned a </w:t>
+      </w:r>
+      <w:proofErr w:type="gramStart"/>
+      <w:r>
+        <w:t>hotkey to.</w:t>
+      </w:r>
+      <w:proofErr w:type="gramEnd"/>
     </w:p>
     <w:p>
       <w:pPr>
         <w:pStyle w:val="bullet"/>
       </w:pPr>
       <w:r>
-        <w:lastRenderedPageBreak/>
         <w:t>Because LIST OBJECTS only shows objects stored in memory variables, you can’t see the values of properties of objects that are contained in properties of objects. For example, suppose you have a</w:t>
       </w:r>
       <w:r>
@@ -12790,6 +13045,7 @@
         <w:pStyle w:val="bulletlast"/>
       </w:pPr>
       <w:r>
+        <w:lastRenderedPageBreak/>
         <w:t>Sometimes the cause of an error can be far removed from where the error happens. Here’s part of an error log we received recently:</w:t>
       </w:r>
     </w:p>
@@ -12933,7 +13189,6 @@
         <w:rPr>
           <w:rFonts w:eastAsiaTheme="minorHAnsi"/>
         </w:rPr>
-        <w:lastRenderedPageBreak/>
         <w:tab/>
         <w:t>do case</w:t>
       </w:r>
@@ -13524,14 +13779,28 @@
         <w:rPr>
           <w:rFonts w:eastAsiaTheme="minorHAnsi"/>
         </w:rPr>
-        <w:t xml:space="preserve"> is empty. In fact, that’s the cause of the error: the IF statement right after the loop blows up because</w:t>
-      </w:r>
-      <w:r>
-        <w:rPr>
-          <w:rFonts w:eastAsiaTheme="minorHAnsi"/>
-        </w:rPr>
         <w:t xml:space="preserve"> </w:t>
       </w:r>
+      <w:proofErr w:type="gramStart"/>
+      <w:r>
+        <w:rPr>
+          <w:rFonts w:eastAsiaTheme="minorHAnsi"/>
+        </w:rPr>
+        <w:t>is</w:t>
+      </w:r>
+      <w:proofErr w:type="gramEnd"/>
+      <w:r>
+        <w:rPr>
+          <w:rFonts w:eastAsiaTheme="minorHAnsi"/>
+        </w:rPr>
+        <w:t xml:space="preserve"> empty. In fact, that’s the cause of the error: the IF statement right after the loop blows up because</w:t>
+      </w:r>
+      <w:r>
+        <w:rPr>
+          <w:rFonts w:eastAsiaTheme="minorHAnsi"/>
+        </w:rPr>
+        <w:t xml:space="preserve"> </w:t>
+      </w:r>
       <w:proofErr w:type="spellStart"/>
       <w:r>
         <w:rPr>
@@ -13544,13 +13813,34 @@
         <w:rPr>
           <w:rFonts w:eastAsiaTheme="minorHAnsi"/>
         </w:rPr>
-        <w:t xml:space="preserve"> is 0 which isn’t a valid subscript value for an array.</w:t>
-      </w:r>
-      <w:r>
-        <w:rPr>
-          <w:rFonts w:eastAsiaTheme="minorHAnsi"/>
-        </w:rPr>
-        <w:t xml:space="preserve"> That means the data type of the field wasn’t found. Although we can’t see the value of </w:t>
+        <w:t xml:space="preserve"> </w:t>
+      </w:r>
+      <w:proofErr w:type="gramStart"/>
+      <w:r>
+        <w:rPr>
+          <w:rFonts w:eastAsiaTheme="minorHAnsi"/>
+        </w:rPr>
+        <w:t>is</w:t>
+      </w:r>
+      <w:proofErr w:type="gramEnd"/>
+      <w:r>
+        <w:rPr>
+          <w:rFonts w:eastAsiaTheme="minorHAnsi"/>
+        </w:rPr>
+        <w:t xml:space="preserve"> 0 which isn’t a valid subscript value for an array.</w:t>
+      </w:r>
+      <w:r>
+        <w:rPr>
+          <w:rFonts w:eastAsiaTheme="minorHAnsi"/>
+        </w:rPr>
+        <w:t xml:space="preserve"> </w:t>
+      </w:r>
+      <w:r>
+        <w:rPr>
+          <w:rFonts w:eastAsiaTheme="minorHAnsi"/>
+        </w:rPr>
+        <w:lastRenderedPageBreak/>
+        <w:t xml:space="preserve">That means the data type of the field wasn’t found. Although we can’t see the value of </w:t>
       </w:r>
       <w:proofErr w:type="spellStart"/>
       <w:proofErr w:type="gramStart"/>
@@ -13659,7 +13949,15 @@
       </w:r>
       <w:proofErr w:type="spellEnd"/>
       <w:r>
-        <w:t xml:space="preserve"> is empty. Fixing that resolved the error, but we also added defensive code in </w:t>
+        <w:t xml:space="preserve"> is empty. Fixing that resolved the </w:t>
+      </w:r>
+      <w:proofErr w:type="gramStart"/>
+      <w:r>
+        <w:t>error, but</w:t>
+      </w:r>
+      <w:proofErr w:type="gramEnd"/>
+      <w:r>
+        <w:t xml:space="preserve"> we also added defensive code in </w:t>
       </w:r>
       <w:proofErr w:type="spellStart"/>
       <w:r>
@@ -13678,7 +13976,6 @@
         <w:pStyle w:val="Heading1"/>
       </w:pPr>
       <w:r>
-        <w:lastRenderedPageBreak/>
         <w:t>References</w:t>
       </w:r>
     </w:p>
@@ -13765,7 +14062,7 @@
 </file>
 
 <file path=word/endnotes.xml><?xml version="1.0" encoding="utf-8"?>
-<w:endnotes xmlns:wpc="http://schemas.microsoft.com/office/word/2010/wordprocessingCanvas" xmlns:cx="http://schemas.microsoft.com/office/drawing/2014/chartex" xmlns:cx1="http://schemas.microsoft.com/office/drawing/2015/9/8/chartex" xmlns:cx2="http://schemas.microsoft.com/office/drawing/2015/10/21/chartex" xmlns:cx3="http://schemas.microsoft.com/office/drawing/2016/5/9/chartex" xmlns:cx4="http://schemas.microsoft.com/office/drawing/2016/5/10/chartex" xmlns:cx5="http://schemas.microsoft.com/office/drawing/2016/5/11/chartex" xmlns:cx6="http://schemas.microsoft.com/office/drawing/2016/5/12/chartex" xmlns:cx7="http://schemas.microsoft.com/office/drawing/2016/5/13/chartex" xmlns:cx8="http://schemas.microsoft.com/office/drawing/2016/5/14/chartex" xmlns:mc="http://schemas.openxmlformats.org/markup-compatibility/2006" xmlns:aink="http://schemas.microsoft.com/office/drawing/2016/ink" xmlns:am3d="http://schemas.microsoft.com/office/drawing/2017/model3d" xmlns:o="urn:schemas-microsoft-com:office:office" xmlns:oel="http://schemas.microsoft.com/office/2019/extlst" xmlns:r="http://schemas.openxmlformats.org/officeDocument/2006/relationships" xmlns:m="http://schemas.openxmlformats.org/officeDocument/2006/math" xmlns:v="urn:schemas-microsoft-com:vml" xmlns:wp14="http://schemas.microsoft.com/office/word/2010/wordprocessingDrawing" xmlns:wp="http://schemas.openxmlformats.org/drawingml/2006/wordprocessingDrawing" xmlns:w10="urn:schemas-microsoft-com:office:word" xmlns:w="http://schemas.openxmlformats.org/wordprocessingml/2006/main" xmlns:w14="http://schemas.microsoft.com/office/word/2010/wordml" xmlns:w15="http://schemas.microsoft.com/office/word/2012/wordml" xmlns:w16cex="http://schemas.microsoft.com/office/word/2018/wordml/cex" xmlns:w16cid="http://schemas.microsoft.com/office/word/2016/wordml/cid" xmlns:w16="http://schemas.microsoft.com/office/word/2018/wordml" xmlns:w16du="http://schemas.microsoft.com/office/word/2023/wordml/word16du" xmlns:w16sdtdh="http://schemas.microsoft.com/office/word/2020/wordml/sdtdatahash" xmlns:w16se="http://schemas.microsoft.com/office/word/2015/wordml/symex" xmlns:wpg="http://schemas.microsoft.com/office/word/2010/wordprocessingGroup" xmlns:wpi="http://schemas.microsoft.com/office/word/2010/wordprocessingInk" xmlns:wne="http://schemas.microsoft.com/office/word/2006/wordml" xmlns:wps="http://schemas.microsoft.com/office/word/2010/wordprocessingShape" mc:Ignorable="w14 w15 w16se w16cid w16 w16cex w16sdtdh w16du wp14">
+<w:endnotes xmlns:wpc="http://schemas.microsoft.com/office/word/2010/wordprocessingCanvas" xmlns:cx="http://schemas.microsoft.com/office/drawing/2014/chartex" xmlns:cx1="http://schemas.microsoft.com/office/drawing/2015/9/8/chartex" xmlns:cx2="http://schemas.microsoft.com/office/drawing/2015/10/21/chartex" xmlns:cx3="http://schemas.microsoft.com/office/drawing/2016/5/9/chartex" xmlns:cx4="http://schemas.microsoft.com/office/drawing/2016/5/10/chartex" xmlns:cx5="http://schemas.microsoft.com/office/drawing/2016/5/11/chartex" xmlns:cx6="http://schemas.microsoft.com/office/drawing/2016/5/12/chartex" xmlns:cx7="http://schemas.microsoft.com/office/drawing/2016/5/13/chartex" xmlns:cx8="http://schemas.microsoft.com/office/drawing/2016/5/14/chartex" xmlns:mc="http://schemas.openxmlformats.org/markup-compatibility/2006" xmlns:aink="http://schemas.microsoft.com/office/drawing/2016/ink" xmlns:am3d="http://schemas.microsoft.com/office/drawing/2017/model3d" xmlns:o="urn:schemas-microsoft-com:office:office" xmlns:oel="http://schemas.microsoft.com/office/2019/extlst" xmlns:r="http://schemas.openxmlformats.org/officeDocument/2006/relationships" xmlns:m="http://schemas.openxmlformats.org/officeDocument/2006/math" xmlns:v="urn:schemas-microsoft-com:vml" xmlns:wp14="http://schemas.microsoft.com/office/word/2010/wordprocessingDrawing" xmlns:wp="http://schemas.openxmlformats.org/drawingml/2006/wordprocessingDrawing" xmlns:w10="urn:schemas-microsoft-com:office:word" xmlns:w="http://schemas.openxmlformats.org/wordprocessingml/2006/main" xmlns:w14="http://schemas.microsoft.com/office/word/2010/wordml" xmlns:w15="http://schemas.microsoft.com/office/word/2012/wordml" xmlns:w16cei="http://schemas.microsoft.com/office/word/2026/wordml/cei" xmlns:w16cex="http://schemas.microsoft.com/office/word/2018/wordml/cex" xmlns:w16cid="http://schemas.microsoft.com/office/word/2016/wordml/cid" xmlns:w16="http://schemas.microsoft.com/office/word/2018/wordml" xmlns:w16du="http://schemas.microsoft.com/office/word/2023/wordml/word16du" xmlns:w16sdtdh="http://schemas.microsoft.com/office/word/2020/wordml/sdtdatahash" xmlns:w16sdtfl="http://schemas.microsoft.com/office/word/2024/wordml/sdtformatlock" xmlns:w16se="http://schemas.microsoft.com/office/word/2015/wordml/symex" xmlns:wpg="http://schemas.microsoft.com/office/word/2010/wordprocessingGroup" xmlns:wpi="http://schemas.microsoft.com/office/word/2010/wordprocessingInk" xmlns:wne="http://schemas.microsoft.com/office/word/2006/wordml" xmlns:wps="http://schemas.microsoft.com/office/word/2010/wordprocessingShape" mc:Ignorable="w14 w15 w16se w16cid w16 w16cex w16sdtdh w16sdtfl w16du wp14">
   <w:endnote w:type="separator" w:id="-1">
     <w:p>
       <w:pPr>
@@ -13790,7 +14087,7 @@
 </file>
 
 <file path=word/footer1.xml><?xml version="1.0" encoding="utf-8"?>
-<w:ftr xmlns:wpc="http://schemas.microsoft.com/office/word/2010/wordprocessingCanvas" xmlns:cx="http://schemas.microsoft.com/office/drawing/2014/chartex" xmlns:cx1="http://schemas.microsoft.com/office/drawing/2015/9/8/chartex" xmlns:cx2="http://schemas.microsoft.com/office/drawing/2015/10/21/chartex" xmlns:cx3="http://schemas.microsoft.com/office/drawing/2016/5/9/chartex" xmlns:cx4="http://schemas.microsoft.com/office/drawing/2016/5/10/chartex" xmlns:cx5="http://schemas.microsoft.com/office/drawing/2016/5/11/chartex" xmlns:cx6="http://schemas.microsoft.com/office/drawing/2016/5/12/chartex" xmlns:cx7="http://schemas.microsoft.com/office/drawing/2016/5/13/chartex" xmlns:cx8="http://schemas.microsoft.com/office/drawing/2016/5/14/chartex" xmlns:mc="http://schemas.openxmlformats.org/markup-compatibility/2006" xmlns:aink="http://schemas.microsoft.com/office/drawing/2016/ink" xmlns:am3d="http://schemas.microsoft.com/office/drawing/2017/model3d" xmlns:o="urn:schemas-microsoft-com:office:office" xmlns:oel="http://schemas.microsoft.com/office/2019/extlst" xmlns:r="http://schemas.openxmlformats.org/officeDocument/2006/relationships" xmlns:m="http://schemas.openxmlformats.org/officeDocument/2006/math" xmlns:v="urn:schemas-microsoft-com:vml" xmlns:wp14="http://schemas.microsoft.com/office/word/2010/wordprocessingDrawing" xmlns:wp="http://schemas.openxmlformats.org/drawingml/2006/wordprocessingDrawing" xmlns:w10="urn:schemas-microsoft-com:office:word" xmlns:w="http://schemas.openxmlformats.org/wordprocessingml/2006/main" xmlns:w14="http://schemas.microsoft.com/office/word/2010/wordml" xmlns:w15="http://schemas.microsoft.com/office/word/2012/wordml" xmlns:w16cex="http://schemas.microsoft.com/office/word/2018/wordml/cex" xmlns:w16cid="http://schemas.microsoft.com/office/word/2016/wordml/cid" xmlns:w16="http://schemas.microsoft.com/office/word/2018/wordml" xmlns:w16du="http://schemas.microsoft.com/office/word/2023/wordml/word16du" xmlns:w16sdtdh="http://schemas.microsoft.com/office/word/2020/wordml/sdtdatahash" xmlns:w16se="http://schemas.microsoft.com/office/word/2015/wordml/symex" xmlns:wpg="http://schemas.microsoft.com/office/word/2010/wordprocessingGroup" xmlns:wpi="http://schemas.microsoft.com/office/word/2010/wordprocessingInk" xmlns:wne="http://schemas.microsoft.com/office/word/2006/wordml" xmlns:wps="http://schemas.microsoft.com/office/word/2010/wordprocessingShape" mc:Ignorable="w14 w15 w16se w16cid w16 w16cex w16sdtdh w16du wp14">
+<w:ftr xmlns:wpc="http://schemas.microsoft.com/office/word/2010/wordprocessingCanvas" xmlns:cx="http://schemas.microsoft.com/office/drawing/2014/chartex" xmlns:cx1="http://schemas.microsoft.com/office/drawing/2015/9/8/chartex" xmlns:cx2="http://schemas.microsoft.com/office/drawing/2015/10/21/chartex" xmlns:cx3="http://schemas.microsoft.com/office/drawing/2016/5/9/chartex" xmlns:cx4="http://schemas.microsoft.com/office/drawing/2016/5/10/chartex" xmlns:cx5="http://schemas.microsoft.com/office/drawing/2016/5/11/chartex" xmlns:cx6="http://schemas.microsoft.com/office/drawing/2016/5/12/chartex" xmlns:cx7="http://schemas.microsoft.com/office/drawing/2016/5/13/chartex" xmlns:cx8="http://schemas.microsoft.com/office/drawing/2016/5/14/chartex" xmlns:mc="http://schemas.openxmlformats.org/markup-compatibility/2006" xmlns:aink="http://schemas.microsoft.com/office/drawing/2016/ink" xmlns:am3d="http://schemas.microsoft.com/office/drawing/2017/model3d" xmlns:o="urn:schemas-microsoft-com:office:office" xmlns:oel="http://schemas.microsoft.com/office/2019/extlst" xmlns:r="http://schemas.openxmlformats.org/officeDocument/2006/relationships" xmlns:m="http://schemas.openxmlformats.org/officeDocument/2006/math" xmlns:v="urn:schemas-microsoft-com:vml" xmlns:wp14="http://schemas.microsoft.com/office/word/2010/wordprocessingDrawing" xmlns:wp="http://schemas.openxmlformats.org/drawingml/2006/wordprocessingDrawing" xmlns:w10="urn:schemas-microsoft-com:office:word" xmlns:w="http://schemas.openxmlformats.org/wordprocessingml/2006/main" xmlns:w14="http://schemas.microsoft.com/office/word/2010/wordml" xmlns:w15="http://schemas.microsoft.com/office/word/2012/wordml" xmlns:w16cei="http://schemas.microsoft.com/office/word/2026/wordml/cei" xmlns:w16cex="http://schemas.microsoft.com/office/word/2018/wordml/cex" xmlns:w16cid="http://schemas.microsoft.com/office/word/2016/wordml/cid" xmlns:w16="http://schemas.microsoft.com/office/word/2018/wordml" xmlns:w16du="http://schemas.microsoft.com/office/word/2023/wordml/word16du" xmlns:w16sdtdh="http://schemas.microsoft.com/office/word/2020/wordml/sdtdatahash" xmlns:w16sdtfl="http://schemas.microsoft.com/office/word/2024/wordml/sdtformatlock" xmlns:w16se="http://schemas.microsoft.com/office/word/2015/wordml/symex" xmlns:wpg="http://schemas.microsoft.com/office/word/2010/wordprocessingGroup" xmlns:wpi="http://schemas.microsoft.com/office/word/2010/wordprocessingInk" xmlns:wne="http://schemas.microsoft.com/office/word/2006/wordml" xmlns:wps="http://schemas.microsoft.com/office/word/2010/wordprocessingShape" mc:Ignorable="w14 w15 w16se w16cid w16 w16cex w16sdtdh w16sdtfl w16du wp14">
   <w:sdt>
     <w:sdtPr>
       <w:id w:val="-15772373"/>
@@ -13862,27 +14159,14 @@
             <w:r>
               <w:t xml:space="preserve"> of </w:t>
             </w:r>
-            <w:r>
-              <w:fldChar w:fldCharType="begin"/>
-            </w:r>
-            <w:r>
-              <w:instrText xml:space="preserve"> NUMPAGES  </w:instrText>
-            </w:r>
-            <w:r>
-              <w:fldChar w:fldCharType="separate"/>
-            </w:r>
-            <w:r>
-              <w:rPr>
-                <w:noProof/>
-              </w:rPr>
-              <w:t>30</w:t>
-            </w:r>
-            <w:r>
-              <w:rPr>
-                <w:noProof/>
-              </w:rPr>
-              <w:fldChar w:fldCharType="end"/>
-            </w:r>
+            <w:fldSimple w:instr=" NUMPAGES  ">
+              <w:r>
+                <w:rPr>
+                  <w:noProof/>
+                </w:rPr>
+                <w:t>30</w:t>
+              </w:r>
+            </w:fldSimple>
           </w:p>
         </w:sdtContent>
       </w:sdt>
@@ -13892,7 +14176,7 @@
 </file>
 
 <file path=word/footnotes.xml><?xml version="1.0" encoding="utf-8"?>
-<w:footnotes xmlns:wpc="http://schemas.microsoft.com/office/word/2010/wordprocessingCanvas" xmlns:cx="http://schemas.microsoft.com/office/drawing/2014/chartex" xmlns:cx1="http://schemas.microsoft.com/office/drawing/2015/9/8/chartex" xmlns:cx2="http://schemas.microsoft.com/office/drawing/2015/10/21/chartex" xmlns:cx3="http://schemas.microsoft.com/office/drawing/2016/5/9/chartex" xmlns:cx4="http://schemas.microsoft.com/office/drawing/2016/5/10/chartex" xmlns:cx5="http://schemas.microsoft.com/office/drawing/2016/5/11/chartex" xmlns:cx6="http://schemas.microsoft.com/office/drawing/2016/5/12/chartex" xmlns:cx7="http://schemas.microsoft.com/office/drawing/2016/5/13/chartex" xmlns:cx8="http://schemas.microsoft.com/office/drawing/2016/5/14/chartex" xmlns:mc="http://schemas.openxmlformats.org/markup-compatibility/2006" xmlns:aink="http://schemas.microsoft.com/office/drawing/2016/ink" xmlns:am3d="http://schemas.microsoft.com/office/drawing/2017/model3d" xmlns:o="urn:schemas-microsoft-com:office:office" xmlns:oel="http://schemas.microsoft.com/office/2019/extlst" xmlns:r="http://schemas.openxmlformats.org/officeDocument/2006/relationships" xmlns:m="http://schemas.openxmlformats.org/officeDocument/2006/math" xmlns:v="urn:schemas-microsoft-com:vml" xmlns:wp14="http://schemas.microsoft.com/office/word/2010/wordprocessingDrawing" xmlns:wp="http://schemas.openxmlformats.org/drawingml/2006/wordprocessingDrawing" xmlns:w10="urn:schemas-microsoft-com:office:word" xmlns:w="http://schemas.openxmlformats.org/wordprocessingml/2006/main" xmlns:w14="http://schemas.microsoft.com/office/word/2010/wordml" xmlns:w15="http://schemas.microsoft.com/office/word/2012/wordml" xmlns:w16cex="http://schemas.microsoft.com/office/word/2018/wordml/cex" xmlns:w16cid="http://schemas.microsoft.com/office/word/2016/wordml/cid" xmlns:w16="http://schemas.microsoft.com/office/word/2018/wordml" xmlns:w16du="http://schemas.microsoft.com/office/word/2023/wordml/word16du" xmlns:w16sdtdh="http://schemas.microsoft.com/office/word/2020/wordml/sdtdatahash" xmlns:w16se="http://schemas.microsoft.com/office/word/2015/wordml/symex" xmlns:wpg="http://schemas.microsoft.com/office/word/2010/wordprocessingGroup" xmlns:wpi="http://schemas.microsoft.com/office/word/2010/wordprocessingInk" xmlns:wne="http://schemas.microsoft.com/office/word/2006/wordml" xmlns:wps="http://schemas.microsoft.com/office/word/2010/wordprocessingShape" mc:Ignorable="w14 w15 w16se w16cid w16 w16cex w16sdtdh w16du wp14">
+<w:footnotes xmlns:wpc="http://schemas.microsoft.com/office/word/2010/wordprocessingCanvas" xmlns:cx="http://schemas.microsoft.com/office/drawing/2014/chartex" xmlns:cx1="http://schemas.microsoft.com/office/drawing/2015/9/8/chartex" xmlns:cx2="http://schemas.microsoft.com/office/drawing/2015/10/21/chartex" xmlns:cx3="http://schemas.microsoft.com/office/drawing/2016/5/9/chartex" xmlns:cx4="http://schemas.microsoft.com/office/drawing/2016/5/10/chartex" xmlns:cx5="http://schemas.microsoft.com/office/drawing/2016/5/11/chartex" xmlns:cx6="http://schemas.microsoft.com/office/drawing/2016/5/12/chartex" xmlns:cx7="http://schemas.microsoft.com/office/drawing/2016/5/13/chartex" xmlns:cx8="http://schemas.microsoft.com/office/drawing/2016/5/14/chartex" xmlns:mc="http://schemas.openxmlformats.org/markup-compatibility/2006" xmlns:aink="http://schemas.microsoft.com/office/drawing/2016/ink" xmlns:am3d="http://schemas.microsoft.com/office/drawing/2017/model3d" xmlns:o="urn:schemas-microsoft-com:office:office" xmlns:oel="http://schemas.microsoft.com/office/2019/extlst" xmlns:r="http://schemas.openxmlformats.org/officeDocument/2006/relationships" xmlns:m="http://schemas.openxmlformats.org/officeDocument/2006/math" xmlns:v="urn:schemas-microsoft-com:vml" xmlns:wp14="http://schemas.microsoft.com/office/word/2010/wordprocessingDrawing" xmlns:wp="http://schemas.openxmlformats.org/drawingml/2006/wordprocessingDrawing" xmlns:w10="urn:schemas-microsoft-com:office:word" xmlns:w="http://schemas.openxmlformats.org/wordprocessingml/2006/main" xmlns:w14="http://schemas.microsoft.com/office/word/2010/wordml" xmlns:w15="http://schemas.microsoft.com/office/word/2012/wordml" xmlns:w16cei="http://schemas.microsoft.com/office/word/2026/wordml/cei" xmlns:w16cex="http://schemas.microsoft.com/office/word/2018/wordml/cex" xmlns:w16cid="http://schemas.microsoft.com/office/word/2016/wordml/cid" xmlns:w16="http://schemas.microsoft.com/office/word/2018/wordml" xmlns:w16du="http://schemas.microsoft.com/office/word/2023/wordml/word16du" xmlns:w16sdtdh="http://schemas.microsoft.com/office/word/2020/wordml/sdtdatahash" xmlns:w16sdtfl="http://schemas.microsoft.com/office/word/2024/wordml/sdtformatlock" xmlns:w16se="http://schemas.microsoft.com/office/word/2015/wordml/symex" xmlns:wpg="http://schemas.microsoft.com/office/word/2010/wordprocessingGroup" xmlns:wpi="http://schemas.microsoft.com/office/word/2010/wordprocessingInk" xmlns:wne="http://schemas.microsoft.com/office/word/2006/wordml" xmlns:wps="http://schemas.microsoft.com/office/word/2010/wordprocessingShape" mc:Ignorable="w14 w15 w16se w16cid w16 w16cex w16sdtdh w16sdtfl w16du wp14">
   <w:footnote w:type="separator" w:id="-1">
     <w:p>
       <w:pPr>
@@ -13917,7 +14201,7 @@
 </file>
 
 <file path=word/header1.xml><?xml version="1.0" encoding="utf-8"?>
-<w:hdr xmlns:wpc="http://schemas.microsoft.com/office/word/2010/wordprocessingCanvas" xmlns:cx="http://schemas.microsoft.com/office/drawing/2014/chartex" xmlns:cx1="http://schemas.microsoft.com/office/drawing/2015/9/8/chartex" xmlns:cx2="http://schemas.microsoft.com/office/drawing/2015/10/21/chartex" xmlns:cx3="http://schemas.microsoft.com/office/drawing/2016/5/9/chartex" xmlns:cx4="http://schemas.microsoft.com/office/drawing/2016/5/10/chartex" xmlns:cx5="http://schemas.microsoft.com/office/drawing/2016/5/11/chartex" xmlns:cx6="http://schemas.microsoft.com/office/drawing/2016/5/12/chartex" xmlns:cx7="http://schemas.microsoft.com/office/drawing/2016/5/13/chartex" xmlns:cx8="http://schemas.microsoft.com/office/drawing/2016/5/14/chartex" xmlns:mc="http://schemas.openxmlformats.org/markup-compatibility/2006" xmlns:aink="http://schemas.microsoft.com/office/drawing/2016/ink" xmlns:am3d="http://schemas.microsoft.com/office/drawing/2017/model3d" xmlns:o="urn:schemas-microsoft-com:office:office" xmlns:oel="http://schemas.microsoft.com/office/2019/extlst" xmlns:r="http://schemas.openxmlformats.org/officeDocument/2006/relationships" xmlns:m="http://schemas.openxmlformats.org/officeDocument/2006/math" xmlns:v="urn:schemas-microsoft-com:vml" xmlns:wp14="http://schemas.microsoft.com/office/word/2010/wordprocessingDrawing" xmlns:wp="http://schemas.openxmlformats.org/drawingml/2006/wordprocessingDrawing" xmlns:w10="urn:schemas-microsoft-com:office:word" xmlns:w="http://schemas.openxmlformats.org/wordprocessingml/2006/main" xmlns:w14="http://schemas.microsoft.com/office/word/2010/wordml" xmlns:w15="http://schemas.microsoft.com/office/word/2012/wordml" xmlns:w16cex="http://schemas.microsoft.com/office/word/2018/wordml/cex" xmlns:w16cid="http://schemas.microsoft.com/office/word/2016/wordml/cid" xmlns:w16="http://schemas.microsoft.com/office/word/2018/wordml" xmlns:w16du="http://schemas.microsoft.com/office/word/2023/wordml/word16du" xmlns:w16sdtdh="http://schemas.microsoft.com/office/word/2020/wordml/sdtdatahash" xmlns:w16se="http://schemas.microsoft.com/office/word/2015/wordml/symex" xmlns:wpg="http://schemas.microsoft.com/office/word/2010/wordprocessingGroup" xmlns:wpi="http://schemas.microsoft.com/office/word/2010/wordprocessingInk" xmlns:wne="http://schemas.microsoft.com/office/word/2006/wordml" xmlns:wps="http://schemas.microsoft.com/office/word/2010/wordprocessingShape" mc:Ignorable="w14 w15 w16se w16cid w16 w16cex w16sdtdh w16du wp14">
+<w:hdr xmlns:wpc="http://schemas.microsoft.com/office/word/2010/wordprocessingCanvas" xmlns:cx="http://schemas.microsoft.com/office/drawing/2014/chartex" xmlns:cx1="http://schemas.microsoft.com/office/drawing/2015/9/8/chartex" xmlns:cx2="http://schemas.microsoft.com/office/drawing/2015/10/21/chartex" xmlns:cx3="http://schemas.microsoft.com/office/drawing/2016/5/9/chartex" xmlns:cx4="http://schemas.microsoft.com/office/drawing/2016/5/10/chartex" xmlns:cx5="http://schemas.microsoft.com/office/drawing/2016/5/11/chartex" xmlns:cx6="http://schemas.microsoft.com/office/drawing/2016/5/12/chartex" xmlns:cx7="http://schemas.microsoft.com/office/drawing/2016/5/13/chartex" xmlns:cx8="http://schemas.microsoft.com/office/drawing/2016/5/14/chartex" xmlns:mc="http://schemas.openxmlformats.org/markup-compatibility/2006" xmlns:aink="http://schemas.microsoft.com/office/drawing/2016/ink" xmlns:am3d="http://schemas.microsoft.com/office/drawing/2017/model3d" xmlns:o="urn:schemas-microsoft-com:office:office" xmlns:oel="http://schemas.microsoft.com/office/2019/extlst" xmlns:r="http://schemas.openxmlformats.org/officeDocument/2006/relationships" xmlns:m="http://schemas.openxmlformats.org/officeDocument/2006/math" xmlns:v="urn:schemas-microsoft-com:vml" xmlns:wp14="http://schemas.microsoft.com/office/word/2010/wordprocessingDrawing" xmlns:wp="http://schemas.openxmlformats.org/drawingml/2006/wordprocessingDrawing" xmlns:w10="urn:schemas-microsoft-com:office:word" xmlns:w="http://schemas.openxmlformats.org/wordprocessingml/2006/main" xmlns:w14="http://schemas.microsoft.com/office/word/2010/wordml" xmlns:w15="http://schemas.microsoft.com/office/word/2012/wordml" xmlns:w16cei="http://schemas.microsoft.com/office/word/2026/wordml/cei" xmlns:w16cex="http://schemas.microsoft.com/office/word/2018/wordml/cex" xmlns:w16cid="http://schemas.microsoft.com/office/word/2016/wordml/cid" xmlns:w16="http://schemas.microsoft.com/office/word/2018/wordml" xmlns:w16du="http://schemas.microsoft.com/office/word/2023/wordml/word16du" xmlns:w16sdtdh="http://schemas.microsoft.com/office/word/2020/wordml/sdtdatahash" xmlns:w16sdtfl="http://schemas.microsoft.com/office/word/2024/wordml/sdtformatlock" xmlns:w16se="http://schemas.microsoft.com/office/word/2015/wordml/symex" xmlns:wpg="http://schemas.microsoft.com/office/word/2010/wordprocessingGroup" xmlns:wpi="http://schemas.microsoft.com/office/word/2010/wordprocessingInk" xmlns:wne="http://schemas.microsoft.com/office/word/2006/wordml" xmlns:wps="http://schemas.microsoft.com/office/word/2010/wordprocessingShape" mc:Ignorable="w14 w15 w16se w16cid w16 w16cex w16sdtdh w16sdtfl w16du wp14">
   <w:sdt>
     <w:sdtPr>
       <w:id w:val="968752352"/>
@@ -13959,7 +14243,7 @@
 </file>
 
 <file path=word/numbering.xml><?xml version="1.0" encoding="utf-8"?>
-<w:numbering xmlns:wpc="http://schemas.microsoft.com/office/word/2010/wordprocessingCanvas" xmlns:cx="http://schemas.microsoft.com/office/drawing/2014/chartex" xmlns:cx1="http://schemas.microsoft.com/office/drawing/2015/9/8/chartex" xmlns:cx2="http://schemas.microsoft.com/office/drawing/2015/10/21/chartex" xmlns:cx3="http://schemas.microsoft.com/office/drawing/2016/5/9/chartex" xmlns:cx4="http://schemas.microsoft.com/office/drawing/2016/5/10/chartex" xmlns:cx5="http://schemas.microsoft.com/office/drawing/2016/5/11/chartex" xmlns:cx6="http://schemas.microsoft.com/office/drawing/2016/5/12/chartex" xmlns:cx7="http://schemas.microsoft.com/office/drawing/2016/5/13/chartex" xmlns:cx8="http://schemas.microsoft.com/office/drawing/2016/5/14/chartex" xmlns:mc="http://schemas.openxmlformats.org/markup-compatibility/2006" xmlns:aink="http://schemas.microsoft.com/office/drawing/2016/ink" xmlns:am3d="http://schemas.microsoft.com/office/drawing/2017/model3d" xmlns:o="urn:schemas-microsoft-com:office:office" xmlns:oel="http://schemas.microsoft.com/office/2019/extlst" xmlns:r="http://schemas.openxmlformats.org/officeDocument/2006/relationships" xmlns:m="http://schemas.openxmlformats.org/officeDocument/2006/math" xmlns:v="urn:schemas-microsoft-com:vml" xmlns:wp14="http://schemas.microsoft.com/office/word/2010/wordprocessingDrawing" xmlns:wp="http://schemas.openxmlformats.org/drawingml/2006/wordprocessingDrawing" xmlns:w10="urn:schemas-microsoft-com:office:word" xmlns:w="http://schemas.openxmlformats.org/wordprocessingml/2006/main" xmlns:w14="http://schemas.microsoft.com/office/word/2010/wordml" xmlns:w15="http://schemas.microsoft.com/office/word/2012/wordml" xmlns:w16cex="http://schemas.microsoft.com/office/word/2018/wordml/cex" xmlns:w16cid="http://schemas.microsoft.com/office/word/2016/wordml/cid" xmlns:w16="http://schemas.microsoft.com/office/word/2018/wordml" xmlns:w16du="http://schemas.microsoft.com/office/word/2023/wordml/word16du" xmlns:w16sdtdh="http://schemas.microsoft.com/office/word/2020/wordml/sdtdatahash" xmlns:w16se="http://schemas.microsoft.com/office/word/2015/wordml/symex" xmlns:wpg="http://schemas.microsoft.com/office/word/2010/wordprocessingGroup" xmlns:wpi="http://schemas.microsoft.com/office/word/2010/wordprocessingInk" xmlns:wne="http://schemas.microsoft.com/office/word/2006/wordml" xmlns:wps="http://schemas.microsoft.com/office/word/2010/wordprocessingShape" mc:Ignorable="w14 w15 w16se w16cid w16 w16cex w16sdtdh w16du wp14">
+<w:numbering xmlns:wpc="http://schemas.microsoft.com/office/word/2010/wordprocessingCanvas" xmlns:cx="http://schemas.microsoft.com/office/drawing/2014/chartex" xmlns:cx1="http://schemas.microsoft.com/office/drawing/2015/9/8/chartex" xmlns:cx2="http://schemas.microsoft.com/office/drawing/2015/10/21/chartex" xmlns:cx3="http://schemas.microsoft.com/office/drawing/2016/5/9/chartex" xmlns:cx4="http://schemas.microsoft.com/office/drawing/2016/5/10/chartex" xmlns:cx5="http://schemas.microsoft.com/office/drawing/2016/5/11/chartex" xmlns:cx6="http://schemas.microsoft.com/office/drawing/2016/5/12/chartex" xmlns:cx7="http://schemas.microsoft.com/office/drawing/2016/5/13/chartex" xmlns:cx8="http://schemas.microsoft.com/office/drawing/2016/5/14/chartex" xmlns:mc="http://schemas.openxmlformats.org/markup-compatibility/2006" xmlns:aink="http://schemas.microsoft.com/office/drawing/2016/ink" xmlns:am3d="http://schemas.microsoft.com/office/drawing/2017/model3d" xmlns:o="urn:schemas-microsoft-com:office:office" xmlns:oel="http://schemas.microsoft.com/office/2019/extlst" xmlns:r="http://schemas.openxmlformats.org/officeDocument/2006/relationships" xmlns:m="http://schemas.openxmlformats.org/officeDocument/2006/math" xmlns:v="urn:schemas-microsoft-com:vml" xmlns:wp14="http://schemas.microsoft.com/office/word/2010/wordprocessingDrawing" xmlns:wp="http://schemas.openxmlformats.org/drawingml/2006/wordprocessingDrawing" xmlns:w10="urn:schemas-microsoft-com:office:word" xmlns:w="http://schemas.openxmlformats.org/wordprocessingml/2006/main" xmlns:w14="http://schemas.microsoft.com/office/word/2010/wordml" xmlns:w15="http://schemas.microsoft.com/office/word/2012/wordml" xmlns:w16cei="http://schemas.microsoft.com/office/word/2026/wordml/cei" xmlns:w16cex="http://schemas.microsoft.com/office/word/2018/wordml/cex" xmlns:w16cid="http://schemas.microsoft.com/office/word/2016/wordml/cid" xmlns:w16="http://schemas.microsoft.com/office/word/2018/wordml" xmlns:w16du="http://schemas.microsoft.com/office/word/2023/wordml/word16du" xmlns:w16sdtdh="http://schemas.microsoft.com/office/word/2020/wordml/sdtdatahash" xmlns:w16sdtfl="http://schemas.microsoft.com/office/word/2024/wordml/sdtformatlock" xmlns:w16se="http://schemas.microsoft.com/office/word/2015/wordml/symex" xmlns:wpg="http://schemas.microsoft.com/office/word/2010/wordprocessingGroup" xmlns:wpi="http://schemas.microsoft.com/office/word/2010/wordprocessingInk" xmlns:wne="http://schemas.microsoft.com/office/word/2006/wordml" xmlns:wps="http://schemas.microsoft.com/office/word/2010/wordprocessingShape" mc:Ignorable="w14 w15 w16se w16cid w16 w16cex w16sdtdh w16sdtfl w16du wp14">
   <w:abstractNum w:abstractNumId="0" w15:restartNumberingAfterBreak="0">
     <w:nsid w:val="FFFFFF7C"/>
     <w:multiLevelType w:val="singleLevel"/>
@@ -16247,7 +16531,7 @@
 </file>
 
 <file path=word/styles.xml><?xml version="1.0" encoding="utf-8"?>
-<w:styles xmlns:mc="http://schemas.openxmlformats.org/markup-compatibility/2006" xmlns:r="http://schemas.openxmlformats.org/officeDocument/2006/relationships" xmlns:w="http://schemas.openxmlformats.org/wordprocessingml/2006/main" xmlns:w14="http://schemas.microsoft.com/office/word/2010/wordml" xmlns:w15="http://schemas.microsoft.com/office/word/2012/wordml" xmlns:w16cex="http://schemas.microsoft.com/office/word/2018/wordml/cex" xmlns:w16cid="http://schemas.microsoft.com/office/word/2016/wordml/cid" xmlns:w16="http://schemas.microsoft.com/office/word/2018/wordml" xmlns:w16du="http://schemas.microsoft.com/office/word/2023/wordml/word16du" xmlns:w16sdtdh="http://schemas.microsoft.com/office/word/2020/wordml/sdtdatahash" xmlns:w16se="http://schemas.microsoft.com/office/word/2015/wordml/symex" mc:Ignorable="w14 w15 w16se w16cid w16 w16cex w16sdtdh w16du">
+<w:styles xmlns:mc="http://schemas.openxmlformats.org/markup-compatibility/2006" xmlns:r="http://schemas.openxmlformats.org/officeDocument/2006/relationships" xmlns:w="http://schemas.openxmlformats.org/wordprocessingml/2006/main" xmlns:w14="http://schemas.microsoft.com/office/word/2010/wordml" xmlns:w15="http://schemas.microsoft.com/office/word/2012/wordml" xmlns:w16cex="http://schemas.microsoft.com/office/word/2018/wordml/cex" xmlns:w16cid="http://schemas.microsoft.com/office/word/2016/wordml/cid" xmlns:w16="http://schemas.microsoft.com/office/word/2018/wordml" xmlns:w16du="http://schemas.microsoft.com/office/word/2023/wordml/word16du" xmlns:w16sdtdh="http://schemas.microsoft.com/office/word/2020/wordml/sdtdatahash" xmlns:w16sdtfl="http://schemas.microsoft.com/office/word/2024/wordml/sdtformatlock" xmlns:w16se="http://schemas.microsoft.com/office/word/2015/wordml/symex" mc:Ignorable="w14 w15 w16se w16cid w16 w16cex w16sdtdh w16sdtfl w16du">
   <w:docDefaults>
     <w:rPrDefault>
       <w:rPr>
@@ -17929,7 +18213,7 @@
 </file>
 
 <file path=word/glossary/document.xml><?xml version="1.0" encoding="utf-8"?>
-<w:glossaryDocument xmlns:wpc="http://schemas.microsoft.com/office/word/2010/wordprocessingCanvas" xmlns:cx="http://schemas.microsoft.com/office/drawing/2014/chartex" xmlns:cx1="http://schemas.microsoft.com/office/drawing/2015/9/8/chartex" xmlns:cx2="http://schemas.microsoft.com/office/drawing/2015/10/21/chartex" xmlns:cx3="http://schemas.microsoft.com/office/drawing/2016/5/9/chartex" xmlns:cx4="http://schemas.microsoft.com/office/drawing/2016/5/10/chartex" xmlns:cx5="http://schemas.microsoft.com/office/drawing/2016/5/11/chartex" xmlns:cx6="http://schemas.microsoft.com/office/drawing/2016/5/12/chartex" xmlns:cx7="http://schemas.microsoft.com/office/drawing/2016/5/13/chartex" xmlns:cx8="http://schemas.microsoft.com/office/drawing/2016/5/14/chartex" xmlns:mc="http://schemas.openxmlformats.org/markup-compatibility/2006" xmlns:aink="http://schemas.microsoft.com/office/drawing/2016/ink" xmlns:am3d="http://schemas.microsoft.com/office/drawing/2017/model3d" xmlns:o="urn:schemas-microsoft-com:office:office" xmlns:oel="http://schemas.microsoft.com/office/2019/extlst" xmlns:r="http://schemas.openxmlformats.org/officeDocument/2006/relationships" xmlns:m="http://schemas.openxmlformats.org/officeDocument/2006/math" xmlns:v="urn:schemas-microsoft-com:vml" xmlns:wp14="http://schemas.microsoft.com/office/word/2010/wordprocessingDrawing" xmlns:wp="http://schemas.openxmlformats.org/drawingml/2006/wordprocessingDrawing" xmlns:w10="urn:schemas-microsoft-com:office:word" xmlns:w="http://schemas.openxmlformats.org/wordprocessingml/2006/main" xmlns:w14="http://schemas.microsoft.com/office/word/2010/wordml" xmlns:w15="http://schemas.microsoft.com/office/word/2012/wordml" xmlns:w16cex="http://schemas.microsoft.com/office/word/2018/wordml/cex" xmlns:w16cid="http://schemas.microsoft.com/office/word/2016/wordml/cid" xmlns:w16="http://schemas.microsoft.com/office/word/2018/wordml" xmlns:w16du="http://schemas.microsoft.com/office/word/2023/wordml/word16du" xmlns:w16sdtdh="http://schemas.microsoft.com/office/word/2020/wordml/sdtdatahash" xmlns:w16se="http://schemas.microsoft.com/office/word/2015/wordml/symex" xmlns:wpg="http://schemas.microsoft.com/office/word/2010/wordprocessingGroup" xmlns:wpi="http://schemas.microsoft.com/office/word/2010/wordprocessingInk" xmlns:wne="http://schemas.microsoft.com/office/word/2006/wordml" xmlns:wps="http://schemas.microsoft.com/office/word/2010/wordprocessingShape" mc:Ignorable="w14 w15 w16se w16cid w16 w16cex w16sdtdh w16du wp14">
+<w:glossaryDocument xmlns:wpc="http://schemas.microsoft.com/office/word/2010/wordprocessingCanvas" xmlns:cx="http://schemas.microsoft.com/office/drawing/2014/chartex" xmlns:cx1="http://schemas.microsoft.com/office/drawing/2015/9/8/chartex" xmlns:cx2="http://schemas.microsoft.com/office/drawing/2015/10/21/chartex" xmlns:cx3="http://schemas.microsoft.com/office/drawing/2016/5/9/chartex" xmlns:cx4="http://schemas.microsoft.com/office/drawing/2016/5/10/chartex" xmlns:cx5="http://schemas.microsoft.com/office/drawing/2016/5/11/chartex" xmlns:cx6="http://schemas.microsoft.com/office/drawing/2016/5/12/chartex" xmlns:cx7="http://schemas.microsoft.com/office/drawing/2016/5/13/chartex" xmlns:cx8="http://schemas.microsoft.com/office/drawing/2016/5/14/chartex" xmlns:mc="http://schemas.openxmlformats.org/markup-compatibility/2006" xmlns:aink="http://schemas.microsoft.com/office/drawing/2016/ink" xmlns:am3d="http://schemas.microsoft.com/office/drawing/2017/model3d" xmlns:o="urn:schemas-microsoft-com:office:office" xmlns:oel="http://schemas.microsoft.com/office/2019/extlst" xmlns:r="http://schemas.openxmlformats.org/officeDocument/2006/relationships" xmlns:m="http://schemas.openxmlformats.org/officeDocument/2006/math" xmlns:v="urn:schemas-microsoft-com:vml" xmlns:wp14="http://schemas.microsoft.com/office/word/2010/wordprocessingDrawing" xmlns:wp="http://schemas.openxmlformats.org/drawingml/2006/wordprocessingDrawing" xmlns:w10="urn:schemas-microsoft-com:office:word" xmlns:w="http://schemas.openxmlformats.org/wordprocessingml/2006/main" xmlns:w14="http://schemas.microsoft.com/office/word/2010/wordml" xmlns:w15="http://schemas.microsoft.com/office/word/2012/wordml" xmlns:w16cei="http://schemas.microsoft.com/office/word/2026/wordml/cei" xmlns:w16cex="http://schemas.microsoft.com/office/word/2018/wordml/cex" xmlns:w16cid="http://schemas.microsoft.com/office/word/2016/wordml/cid" xmlns:w16="http://schemas.microsoft.com/office/word/2018/wordml" xmlns:w16du="http://schemas.microsoft.com/office/word/2023/wordml/word16du" xmlns:w16sdtdh="http://schemas.microsoft.com/office/word/2020/wordml/sdtdatahash" xmlns:w16sdtfl="http://schemas.microsoft.com/office/word/2024/wordml/sdtformatlock" xmlns:w16se="http://schemas.microsoft.com/office/word/2015/wordml/symex" xmlns:wpg="http://schemas.microsoft.com/office/word/2010/wordprocessingGroup" xmlns:wpi="http://schemas.microsoft.com/office/word/2010/wordprocessingInk" xmlns:wne="http://schemas.microsoft.com/office/word/2006/wordml" xmlns:wps="http://schemas.microsoft.com/office/word/2010/wordprocessingShape" mc:Ignorable="w14 w15 w16se w16cid w16 w16cex w16sdtdh w16sdtfl w16du wp14">
   <w:docParts>
     <w:docPart>
       <w:docPartPr>
@@ -17991,7 +18275,7 @@
 </file>
 
 <file path=word/glossary/fontTable.xml><?xml version="1.0" encoding="utf-8"?>
-<w:fonts xmlns:mc="http://schemas.openxmlformats.org/markup-compatibility/2006" xmlns:r="http://schemas.openxmlformats.org/officeDocument/2006/relationships" xmlns:w="http://schemas.openxmlformats.org/wordprocessingml/2006/main" xmlns:w14="http://schemas.microsoft.com/office/word/2010/wordml" xmlns:w15="http://schemas.microsoft.com/office/word/2012/wordml" xmlns:w16cex="http://schemas.microsoft.com/office/word/2018/wordml/cex" xmlns:w16cid="http://schemas.microsoft.com/office/word/2016/wordml/cid" xmlns:w16="http://schemas.microsoft.com/office/word/2018/wordml" xmlns:w16du="http://schemas.microsoft.com/office/word/2023/wordml/word16du" xmlns:w16sdtdh="http://schemas.microsoft.com/office/word/2020/wordml/sdtdatahash" xmlns:w16se="http://schemas.microsoft.com/office/word/2015/wordml/symex" mc:Ignorable="w14 w15 w16se w16cid w16 w16cex w16sdtdh w16du">
+<w:fonts xmlns:mc="http://schemas.openxmlformats.org/markup-compatibility/2006" xmlns:r="http://schemas.openxmlformats.org/officeDocument/2006/relationships" xmlns:w="http://schemas.openxmlformats.org/wordprocessingml/2006/main" xmlns:w14="http://schemas.microsoft.com/office/word/2010/wordml" xmlns:w15="http://schemas.microsoft.com/office/word/2012/wordml" xmlns:w16cex="http://schemas.microsoft.com/office/word/2018/wordml/cex" xmlns:w16cid="http://schemas.microsoft.com/office/word/2016/wordml/cid" xmlns:w16="http://schemas.microsoft.com/office/word/2018/wordml" xmlns:w16du="http://schemas.microsoft.com/office/word/2023/wordml/word16du" xmlns:w16sdtdh="http://schemas.microsoft.com/office/word/2020/wordml/sdtdatahash" xmlns:w16sdtfl="http://schemas.microsoft.com/office/word/2024/wordml/sdtformatlock" xmlns:w16se="http://schemas.microsoft.com/office/word/2015/wordml/symex" mc:Ignorable="w14 w15 w16se w16cid w16 w16cex w16sdtdh w16sdtfl w16du">
   <w:font w:name="Symbol">
     <w:panose1 w:val="05050102010706020507"/>
     <w:charset w:val="02"/>
@@ -18070,7 +18354,6 @@
     <w:sig w:usb0="20000287" w:usb1="00000003" w:usb2="00000000" w:usb3="00000000" w:csb0="0000019F" w:csb1="00000000"/>
   </w:font>
   <w:font w:name="DengXian Light">
-    <w:altName w:val="等线 Light"/>
     <w:charset w:val="86"/>
     <w:family w:val="auto"/>
     <w:pitch w:val="variable"/>
@@ -18083,7 +18366,6 @@
     <w:sig w:usb0="20000287" w:usb1="00000003" w:usb2="00000000" w:usb3="00000000" w:csb0="0000019F" w:csb1="00000000"/>
   </w:font>
   <w:font w:name="DengXian">
-    <w:altName w:val="等线"/>
     <w:panose1 w:val="02010600030101010101"/>
     <w:charset w:val="86"/>
     <w:family w:val="auto"/>
@@ -18094,7 +18376,7 @@
 </file>
 
 <file path=word/glossary/settings.xml><?xml version="1.0" encoding="utf-8"?>
-<w:settings xmlns:mc="http://schemas.openxmlformats.org/markup-compatibility/2006" xmlns:o="urn:schemas-microsoft-com:office:office" xmlns:r="http://schemas.openxmlformats.org/officeDocument/2006/relationships" xmlns:m="http://schemas.openxmlformats.org/officeDocument/2006/math" xmlns:v="urn:schemas-microsoft-com:vml" xmlns:w10="urn:schemas-microsoft-com:office:word" xmlns:w="http://schemas.openxmlformats.org/wordprocessingml/2006/main" xmlns:w14="http://schemas.microsoft.com/office/word/2010/wordml" xmlns:w15="http://schemas.microsoft.com/office/word/2012/wordml" xmlns:w16cex="http://schemas.microsoft.com/office/word/2018/wordml/cex" xmlns:w16cid="http://schemas.microsoft.com/office/word/2016/wordml/cid" xmlns:w16="http://schemas.microsoft.com/office/word/2018/wordml" xmlns:w16du="http://schemas.microsoft.com/office/word/2023/wordml/word16du" xmlns:w16sdtdh="http://schemas.microsoft.com/office/word/2020/wordml/sdtdatahash" xmlns:w16se="http://schemas.microsoft.com/office/word/2015/wordml/symex" xmlns:sl="http://schemas.openxmlformats.org/schemaLibrary/2006/main" mc:Ignorable="w14 w15 w16se w16cid w16 w16cex w16sdtdh w16du">
+<w:settings xmlns:mc="http://schemas.openxmlformats.org/markup-compatibility/2006" xmlns:o="urn:schemas-microsoft-com:office:office" xmlns:r="http://schemas.openxmlformats.org/officeDocument/2006/relationships" xmlns:m="http://schemas.openxmlformats.org/officeDocument/2006/math" xmlns:v="urn:schemas-microsoft-com:vml" xmlns:w10="urn:schemas-microsoft-com:office:word" xmlns:w="http://schemas.openxmlformats.org/wordprocessingml/2006/main" xmlns:w14="http://schemas.microsoft.com/office/word/2010/wordml" xmlns:w15="http://schemas.microsoft.com/office/word/2012/wordml" xmlns:w16cex="http://schemas.microsoft.com/office/word/2018/wordml/cex" xmlns:w16cid="http://schemas.microsoft.com/office/word/2016/wordml/cid" xmlns:w16="http://schemas.microsoft.com/office/word/2018/wordml" xmlns:w16du="http://schemas.microsoft.com/office/word/2023/wordml/word16du" xmlns:w16sdtdh="http://schemas.microsoft.com/office/word/2020/wordml/sdtdatahash" xmlns:w16sdtfl="http://schemas.microsoft.com/office/word/2024/wordml/sdtformatlock" xmlns:w16se="http://schemas.microsoft.com/office/word/2015/wordml/symex" xmlns:sl="http://schemas.openxmlformats.org/schemaLibrary/2006/main" mc:Ignorable="w14 w15 w16se w16cid w16 w16cex w16sdtdh w16sdtfl w16du">
   <w:view w:val="normal"/>
   <w:defaultTabStop w:val="720"/>
   <w:characterSpacingControl w:val="doNotCompress"/>
@@ -18110,11 +18392,14 @@
     <w:rsidRoot w:val="00314F14"/>
     <w:rsid w:val="000A2274"/>
     <w:rsid w:val="002728A4"/>
+    <w:rsid w:val="00293476"/>
+    <w:rsid w:val="002F7603"/>
     <w:rsid w:val="00314F14"/>
     <w:rsid w:val="00322119"/>
     <w:rsid w:val="003571B6"/>
     <w:rsid w:val="003906AF"/>
     <w:rsid w:val="003C1616"/>
+    <w:rsid w:val="0042591B"/>
     <w:rsid w:val="004408C7"/>
     <w:rsid w:val="006232E1"/>
     <w:rsid w:val="0066607B"/>
@@ -18123,6 +18408,7 @@
     <w:rsid w:val="00696D07"/>
     <w:rsid w:val="007501A3"/>
     <w:rsid w:val="00763ADE"/>
+    <w:rsid w:val="0077530C"/>
     <w:rsid w:val="00777891"/>
     <w:rsid w:val="007E1D4D"/>
     <w:rsid w:val="00857EB0"/>
@@ -18157,7 +18443,7 @@
 </file>
 
 <file path=word/glossary/styles.xml><?xml version="1.0" encoding="utf-8"?>
-<w:styles xmlns:mc="http://schemas.openxmlformats.org/markup-compatibility/2006" xmlns:r="http://schemas.openxmlformats.org/officeDocument/2006/relationships" xmlns:w="http://schemas.openxmlformats.org/wordprocessingml/2006/main" xmlns:w14="http://schemas.microsoft.com/office/word/2010/wordml" xmlns:w15="http://schemas.microsoft.com/office/word/2012/wordml" xmlns:w16cex="http://schemas.microsoft.com/office/word/2018/wordml/cex" xmlns:w16cid="http://schemas.microsoft.com/office/word/2016/wordml/cid" xmlns:w16="http://schemas.microsoft.com/office/word/2018/wordml" xmlns:w16du="http://schemas.microsoft.com/office/word/2023/wordml/word16du" xmlns:w16sdtdh="http://schemas.microsoft.com/office/word/2020/wordml/sdtdatahash" xmlns:w16se="http://schemas.microsoft.com/office/word/2015/wordml/symex" mc:Ignorable="w14 w15 w16se w16cid w16 w16cex w16sdtdh w16du">
+<w:styles xmlns:mc="http://schemas.openxmlformats.org/markup-compatibility/2006" xmlns:r="http://schemas.openxmlformats.org/officeDocument/2006/relationships" xmlns:w="http://schemas.openxmlformats.org/wordprocessingml/2006/main" xmlns:w14="http://schemas.microsoft.com/office/word/2010/wordml" xmlns:w15="http://schemas.microsoft.com/office/word/2012/wordml" xmlns:w16cex="http://schemas.microsoft.com/office/word/2018/wordml/cex" xmlns:w16cid="http://schemas.microsoft.com/office/word/2016/wordml/cid" xmlns:w16="http://schemas.microsoft.com/office/word/2018/wordml" xmlns:w16du="http://schemas.microsoft.com/office/word/2023/wordml/word16du" xmlns:w16sdtdh="http://schemas.microsoft.com/office/word/2020/wordml/sdtdatahash" xmlns:w16sdtfl="http://schemas.microsoft.com/office/word/2024/wordml/sdtformatlock" xmlns:w16se="http://schemas.microsoft.com/office/word/2015/wordml/symex" mc:Ignorable="w14 w15 w16se w16cid w16 w16cex w16sdtdh w16sdtfl w16du">
   <w:docDefaults>
     <w:rPrDefault>
       <w:rPr>
@@ -18604,7 +18890,7 @@
 </file>
 
 <file path=word/glossary/webSettings.xml><?xml version="1.0" encoding="utf-8"?>
-<w:webSettings xmlns:mc="http://schemas.openxmlformats.org/markup-compatibility/2006" xmlns:r="http://schemas.openxmlformats.org/officeDocument/2006/relationships" xmlns:w="http://schemas.openxmlformats.org/wordprocessingml/2006/main" xmlns:w14="http://schemas.microsoft.com/office/word/2010/wordml" xmlns:w15="http://schemas.microsoft.com/office/word/2012/wordml" xmlns:w16cex="http://schemas.microsoft.com/office/word/2018/wordml/cex" xmlns:w16cid="http://schemas.microsoft.com/office/word/2016/wordml/cid" xmlns:w16="http://schemas.microsoft.com/office/word/2018/wordml" xmlns:w16du="http://schemas.microsoft.com/office/word/2023/wordml/word16du" xmlns:w16sdtdh="http://schemas.microsoft.com/office/word/2020/wordml/sdtdatahash" xmlns:w16se="http://schemas.microsoft.com/office/word/2015/wordml/symex" mc:Ignorable="w14 w15 w16se w16cid w16 w16cex w16sdtdh w16du">
+<w:webSettings xmlns:mc="http://schemas.openxmlformats.org/markup-compatibility/2006" xmlns:r="http://schemas.openxmlformats.org/officeDocument/2006/relationships" xmlns:w="http://schemas.openxmlformats.org/wordprocessingml/2006/main" xmlns:w14="http://schemas.microsoft.com/office/word/2010/wordml" xmlns:w15="http://schemas.microsoft.com/office/word/2012/wordml" xmlns:w16cex="http://schemas.microsoft.com/office/word/2018/wordml/cex" xmlns:w16cid="http://schemas.microsoft.com/office/word/2016/wordml/cid" xmlns:w16="http://schemas.microsoft.com/office/word/2018/wordml" xmlns:w16du="http://schemas.microsoft.com/office/word/2023/wordml/word16du" xmlns:w16sdtdh="http://schemas.microsoft.com/office/word/2020/wordml/sdtdatahash" xmlns:w16sdtfl="http://schemas.microsoft.com/office/word/2024/wordml/sdtformatlock" xmlns:w16se="http://schemas.microsoft.com/office/word/2015/wordml/symex" mc:Ignorable="w14 w15 w16se w16cid w16 w16cex w16sdtdh w16sdtfl w16du">
   <w:optimizeForBrowser/>
   <w:allowPNG/>
 </w:webSettings>

</xml_diff>